<commit_message>
feat: replace academy resume template mapping
</commit_message>
<xml_diff>
--- a/jobpilot-ai/backend/src/main/resources/resume-templates/academy.docx
+++ b/jobpilot-ai/backend/src/main/resources/resume-templates/academy.docx
@@ -35,6 +35,7 @@
           <w:szCs w:val="20"/>
         </w:rPr>
       </w:pPr>
+      <w:proofErr w:type="gramStart"/>
       <w:r>
         <w:rPr>
           <w:rFonts w:eastAsiaTheme="minorHAnsi" w:cs="굴림"/>
@@ -45,7 +46,20 @@
           <w:sz w:val="44"/>
           <w:szCs w:val="40"/>
         </w:rPr>
-        <w:t>이  력  서</w:t>
+        <w:t>이  력</w:t>
+      </w:r>
+      <w:proofErr w:type="gramEnd"/>
+      <w:r>
+        <w:rPr>
+          <w:rFonts w:eastAsiaTheme="minorHAnsi" w:cs="굴림"/>
+          <w:b/>
+          <w:bCs/>
+          <w:color w:val="000000"/>
+          <w:kern w:val="0"/>
+          <w:sz w:val="44"/>
+          <w:szCs w:val="40"/>
+        </w:rPr>
+        <w:t xml:space="preserve">  서</w:t>
       </w:r>
     </w:p>
     <w:tbl>
@@ -1123,40 +1137,6 @@
                 <w:szCs w:val="24"/>
               </w:rPr>
             </w:pPr>
-            <w:r>
-              <w:rPr>
-                <w:rFonts w:eastAsia="맑은 고딕" w:hint="eastAsia"/>
-                <w:sz w:val="22"/>
-              </w:rPr>
-              <w:t>00</w:t>
-            </w:r>
-            <w:r>
-              <w:rPr>
-                <w:rFonts w:eastAsiaTheme="minorHAnsi"/>
-                <w:kern w:val="0"/>
-                <w:sz w:val="22"/>
-                <w:szCs w:val="24"/>
-              </w:rPr>
-              <w:t xml:space="preserve">.00 ~ </w:t>
-            </w:r>
-            <w:r>
-              <w:rPr>
-                <w:rFonts w:eastAsiaTheme="minorHAnsi" w:hint="eastAsia"/>
-                <w:kern w:val="0"/>
-                <w:sz w:val="22"/>
-                <w:szCs w:val="24"/>
-              </w:rPr>
-              <w:t>0</w:t>
-            </w:r>
-            <w:r>
-              <w:rPr>
-                <w:rFonts w:eastAsiaTheme="minorHAnsi"/>
-                <w:kern w:val="0"/>
-                <w:sz w:val="22"/>
-                <w:szCs w:val="24"/>
-              </w:rPr>
-              <w:t>0.00</w:t>
-            </w:r>
           </w:p>
         </w:tc>
         <w:tc>
@@ -1179,21 +1159,6 @@
                 <w:sz w:val="22"/>
               </w:rPr>
             </w:pPr>
-            <w:r>
-              <w:rPr>
-                <w:rFonts w:eastAsia="맑은 고딕"/>
-                <w:sz w:val="22"/>
-              </w:rPr>
-              <w:t>00</w:t>
-            </w:r>
-            <w:r>
-              <w:rPr>
-                <w:rFonts w:eastAsiaTheme="minorHAnsi"/>
-                <w:kern w:val="0"/>
-                <w:sz w:val="22"/>
-              </w:rPr>
-              <w:t>대학교 (0년제)</w:t>
-            </w:r>
           </w:p>
         </w:tc>
         <w:tc>
@@ -1238,14 +1203,6 @@
                 <w:sz w:val="22"/>
               </w:rPr>
             </w:pPr>
-            <w:r>
-              <w:rPr>
-                <w:rFonts w:eastAsiaTheme="minorHAnsi"/>
-                <w:kern w:val="0"/>
-                <w:sz w:val="22"/>
-              </w:rPr>
-              <w:t>학사 졸업</w:t>
-            </w:r>
           </w:p>
         </w:tc>
       </w:tr>
@@ -1274,40 +1231,6 @@
                 <w:szCs w:val="24"/>
               </w:rPr>
             </w:pPr>
-            <w:r>
-              <w:rPr>
-                <w:rFonts w:eastAsia="맑은 고딕" w:hint="eastAsia"/>
-                <w:sz w:val="22"/>
-              </w:rPr>
-              <w:t>00</w:t>
-            </w:r>
-            <w:r>
-              <w:rPr>
-                <w:rFonts w:eastAsiaTheme="minorHAnsi"/>
-                <w:kern w:val="0"/>
-                <w:sz w:val="22"/>
-                <w:szCs w:val="24"/>
-              </w:rPr>
-              <w:t xml:space="preserve">.00 ~ </w:t>
-            </w:r>
-            <w:r>
-              <w:rPr>
-                <w:rFonts w:eastAsiaTheme="minorHAnsi" w:hint="eastAsia"/>
-                <w:kern w:val="0"/>
-                <w:sz w:val="22"/>
-                <w:szCs w:val="24"/>
-              </w:rPr>
-              <w:t>0</w:t>
-            </w:r>
-            <w:r>
-              <w:rPr>
-                <w:rFonts w:eastAsiaTheme="minorHAnsi"/>
-                <w:kern w:val="0"/>
-                <w:sz w:val="22"/>
-                <w:szCs w:val="24"/>
-              </w:rPr>
-              <w:t>0.00</w:t>
-            </w:r>
           </w:p>
         </w:tc>
         <w:tc>
@@ -1330,21 +1253,6 @@
                 <w:sz w:val="22"/>
               </w:rPr>
             </w:pPr>
-            <w:r>
-              <w:rPr>
-                <w:rFonts w:eastAsia="맑은 고딕"/>
-                <w:sz w:val="22"/>
-              </w:rPr>
-              <w:t>00</w:t>
-            </w:r>
-            <w:r>
-              <w:rPr>
-                <w:rFonts w:eastAsiaTheme="minorHAnsi"/>
-                <w:kern w:val="0"/>
-                <w:sz w:val="22"/>
-              </w:rPr>
-              <w:t>고등학교</w:t>
-            </w:r>
           </w:p>
         </w:tc>
         <w:tc>
@@ -1389,14 +1297,6 @@
                 <w:sz w:val="22"/>
               </w:rPr>
             </w:pPr>
-            <w:r>
-              <w:rPr>
-                <w:rFonts w:eastAsiaTheme="minorHAnsi"/>
-                <w:kern w:val="0"/>
-                <w:sz w:val="22"/>
-              </w:rPr>
-              <w:t>졸업</w:t>
-            </w:r>
           </w:p>
         </w:tc>
       </w:tr>
@@ -1605,93 +1505,9 @@
               <w:jc w:val="center"/>
               <w:rPr>
                 <w:rFonts w:asciiTheme="minorEastAsia" w:hAnsiTheme="minorEastAsia" w:cs="맑은 고딕"/>
-                <w:color w:val="000000"/>
-                <w:sz w:val="22"/>
-              </w:rPr>
-            </w:pPr>
-            <w:r>
-              <w:rPr>
-                <w:rFonts w:asciiTheme="minorEastAsia" w:hAnsiTheme="minorEastAsia" w:cs="맑은 고딕" w:hint="eastAsia"/>
-                <w:color w:val="000000"/>
-                <w:sz w:val="22"/>
-              </w:rPr>
-              <w:t>26</w:t>
-            </w:r>
-            <w:r>
-              <w:rPr>
-                <w:rFonts w:asciiTheme="minorEastAsia" w:hAnsiTheme="minorEastAsia" w:cs="맑은 고딕"/>
-                <w:color w:val="000000"/>
-                <w:sz w:val="22"/>
-              </w:rPr>
-              <w:t>.</w:t>
-            </w:r>
-            <w:r>
-              <w:rPr>
-                <w:rFonts w:asciiTheme="minorEastAsia" w:hAnsiTheme="minorEastAsia" w:cs="맑은 고딕" w:hint="eastAsia"/>
-                <w:color w:val="000000"/>
-                <w:sz w:val="22"/>
-              </w:rPr>
-              <w:t>02.26~</w:t>
-            </w:r>
-            <w:r>
-              <w:rPr>
-                <w:rFonts w:asciiTheme="minorEastAsia" w:hAnsiTheme="minorEastAsia" w:cs="맑은 고딕"/>
-                <w:color w:val="000000"/>
-                <w:sz w:val="22"/>
-              </w:rPr>
-              <w:t>2</w:t>
-            </w:r>
-            <w:r>
-              <w:rPr>
-                <w:rFonts w:asciiTheme="minorEastAsia" w:hAnsiTheme="minorEastAsia" w:cs="맑은 고딕" w:hint="eastAsia"/>
-                <w:color w:val="000000"/>
-                <w:sz w:val="22"/>
-              </w:rPr>
-              <w:t>6.</w:t>
-            </w:r>
-            <w:r>
-              <w:rPr>
-                <w:rFonts w:asciiTheme="minorEastAsia" w:hAnsiTheme="minorEastAsia" w:cs="맑은 고딕" w:hint="eastAsia"/>
-                <w:color w:val="000000"/>
-                <w:sz w:val="22"/>
-              </w:rPr>
-              <w:t>09.04</w:t>
-            </w:r>
-          </w:p>
-          <w:p>
-            <w:pPr>
-              <w:jc w:val="center"/>
-              <w:rPr>
-                <w:rFonts w:asciiTheme="minorEastAsia" w:hAnsiTheme="minorEastAsia" w:cs="맑은 고딕"/>
-                <w:color w:val="000000"/>
-                <w:sz w:val="22"/>
-              </w:rPr>
-            </w:pPr>
-            <w:r>
-              <w:rPr>
-                <w:rFonts w:asciiTheme="minorEastAsia" w:hAnsiTheme="minorEastAsia" w:cs="맑은 고딕"/>
-                <w:color w:val="000000"/>
-                <w:sz w:val="22"/>
-              </w:rPr>
-              <w:t>(7개월 종일</w:t>
-            </w:r>
-          </w:p>
-          <w:p>
-            <w:pPr>
-              <w:jc w:val="center"/>
-              <w:rPr>
-                <w:rFonts w:asciiTheme="minorEastAsia" w:hAnsiTheme="minorEastAsia" w:cs="맑은 고딕"/>
-                <w:sz w:val="22"/>
-              </w:rPr>
-            </w:pPr>
-            <w:r>
-              <w:rPr>
-                <w:rFonts w:asciiTheme="minorEastAsia" w:hAnsiTheme="minorEastAsia" w:cs="맑은 고딕"/>
-                <w:color w:val="000000"/>
-                <w:sz w:val="22"/>
-              </w:rPr>
-              <w:t>오프라인교육)</w:t>
-            </w:r>
+                <w:sz w:val="22"/>
+              </w:rPr>
+            </w:pPr>
           </w:p>
         </w:tc>
         <w:tc>
@@ -1706,47 +1522,13 @@
           </w:tcPr>
           <w:p>
             <w:pPr>
-              <w:ind w:firstLineChars="500" w:firstLine="1100"/>
+              <w:jc w:val="center"/>
               <w:rPr>
                 <w:rFonts w:asciiTheme="minorEastAsia" w:hAnsiTheme="minorEastAsia" w:cs="맑은 고딕"/>
                 <w:color w:val="000000"/>
                 <w:sz w:val="22"/>
               </w:rPr>
             </w:pPr>
-            <w:r>
-              <w:rPr>
-                <w:rFonts w:asciiTheme="minorEastAsia" w:hAnsiTheme="minorEastAsia" w:cs="맑은 고딕" w:hint="eastAsia"/>
-                <w:color w:val="000000"/>
-                <w:sz w:val="22"/>
-              </w:rPr>
-              <w:t>클라우드</w:t>
-            </w:r>
-            <w:r>
-              <w:rPr>
-                <w:rFonts w:asciiTheme="minorEastAsia" w:hAnsiTheme="minorEastAsia" w:cs="맑은 고딕" w:hint="eastAsia"/>
-                <w:color w:val="000000"/>
-                <w:sz w:val="22"/>
-              </w:rPr>
-              <w:t>환경 AI웹개발자 양성</w:t>
-            </w:r>
-          </w:p>
-          <w:p>
-            <w:pPr>
-              <w:jc w:val="center"/>
-              <w:rPr>
-                <w:rFonts w:asciiTheme="minorEastAsia" w:hAnsiTheme="minorEastAsia" w:cs="맑은 고딕"/>
-                <w:color w:val="000000"/>
-                <w:sz w:val="22"/>
-              </w:rPr>
-            </w:pPr>
-            <w:r>
-              <w:rPr>
-                <w:rFonts w:asciiTheme="minorEastAsia" w:hAnsiTheme="minorEastAsia" w:cs="맑은 고딕"/>
-                <w:color w:val="000000"/>
-                <w:sz w:val="22"/>
-              </w:rPr>
-              <w:t>(7개월/월~금/오전9시20분~오후6시20분)</w:t>
-            </w:r>
           </w:p>
         </w:tc>
         <w:tc>
@@ -1767,14 +1549,6 @@
                 <w:sz w:val="22"/>
               </w:rPr>
             </w:pPr>
-            <w:r>
-              <w:rPr>
-                <w:rFonts w:asciiTheme="minorEastAsia" w:hAnsiTheme="minorEastAsia" w:cs="맑은 고딕"/>
-                <w:color w:val="000000"/>
-                <w:sz w:val="22"/>
-              </w:rPr>
-              <w:t>한국ICT인재개발원</w:t>
-            </w:r>
           </w:p>
         </w:tc>
         <w:tc>
@@ -1796,14 +1570,6 @@
                 <w:sz w:val="22"/>
               </w:rPr>
             </w:pPr>
-            <w:r>
-              <w:rPr>
-                <w:rFonts w:ascii="맑은 고딕" w:eastAsia="맑은 고딕" w:hAnsi="맑은 고딕" w:cs="맑은 고딕"/>
-                <w:color w:val="000000"/>
-                <w:sz w:val="22"/>
-              </w:rPr>
-              <w:t>수료</w:t>
-            </w:r>
           </w:p>
         </w:tc>
       </w:tr>
@@ -1844,21 +1610,12 @@
           </w:tcPr>
           <w:p>
             <w:pPr>
-              <w:jc w:val="center"/>
-              <w:rPr>
-                <w:rFonts w:asciiTheme="minorEastAsia" w:hAnsiTheme="minorEastAsia" w:cs="맑은 고딕"/>
-                <w:color w:val="000000"/>
-                <w:sz w:val="22"/>
-              </w:rPr>
-            </w:pPr>
-            <w:r>
-              <w:rPr>
-                <w:rFonts w:asciiTheme="minorEastAsia" w:hAnsiTheme="minorEastAsia" w:cs="맑은 고딕"/>
-                <w:color w:val="000000"/>
-                <w:sz w:val="22"/>
-              </w:rPr>
-              <w:t>특모범상 (출석률100%)</w:t>
-            </w:r>
+              <w:rPr>
+                <w:rFonts w:asciiTheme="minorEastAsia" w:hAnsiTheme="minorEastAsia" w:cs="맑은 고딕" w:hint="eastAsia"/>
+                <w:color w:val="000000"/>
+                <w:sz w:val="22"/>
+              </w:rPr>
+            </w:pPr>
           </w:p>
         </w:tc>
         <w:tc>
@@ -1880,14 +1637,6 @@
                 <w:sz w:val="22"/>
               </w:rPr>
             </w:pPr>
-            <w:r>
-              <w:rPr>
-                <w:rFonts w:asciiTheme="minorEastAsia" w:hAnsiTheme="minorEastAsia" w:cs="맑은 고딕"/>
-                <w:color w:val="000000"/>
-                <w:sz w:val="22"/>
-              </w:rPr>
-              <w:t>한국ICT인재개발원</w:t>
-            </w:r>
           </w:p>
         </w:tc>
         <w:tc>
@@ -2152,155 +1901,13 @@
           <w:p>
             <w:pPr>
               <w:pStyle w:val="a4"/>
-              <w:jc w:val="center"/>
-              <w:rPr>
-                <w:rFonts w:eastAsiaTheme="minorHAnsi"/>
-                <w:color w:val="000000"/>
-                <w:kern w:val="0"/>
-                <w:sz w:val="22"/>
-              </w:rPr>
-            </w:pPr>
-            <w:r>
-              <w:rPr>
-                <w:rFonts w:eastAsiaTheme="minorHAnsi"/>
-                <w:color w:val="000000"/>
-                <w:kern w:val="0"/>
-                <w:sz w:val="22"/>
-              </w:rPr>
-              <w:t>2</w:t>
-            </w:r>
-            <w:r>
               <w:rPr>
                 <w:rFonts w:eastAsiaTheme="minorHAnsi" w:hint="eastAsia"/>
                 <w:color w:val="000000"/>
                 <w:kern w:val="0"/>
                 <w:sz w:val="22"/>
               </w:rPr>
-              <w:t>6</w:t>
-            </w:r>
-            <w:r>
-              <w:rPr>
-                <w:rFonts w:eastAsiaTheme="minorHAnsi"/>
-                <w:color w:val="000000"/>
-                <w:kern w:val="0"/>
-                <w:sz w:val="22"/>
-              </w:rPr>
-              <w:t>.</w:t>
-            </w:r>
-            <w:r>
-              <w:rPr>
-                <w:rFonts w:eastAsiaTheme="minorHAnsi" w:hint="eastAsia"/>
-                <w:color w:val="000000"/>
-                <w:kern w:val="0"/>
-                <w:sz w:val="22"/>
-              </w:rPr>
-              <w:t>0</w:t>
-            </w:r>
-            <w:r>
-              <w:rPr>
-                <w:rFonts w:eastAsiaTheme="minorHAnsi" w:hint="eastAsia"/>
-                <w:color w:val="000000"/>
-                <w:kern w:val="0"/>
-                <w:sz w:val="22"/>
-              </w:rPr>
-              <w:t>5</w:t>
-            </w:r>
-            <w:r>
-              <w:rPr>
-                <w:rFonts w:eastAsiaTheme="minorHAnsi" w:hint="eastAsia"/>
-                <w:color w:val="000000"/>
-                <w:kern w:val="0"/>
-                <w:sz w:val="22"/>
-              </w:rPr>
-              <w:t>.0</w:t>
-            </w:r>
-            <w:r>
-              <w:rPr>
-                <w:rFonts w:eastAsiaTheme="minorHAnsi" w:hint="eastAsia"/>
-                <w:color w:val="000000"/>
-                <w:kern w:val="0"/>
-                <w:sz w:val="22"/>
-              </w:rPr>
-              <w:t>1</w:t>
-            </w:r>
-          </w:p>
-          <w:p>
-            <w:pPr>
-              <w:pStyle w:val="a4"/>
-              <w:jc w:val="center"/>
-              <w:rPr>
-                <w:rFonts w:eastAsiaTheme="minorHAnsi"/>
-                <w:color w:val="000000"/>
-                <w:kern w:val="0"/>
-                <w:sz w:val="22"/>
-              </w:rPr>
-            </w:pPr>
-            <w:r>
-              <w:rPr>
-                <w:rFonts w:eastAsiaTheme="minorHAnsi"/>
-                <w:color w:val="000000"/>
-                <w:kern w:val="0"/>
-                <w:sz w:val="22"/>
-              </w:rPr>
-              <w:t>~</w:t>
-            </w:r>
-          </w:p>
-          <w:p>
-            <w:pPr>
-              <w:pStyle w:val="a4"/>
-              <w:jc w:val="center"/>
-              <w:rPr>
-                <w:rFonts w:eastAsiaTheme="minorHAnsi"/>
-                <w:color w:val="000000"/>
-                <w:kern w:val="0"/>
-                <w:sz w:val="22"/>
-              </w:rPr>
-            </w:pPr>
-            <w:r>
-              <w:rPr>
-                <w:rFonts w:eastAsiaTheme="minorHAnsi"/>
-                <w:color w:val="000000"/>
-                <w:kern w:val="0"/>
-                <w:sz w:val="22"/>
-              </w:rPr>
-              <w:t>2</w:t>
-            </w:r>
-            <w:r>
-              <w:rPr>
-                <w:rFonts w:eastAsiaTheme="minorHAnsi" w:hint="eastAsia"/>
-                <w:color w:val="000000"/>
-                <w:kern w:val="0"/>
-                <w:sz w:val="22"/>
-              </w:rPr>
-              <w:t>6</w:t>
-            </w:r>
-            <w:r>
-              <w:rPr>
-                <w:rFonts w:eastAsiaTheme="minorHAnsi"/>
-                <w:color w:val="000000"/>
-                <w:kern w:val="0"/>
-                <w:sz w:val="22"/>
-              </w:rPr>
-              <w:t>.</w:t>
-            </w:r>
-            <w:r>
-              <w:rPr>
-                <w:rFonts w:eastAsiaTheme="minorHAnsi" w:hint="eastAsia"/>
-                <w:color w:val="000000"/>
-                <w:kern w:val="0"/>
-                <w:sz w:val="22"/>
-              </w:rPr>
-              <w:t>0</w:t>
-            </w:r>
-            <w:r>
-              <w:rPr>
-                <w:rFonts w:eastAsiaTheme="minorHAnsi" w:hint="eastAsia"/>
-                <w:color w:val="000000"/>
-                <w:kern w:val="0"/>
-                <w:sz w:val="22"/>
-              </w:rPr>
-              <w:t>6.05</w:t>
-            </w:r>
+            </w:pPr>
           </w:p>
         </w:tc>
         <w:tc>
@@ -2330,15 +1937,6 @@
                 <w:sz w:val="22"/>
               </w:rPr>
             </w:pPr>
-            <w:r>
-              <w:rPr>
-                <w:rFonts w:eastAsiaTheme="minorHAnsi"/>
-                <w:color w:val="000000"/>
-                <w:kern w:val="0"/>
-                <w:sz w:val="22"/>
-              </w:rPr>
-              <w:t>NICE Group Ware</w:t>
-            </w:r>
           </w:p>
           <w:p>
             <w:pPr>
@@ -2351,15 +1949,6 @@
                 <w:sz w:val="22"/>
               </w:rPr>
             </w:pPr>
-            <w:r>
-              <w:rPr>
-                <w:rFonts w:eastAsiaTheme="minorHAnsi"/>
-                <w:color w:val="000000"/>
-                <w:kern w:val="0"/>
-                <w:sz w:val="22"/>
-              </w:rPr>
-              <w:t>(그룹웨어)</w:t>
-            </w:r>
           </w:p>
         </w:tc>
         <w:tc>
@@ -2390,16 +1979,6 @@
                 <w:sz w:val="22"/>
               </w:rPr>
             </w:pPr>
-            <w:r>
-              <w:rPr>
-                <w:rFonts w:eastAsiaTheme="minorHAnsi"/>
-                <w:bCs/>
-                <w:color w:val="000000"/>
-                <w:kern w:val="0"/>
-                <w:sz w:val="22"/>
-              </w:rPr>
-              <w:t>분석 / 개발</w:t>
-            </w:r>
           </w:p>
         </w:tc>
         <w:tc>
@@ -2422,34 +2001,6 @@
                 <w:shd w:val="clear" w:color="auto" w:fill="FFFFFF"/>
               </w:rPr>
             </w:pPr>
-            <w:r>
-              <w:rPr>
-                <w:sz w:val="22"/>
-              </w:rPr>
-              <w:t xml:space="preserve">AVA, Python, SpringBoot, React, MyBatis, MariaDB, Flask, Streamlit, JWT, J, JQuery (Ajax), DBeaver, Pycharm, Visual Studio Code, FullCalendar, BeautifulSoup,  AWS(EC2, RDS), Linux(Rocky), ELK, </w:t>
-            </w:r>
-            <w:r>
-              <w:rPr>
-                <w:color w:val="000000"/>
-                <w:sz w:val="22"/>
-                <w:highlight w:val="white"/>
-              </w:rPr>
-              <w:t>Git</w:t>
-            </w:r>
-            <w:r>
-              <w:rPr>
-                <w:sz w:val="22"/>
-                <w:highlight w:val="white"/>
-              </w:rPr>
-              <w:t xml:space="preserve">Hub </w:t>
-            </w:r>
-            <w:r>
-              <w:rPr>
-                <w:color w:val="000000"/>
-                <w:sz w:val="22"/>
-              </w:rPr>
-              <w:t>외</w:t>
-            </w:r>
           </w:p>
         </w:tc>
       </w:tr>
@@ -2626,26 +2177,6 @@
                 <w:sz w:val="22"/>
               </w:rPr>
             </w:pPr>
-            <w:r>
-              <w:rPr>
-                <w:rFonts w:eastAsiaTheme="minorHAnsi" w:hint="eastAsia"/>
-                <w:bCs/>
-                <w:color w:val="000000"/>
-                <w:kern w:val="0"/>
-                <w:sz w:val="22"/>
-              </w:rPr>
-              <w:t xml:space="preserve">전사적 지원 </w:t>
-            </w:r>
-            <w:r>
-              <w:rPr>
-                <w:rFonts w:eastAsiaTheme="minorHAnsi"/>
-                <w:bCs/>
-                <w:color w:val="000000"/>
-                <w:kern w:val="0"/>
-                <w:sz w:val="22"/>
-              </w:rPr>
-              <w:t>그룹웨어 프로그램</w:t>
-            </w:r>
           </w:p>
         </w:tc>
       </w:tr>
@@ -2820,58 +2351,6 @@
                 <w:sz w:val="22"/>
               </w:rPr>
             </w:pPr>
-            <w:r>
-              <w:rPr>
-                <w:rFonts w:eastAsiaTheme="minorHAnsi"/>
-                <w:color w:val="000000"/>
-                <w:kern w:val="0"/>
-                <w:sz w:val="22"/>
-              </w:rPr>
-              <w:lastRenderedPageBreak/>
-              <w:t>00.00.00</w:t>
-            </w:r>
-          </w:p>
-          <w:p>
-            <w:pPr>
-              <w:pStyle w:val="a4"/>
-              <w:jc w:val="center"/>
-              <w:rPr>
-                <w:rFonts w:eastAsiaTheme="minorHAnsi"/>
-                <w:color w:val="000000"/>
-                <w:kern w:val="0"/>
-                <w:sz w:val="22"/>
-              </w:rPr>
-            </w:pPr>
-            <w:r>
-              <w:rPr>
-                <w:rFonts w:eastAsiaTheme="minorHAnsi"/>
-                <w:color w:val="000000"/>
-                <w:kern w:val="0"/>
-                <w:sz w:val="22"/>
-              </w:rPr>
-              <w:t>~</w:t>
-            </w:r>
-          </w:p>
-          <w:p>
-            <w:pPr>
-              <w:pStyle w:val="a4"/>
-              <w:jc w:val="center"/>
-              <w:rPr>
-                <w:rFonts w:eastAsiaTheme="minorHAnsi"/>
-                <w:color w:val="000000"/>
-                <w:kern w:val="0"/>
-                <w:sz w:val="22"/>
-              </w:rPr>
-            </w:pPr>
-            <w:r>
-              <w:rPr>
-                <w:rFonts w:eastAsiaTheme="minorHAnsi"/>
-                <w:color w:val="000000"/>
-                <w:kern w:val="0"/>
-                <w:sz w:val="22"/>
-              </w:rPr>
-              <w:t>00.00.00</w:t>
-            </w:r>
           </w:p>
         </w:tc>
         <w:tc>
@@ -2901,36 +2380,6 @@
                 <w:sz w:val="22"/>
               </w:rPr>
             </w:pPr>
-            <w:r>
-              <w:rPr>
-                <w:rFonts w:eastAsiaTheme="minorHAnsi"/>
-                <w:color w:val="000000"/>
-                <w:kern w:val="0"/>
-                <w:sz w:val="22"/>
-              </w:rPr>
-              <w:t xml:space="preserve"> YSE SHOP</w:t>
-            </w:r>
-          </w:p>
-          <w:p>
-            <w:pPr>
-              <w:pStyle w:val="a4"/>
-              <w:jc w:val="center"/>
-              <w:rPr>
-                <w:rFonts w:eastAsiaTheme="minorHAnsi"/>
-                <w:color w:val="000000"/>
-                <w:kern w:val="0"/>
-                <w:sz w:val="22"/>
-              </w:rPr>
-            </w:pPr>
-            <w:r>
-              <w:rPr>
-                <w:rFonts w:eastAsiaTheme="minorHAnsi"/>
-                <w:color w:val="000000"/>
-                <w:kern w:val="0"/>
-                <w:sz w:val="22"/>
-              </w:rPr>
-              <w:t>(중고거래 쇼핑몰)</w:t>
-            </w:r>
           </w:p>
         </w:tc>
         <w:tc>
@@ -2961,16 +2410,6 @@
                 <w:sz w:val="22"/>
               </w:rPr>
             </w:pPr>
-            <w:r>
-              <w:rPr>
-                <w:rFonts w:eastAsiaTheme="minorHAnsi"/>
-                <w:bCs/>
-                <w:color w:val="000000"/>
-                <w:kern w:val="0"/>
-                <w:sz w:val="22"/>
-              </w:rPr>
-              <w:t>분석 / 개발</w:t>
-            </w:r>
           </w:p>
         </w:tc>
         <w:tc>
@@ -2990,12 +2429,6 @@
                 <w:sz w:val="22"/>
               </w:rPr>
             </w:pPr>
-            <w:r>
-              <w:rPr>
-                <w:sz w:val="22"/>
-              </w:rPr>
-              <w:t xml:space="preserve">JAVA, JSP, HTML5, CSS3, Javascript, </w:t>
-            </w:r>
           </w:p>
           <w:p>
             <w:pPr>
@@ -3009,12 +2442,6 @@
                 <w:sz w:val="22"/>
               </w:rPr>
             </w:pPr>
-            <w:r>
-              <w:rPr>
-                <w:sz w:val="22"/>
-              </w:rPr>
-              <w:t>Spring, ORACLE, SQL developer, MyBatis, JQuery (Ajax), Python, GitHub 외</w:t>
-            </w:r>
           </w:p>
         </w:tc>
       </w:tr>
@@ -3403,13 +2830,6 @@
                 <w:sz w:val="22"/>
               </w:rPr>
             </w:pPr>
-            <w:r>
-              <w:rPr>
-                <w:color w:val="000000"/>
-                <w:sz w:val="22"/>
-              </w:rPr>
-              <w:t>백엔드 언어 : Java, Python</w:t>
-            </w:r>
           </w:p>
           <w:p>
             <w:pPr>
@@ -3421,13 +2841,6 @@
                 <w:sz w:val="22"/>
               </w:rPr>
             </w:pPr>
-            <w:r>
-              <w:rPr>
-                <w:color w:val="000000"/>
-                <w:sz w:val="22"/>
-              </w:rPr>
-              <w:t>플랫폼 : Servlet, Maven, JSP</w:t>
-            </w:r>
           </w:p>
         </w:tc>
         <w:tc>
@@ -3483,19 +2896,6 @@
                 <w:sz w:val="22"/>
               </w:rPr>
             </w:pPr>
-            <w:r>
-              <w:rPr>
-                <w:color w:val="000000"/>
-                <w:sz w:val="22"/>
-              </w:rPr>
-              <w:t>Windows 10/11/Linux(Ubunt</w:t>
-            </w:r>
-            <w:r>
-              <w:rPr>
-                <w:sz w:val="22"/>
-              </w:rPr>
-              <w:t>u)</w:t>
-            </w:r>
           </w:p>
         </w:tc>
       </w:tr>
@@ -3539,29 +2939,6 @@
                 <w:sz w:val="22"/>
               </w:rPr>
             </w:pPr>
-            <w:r>
-              <w:rPr>
-                <w:color w:val="000000"/>
-                <w:sz w:val="22"/>
-              </w:rPr>
-              <w:t>프론트엔드 언어 : HTML5, CSS, JavaScript, React, Thymeleaf</w:t>
-            </w:r>
-          </w:p>
-          <w:p>
-            <w:pPr>
-              <w:jc w:val="center"/>
-              <w:rPr>
-                <w:color w:val="000000"/>
-                <w:sz w:val="22"/>
-              </w:rPr>
-            </w:pPr>
-            <w:r>
-              <w:rPr>
-                <w:color w:val="000000"/>
-                <w:sz w:val="22"/>
-              </w:rPr>
-              <w:t>플랫폼 : DOM, Ajax, NodeJS(npm)</w:t>
-            </w:r>
           </w:p>
         </w:tc>
         <w:tc>
@@ -3616,77 +2993,6 @@
                 <w:sz w:val="22"/>
               </w:rPr>
             </w:pPr>
-            <w:r>
-              <w:rPr>
-                <w:color w:val="000000"/>
-                <w:sz w:val="22"/>
-              </w:rPr>
-              <w:t>Spring5(DI/MVC/Security</w:t>
-            </w:r>
-          </w:p>
-          <w:p>
-            <w:pPr>
-              <w:jc w:val="center"/>
-              <w:rPr>
-                <w:color w:val="000000"/>
-                <w:sz w:val="22"/>
-              </w:rPr>
-            </w:pPr>
-            <w:r>
-              <w:rPr>
-                <w:color w:val="000000"/>
-                <w:sz w:val="22"/>
-              </w:rPr>
-              <w:t>/Transaction/WebSocket/</w:t>
-            </w:r>
-          </w:p>
-          <w:p>
-            <w:pPr>
-              <w:jc w:val="center"/>
-              <w:rPr>
-                <w:color w:val="000000"/>
-                <w:sz w:val="22"/>
-              </w:rPr>
-            </w:pPr>
-            <w:r>
-              <w:rPr>
-                <w:color w:val="000000"/>
-                <w:sz w:val="22"/>
-              </w:rPr>
-              <w:t>Spring Rest API),</w:t>
-            </w:r>
-          </w:p>
-          <w:p>
-            <w:pPr>
-              <w:jc w:val="center"/>
-              <w:rPr>
-                <w:color w:val="000000"/>
-                <w:sz w:val="22"/>
-              </w:rPr>
-            </w:pPr>
-            <w:r>
-              <w:rPr>
-                <w:color w:val="000000"/>
-                <w:sz w:val="22"/>
-              </w:rPr>
-              <w:t>MyBatis, Lombok, JPA/Hibernate,</w:t>
-            </w:r>
-          </w:p>
-          <w:p>
-            <w:pPr>
-              <w:jc w:val="center"/>
-              <w:rPr>
-                <w:color w:val="000000"/>
-                <w:sz w:val="22"/>
-              </w:rPr>
-            </w:pPr>
-            <w:r>
-              <w:rPr>
-                <w:color w:val="000000"/>
-                <w:sz w:val="22"/>
-              </w:rPr>
-              <w:t>Spring Boot2, Bootstrap, RSuite</w:t>
-            </w:r>
           </w:p>
         </w:tc>
       </w:tr>
@@ -3784,13 +3090,6 @@
                 <w:sz w:val="22"/>
               </w:rPr>
             </w:pPr>
-            <w:r>
-              <w:rPr>
-                <w:color w:val="000000"/>
-                <w:sz w:val="22"/>
-              </w:rPr>
-              <w:t>Apache Tomcat</w:t>
-            </w:r>
           </w:p>
         </w:tc>
       </w:tr>
@@ -3889,12 +3188,6 @@
                 <w:sz w:val="22"/>
               </w:rPr>
             </w:pPr>
-            <w:r>
-              <w:rPr>
-                <w:sz w:val="22"/>
-              </w:rPr>
-              <w:t>AWS(EC2, RDS), OCI</w:t>
-            </w:r>
           </w:p>
         </w:tc>
       </w:tr>
@@ -3949,13 +3242,6 @@
                 <w:sz w:val="22"/>
               </w:rPr>
             </w:pPr>
-            <w:r>
-              <w:rPr>
-                <w:color w:val="000000"/>
-                <w:sz w:val="22"/>
-              </w:rPr>
-              <w:t xml:space="preserve"> Figma, StarUML, Miro</w:t>
-            </w:r>
           </w:p>
         </w:tc>
         <w:tc>
@@ -4011,25 +3297,6 @@
                 <w:sz w:val="22"/>
               </w:rPr>
             </w:pPr>
-            <w:r>
-              <w:rPr>
-                <w:sz w:val="22"/>
-              </w:rPr>
-              <w:t xml:space="preserve">Oracle 11g, </w:t>
-            </w:r>
-            <w:r>
-              <w:rPr>
-                <w:color w:val="000000"/>
-                <w:sz w:val="22"/>
-              </w:rPr>
-              <w:t xml:space="preserve">MySQL(MariaDB), </w:t>
-            </w:r>
-            <w:r>
-              <w:rPr>
-                <w:sz w:val="22"/>
-              </w:rPr>
-              <w:t>PostgreSQL</w:t>
-            </w:r>
           </w:p>
         </w:tc>
       </w:tr>
@@ -4118,74 +3385,6 @@
                 <w:sz w:val="22"/>
               </w:rPr>
             </w:pPr>
-            <w:r>
-              <w:rPr>
-                <w:color w:val="000000"/>
-                <w:sz w:val="22"/>
-              </w:rPr>
-              <w:t xml:space="preserve">Eclipse, Visual Studio Code, </w:t>
-            </w:r>
-            <w:r>
-              <w:rPr>
-                <w:sz w:val="22"/>
-              </w:rPr>
-              <w:t xml:space="preserve">IntelliJ, Spring Tools Suite 4, </w:t>
-            </w:r>
-            <w:r>
-              <w:rPr>
-                <w:color w:val="000000"/>
-                <w:sz w:val="22"/>
-              </w:rPr>
-              <w:t>Pycharm, Google C</w:t>
-            </w:r>
-            <w:r>
-              <w:rPr>
-                <w:sz w:val="22"/>
-              </w:rPr>
-              <w:t xml:space="preserve">olab, Jupyter Notebook, Anaconda, SQL Developer, </w:t>
-            </w:r>
-          </w:p>
-          <w:p>
-            <w:pPr>
-              <w:jc w:val="center"/>
-              <w:rPr>
-                <w:color w:val="000000"/>
-                <w:sz w:val="22"/>
-              </w:rPr>
-            </w:pPr>
-            <w:r>
-              <w:rPr>
-                <w:color w:val="000000"/>
-                <w:sz w:val="22"/>
-              </w:rPr>
-              <w:t>SQL Developer, DB</w:t>
-            </w:r>
-            <w:r>
-              <w:rPr>
-                <w:sz w:val="22"/>
-              </w:rPr>
-              <w:t>eaver</w:t>
-            </w:r>
-            <w:r>
-              <w:rPr>
-                <w:color w:val="000000"/>
-                <w:sz w:val="22"/>
-              </w:rPr>
-              <w:t xml:space="preserve">, Postman, </w:t>
-            </w:r>
-            <w:r>
-              <w:rPr>
-                <w:sz w:val="22"/>
-              </w:rPr>
-              <w:t xml:space="preserve">Figma, StartUML, Vertual Box, MobaXterm, </w:t>
-            </w:r>
-            <w:r>
-              <w:rPr>
-                <w:color w:val="000000"/>
-                <w:sz w:val="22"/>
-              </w:rPr>
-              <w:t>PuTTY</w:t>
-            </w:r>
           </w:p>
         </w:tc>
       </w:tr>
@@ -4240,32 +3439,6 @@
                 <w:sz w:val="22"/>
               </w:rPr>
             </w:pPr>
-            <w:r>
-              <w:rPr>
-                <w:color w:val="000000"/>
-                <w:sz w:val="22"/>
-              </w:rPr>
-              <w:t xml:space="preserve">Git / Github / </w:t>
-            </w:r>
-            <w:r>
-              <w:rPr>
-                <w:sz w:val="22"/>
-              </w:rPr>
-              <w:t>G</w:t>
-            </w:r>
-            <w:r>
-              <w:rPr>
-                <w:color w:val="000000"/>
-                <w:sz w:val="22"/>
-              </w:rPr>
-              <w:t xml:space="preserve">it </w:t>
-            </w:r>
-            <w:r>
-              <w:rPr>
-                <w:sz w:val="22"/>
-              </w:rPr>
-              <w:t>Kraken</w:t>
-            </w:r>
           </w:p>
         </w:tc>
       </w:tr>
@@ -4314,50 +3487,12 @@
           </w:tcPr>
           <w:p>
             <w:pPr>
-              <w:jc w:val="center"/>
-              <w:rPr>
-                <w:sz w:val="22"/>
-              </w:rPr>
-            </w:pPr>
-            <w:r>
-              <w:rPr>
-                <w:sz w:val="22"/>
-              </w:rPr>
-              <w:t>JPA(Java Persistence API) / Rest API / BeautifulSoup API / Jsoup API /</w:t>
-            </w:r>
-            <w:r>
-              <w:rPr>
-                <w:sz w:val="22"/>
-              </w:rPr>
-              <w:br/>
-              <w:t>JWT(Json Web Token) / 챗봇 / 오픈 API 및 라이브러리 (kakao 주소 검색) /</w:t>
-            </w:r>
-          </w:p>
-          <w:p>
-            <w:pPr>
               <w:pStyle w:val="a4"/>
               <w:jc w:val="center"/>
               <w:rPr>
                 <w:sz w:val="22"/>
               </w:rPr>
             </w:pPr>
-            <w:r>
-              <w:rPr>
-                <w:color w:val="000000"/>
-                <w:sz w:val="22"/>
-              </w:rPr>
-              <w:t>다음 우편번호 API / AWS(</w:t>
-            </w:r>
-            <w:r>
-              <w:rPr>
-                <w:rStyle w:val="ac"/>
-                <w:i w:val="0"/>
-                <w:iCs w:val="0"/>
-                <w:color w:val="000000"/>
-                <w:sz w:val="22"/>
-              </w:rPr>
-              <w:t>Amazon Web Services)</w:t>
-            </w:r>
           </w:p>
         </w:tc>
       </w:tr>
@@ -4589,14 +3724,6 @@
                 <w:sz w:val="22"/>
               </w:rPr>
             </w:pPr>
-            <w:r>
-              <w:rPr>
-                <w:rFonts w:eastAsiaTheme="minorHAnsi"/>
-                <w:kern w:val="0"/>
-                <w:sz w:val="22"/>
-              </w:rPr>
-              <w:t>20.03 ~ 21.11</w:t>
-            </w:r>
           </w:p>
         </w:tc>
         <w:tc>
@@ -4619,14 +3746,6 @@
                 <w:sz w:val="22"/>
               </w:rPr>
             </w:pPr>
-            <w:r>
-              <w:rPr>
-                <w:rFonts w:eastAsiaTheme="minorHAnsi"/>
-                <w:kern w:val="0"/>
-                <w:sz w:val="22"/>
-              </w:rPr>
-              <w:t>㈜0000</w:t>
-            </w:r>
           </w:p>
         </w:tc>
         <w:tc>
@@ -4649,14 +3768,6 @@
                 <w:sz w:val="22"/>
               </w:rPr>
             </w:pPr>
-            <w:r>
-              <w:rPr>
-                <w:rFonts w:eastAsiaTheme="minorHAnsi"/>
-                <w:kern w:val="0"/>
-                <w:sz w:val="22"/>
-              </w:rPr>
-              <w:t>총무 및 일반사무, 상품기획 외</w:t>
-            </w:r>
           </w:p>
         </w:tc>
         <w:tc>
@@ -4679,14 +3790,6 @@
                 <w:sz w:val="22"/>
               </w:rPr>
             </w:pPr>
-            <w:r>
-              <w:rPr>
-                <w:rFonts w:eastAsiaTheme="minorHAnsi"/>
-                <w:kern w:val="0"/>
-                <w:sz w:val="22"/>
-              </w:rPr>
-              <w:t>정직원</w:t>
-            </w:r>
           </w:p>
         </w:tc>
       </w:tr>
@@ -4722,14 +3825,6 @@
                 <w:sz w:val="22"/>
               </w:rPr>
             </w:pPr>
-            <w:r>
-              <w:rPr>
-                <w:rFonts w:eastAsiaTheme="minorHAnsi"/>
-                <w:kern w:val="0"/>
-                <w:sz w:val="22"/>
-              </w:rPr>
-              <w:t>㈜0000</w:t>
-            </w:r>
           </w:p>
         </w:tc>
         <w:tc>
@@ -4748,35 +3843,6 @@
                 <w:sz w:val="22"/>
               </w:rPr>
             </w:pPr>
-            <w:r>
-              <w:rPr>
-                <w:rFonts w:eastAsiaTheme="minorHAnsi"/>
-                <w:kern w:val="0"/>
-                <w:sz w:val="22"/>
-              </w:rPr>
-              <w:t xml:space="preserve"> - 물품관리, 재고관리,   </w:t>
-            </w:r>
-          </w:p>
-          <w:p>
-            <w:pPr>
-              <w:tabs>
-                <w:tab w:val="left" w:pos="2441"/>
-              </w:tabs>
-              <w:jc w:val="left"/>
-              <w:rPr>
-                <w:rFonts w:eastAsiaTheme="minorHAnsi"/>
-                <w:kern w:val="0"/>
-                <w:sz w:val="22"/>
-              </w:rPr>
-            </w:pPr>
-            <w:r>
-              <w:rPr>
-                <w:rFonts w:eastAsiaTheme="minorHAnsi"/>
-                <w:kern w:val="0"/>
-                <w:sz w:val="22"/>
-              </w:rPr>
-              <w:t xml:space="preserve"> - 전화문의접수, 고객게시판 관리 외</w:t>
-            </w:r>
           </w:p>
         </w:tc>
         <w:tc>
@@ -4792,14 +3858,6 @@
                 <w:sz w:val="22"/>
               </w:rPr>
             </w:pPr>
-            <w:r>
-              <w:rPr>
-                <w:rFonts w:eastAsiaTheme="minorHAnsi"/>
-                <w:kern w:val="0"/>
-                <w:sz w:val="22"/>
-              </w:rPr>
-              <w:t>계약직</w:t>
-            </w:r>
           </w:p>
         </w:tc>
       </w:tr>
@@ -4849,14 +3907,6 @@
                 <w:sz w:val="22"/>
               </w:rPr>
             </w:pPr>
-            <w:r>
-              <w:rPr>
-                <w:rFonts w:eastAsiaTheme="minorHAnsi"/>
-                <w:kern w:val="0"/>
-                <w:sz w:val="22"/>
-              </w:rPr>
-              <w:t>㈜0000</w:t>
-            </w:r>
           </w:p>
         </w:tc>
         <w:tc>
@@ -4879,14 +3929,6 @@
                 <w:sz w:val="22"/>
               </w:rPr>
             </w:pPr>
-            <w:r>
-              <w:rPr>
-                <w:rFonts w:eastAsiaTheme="minorHAnsi"/>
-                <w:kern w:val="0"/>
-                <w:sz w:val="22"/>
-              </w:rPr>
-              <w:t xml:space="preserve">고객응대, 매장관리 </w:t>
-            </w:r>
           </w:p>
         </w:tc>
         <w:tc>
@@ -4909,14 +3951,6 @@
                 <w:sz w:val="22"/>
               </w:rPr>
             </w:pPr>
-            <w:r>
-              <w:rPr>
-                <w:rFonts w:eastAsiaTheme="minorHAnsi"/>
-                <w:kern w:val="0"/>
-                <w:sz w:val="22"/>
-              </w:rPr>
-              <w:t>아르바이트</w:t>
-            </w:r>
           </w:p>
         </w:tc>
       </w:tr>
@@ -4975,7 +4009,6 @@
           <w:sz w:val="24"/>
           <w:szCs w:val="24"/>
         </w:rPr>
-        <w:lastRenderedPageBreak/>
         <w:t>6. 자격 및 면허 취득 사항</w:t>
       </w:r>
     </w:p>
@@ -5139,14 +4172,6 @@
                 <w:sz w:val="22"/>
               </w:rPr>
             </w:pPr>
-            <w:r>
-              <w:rPr>
-                <w:rFonts w:eastAsiaTheme="minorHAnsi" w:cs="굴림"/>
-                <w:color w:val="000000"/>
-                <w:sz w:val="22"/>
-              </w:rPr>
-              <w:t>05.02</w:t>
-            </w:r>
           </w:p>
         </w:tc>
         <w:tc>
@@ -5170,15 +4195,6 @@
                 <w:sz w:val="22"/>
               </w:rPr>
             </w:pPr>
-            <w:r>
-              <w:rPr>
-                <w:rFonts w:asciiTheme="majorHAnsi" w:eastAsiaTheme="majorEastAsia" w:hAnsiTheme="majorHAnsi"/>
-                <w:noProof/>
-                <w:color w:val="000000"/>
-                <w:sz w:val="22"/>
-              </w:rPr>
-              <w:t>ITQ아래한글 A등급</w:t>
-            </w:r>
           </w:p>
         </w:tc>
         <w:tc>
@@ -5202,13 +4218,6 @@
                 <w:sz w:val="22"/>
               </w:rPr>
             </w:pPr>
-            <w:r>
-              <w:rPr>
-                <w:color w:val="000000"/>
-                <w:sz w:val="22"/>
-              </w:rPr>
-              <w:t>한국생산성본부</w:t>
-            </w:r>
           </w:p>
         </w:tc>
       </w:tr>
@@ -5237,13 +4246,6 @@
                 <w:sz w:val="22"/>
               </w:rPr>
             </w:pPr>
-            <w:r>
-              <w:rPr>
-                <w:color w:val="000000"/>
-                <w:sz w:val="22"/>
-              </w:rPr>
-              <w:t>24.03</w:t>
-            </w:r>
           </w:p>
         </w:tc>
         <w:tc>
@@ -5266,15 +4268,6 @@
                 <w:sz w:val="22"/>
               </w:rPr>
             </w:pPr>
-            <w:r>
-              <w:rPr>
-                <w:rFonts w:asciiTheme="majorHAnsi" w:eastAsiaTheme="majorEastAsia" w:hAnsiTheme="majorHAnsi"/>
-                <w:noProof/>
-                <w:color w:val="000000"/>
-                <w:sz w:val="22"/>
-              </w:rPr>
-              <w:t>정보기기 운용기능사</w:t>
-            </w:r>
           </w:p>
         </w:tc>
         <w:tc>
@@ -5297,13 +4290,6 @@
                 <w:sz w:val="22"/>
               </w:rPr>
             </w:pPr>
-            <w:r>
-              <w:rPr>
-                <w:color w:val="000000"/>
-                <w:sz w:val="22"/>
-              </w:rPr>
-              <w:t>한국산업인력공단</w:t>
-            </w:r>
           </w:p>
         </w:tc>
       </w:tr>
@@ -5332,21 +4318,6 @@
                 <w:sz w:val="22"/>
               </w:rPr>
             </w:pPr>
-            <w:r>
-              <w:rPr>
-                <w:color w:val="000000"/>
-                <w:sz w:val="22"/>
-              </w:rPr>
-              <w:t>24.</w:t>
-            </w:r>
-            <w:r>
-              <w:rPr>
-                <w:rFonts w:hint="eastAsia"/>
-                <w:color w:val="000000"/>
-                <w:sz w:val="22"/>
-              </w:rPr>
-              <w:t>07</w:t>
-            </w:r>
           </w:p>
         </w:tc>
         <w:tc>
@@ -5371,15 +4342,6 @@
                 <w:sz w:val="22"/>
               </w:rPr>
             </w:pPr>
-            <w:r>
-              <w:rPr>
-                <w:rFonts w:asciiTheme="majorHAnsi" w:eastAsiaTheme="majorEastAsia" w:hAnsiTheme="majorHAnsi" w:hint="eastAsia"/>
-                <w:noProof/>
-                <w:color w:val="000000"/>
-                <w:sz w:val="22"/>
-              </w:rPr>
-              <w:t>한자2급</w:t>
-            </w:r>
           </w:p>
         </w:tc>
         <w:tc>
@@ -5402,13 +4364,6 @@
                 <w:sz w:val="22"/>
               </w:rPr>
             </w:pPr>
-            <w:r>
-              <w:rPr>
-                <w:color w:val="000000"/>
-                <w:sz w:val="22"/>
-              </w:rPr>
-              <w:t>OO기관</w:t>
-            </w:r>
           </w:p>
         </w:tc>
       </w:tr>
@@ -5437,13 +4392,6 @@
                 <w:sz w:val="22"/>
               </w:rPr>
             </w:pPr>
-            <w:r>
-              <w:rPr>
-                <w:color w:val="000000"/>
-                <w:sz w:val="22"/>
-              </w:rPr>
-              <w:t>21.02</w:t>
-            </w:r>
           </w:p>
         </w:tc>
         <w:tc>
@@ -5466,13 +4414,6 @@
                 <w:sz w:val="22"/>
               </w:rPr>
             </w:pPr>
-            <w:r>
-              <w:rPr>
-                <w:color w:val="000000"/>
-                <w:sz w:val="22"/>
-              </w:rPr>
-              <w:t>레크레이션 자격증</w:t>
-            </w:r>
           </w:p>
         </w:tc>
         <w:tc>
@@ -5495,13 +4436,6 @@
                 <w:sz w:val="22"/>
               </w:rPr>
             </w:pPr>
-            <w:r>
-              <w:rPr>
-                <w:color w:val="000000"/>
-                <w:sz w:val="22"/>
-              </w:rPr>
-              <w:t>OO기관</w:t>
-            </w:r>
           </w:p>
         </w:tc>
       </w:tr>
@@ -5530,13 +4464,6 @@
                 <w:sz w:val="22"/>
               </w:rPr>
             </w:pPr>
-            <w:r>
-              <w:rPr>
-                <w:color w:val="000000"/>
-                <w:sz w:val="22"/>
-              </w:rPr>
-              <w:t>20.03</w:t>
-            </w:r>
           </w:p>
         </w:tc>
         <w:tc>
@@ -5559,15 +4486,6 @@
                 <w:sz w:val="22"/>
               </w:rPr>
             </w:pPr>
-            <w:r>
-              <w:rPr>
-                <w:rFonts w:asciiTheme="majorHAnsi" w:eastAsiaTheme="majorEastAsia" w:hAnsiTheme="majorHAnsi"/>
-                <w:noProof/>
-                <w:color w:val="000000"/>
-                <w:sz w:val="22"/>
-              </w:rPr>
-              <w:t>운전면허 1종보통</w:t>
-            </w:r>
           </w:p>
         </w:tc>
         <w:tc>
@@ -5590,13 +4508,6 @@
                 <w:sz w:val="22"/>
               </w:rPr>
             </w:pPr>
-            <w:r>
-              <w:rPr>
-                <w:color w:val="000000"/>
-                <w:sz w:val="22"/>
-              </w:rPr>
-              <w:t>도로교통공단</w:t>
-            </w:r>
           </w:p>
         </w:tc>
       </w:tr>
@@ -5864,21 +4775,6 @@
                 <w:rFonts w:asciiTheme="majorHAnsi" w:eastAsiaTheme="majorHAnsi" w:hAnsiTheme="majorHAnsi"/>
               </w:rPr>
             </w:pPr>
-            <w:r>
-              <w:rPr>
-                <w:rFonts w:ascii="맑은 고딕" w:eastAsia="맑은 고딕" w:hAnsi="맑은 고딕"/>
-                <w:sz w:val="22"/>
-              </w:rPr>
-              <w:t>16</w:t>
-            </w:r>
-            <w:r>
-              <w:rPr>
-                <w:rFonts w:asciiTheme="majorHAnsi" w:eastAsiaTheme="majorHAnsi" w:hAnsiTheme="majorHAnsi"/>
-                <w:kern w:val="0"/>
-                <w:sz w:val="22"/>
-              </w:rPr>
-              <w:t>.00 ~ 18.00</w:t>
-            </w:r>
           </w:p>
         </w:tc>
         <w:tc>
@@ -5906,14 +4802,6 @@
                 <w:rFonts w:asciiTheme="majorHAnsi" w:eastAsiaTheme="majorHAnsi" w:hAnsiTheme="majorHAnsi"/>
               </w:rPr>
             </w:pPr>
-            <w:r>
-              <w:rPr>
-                <w:rFonts w:asciiTheme="majorHAnsi" w:eastAsiaTheme="majorHAnsi" w:hAnsiTheme="majorHAnsi"/>
-                <w:kern w:val="0"/>
-                <w:sz w:val="22"/>
-              </w:rPr>
-              <w:t>예비역, 병장, 보병</w:t>
-            </w:r>
           </w:p>
         </w:tc>
         <w:tc>
@@ -5941,14 +4829,6 @@
                 <w:rFonts w:asciiTheme="majorHAnsi" w:eastAsiaTheme="majorHAnsi" w:hAnsiTheme="majorHAnsi"/>
               </w:rPr>
             </w:pPr>
-            <w:r>
-              <w:rPr>
-                <w:rFonts w:asciiTheme="majorHAnsi" w:eastAsiaTheme="majorHAnsi" w:hAnsiTheme="majorHAnsi"/>
-                <w:kern w:val="0"/>
-                <w:sz w:val="22"/>
-              </w:rPr>
-              <w:t>군필</w:t>
-            </w:r>
           </w:p>
         </w:tc>
         <w:tc>
@@ -6046,6 +4926,7 @@
           <w:sz w:val="44"/>
           <w:szCs w:val="44"/>
         </w:rPr>
+        <w:lastRenderedPageBreak/>
         <w:t>자 기 소 개 서</w:t>
       </w:r>
     </w:p>
@@ -6148,240 +5029,6 @@
                 <w:sz w:val="22"/>
               </w:rPr>
             </w:pPr>
-            <w:r>
-              <w:rPr>
-                <w:rFonts w:eastAsiaTheme="minorHAnsi" w:cs="굴림"/>
-                <w:b/>
-                <w:kern w:val="0"/>
-                <w:sz w:val="22"/>
-              </w:rPr>
-              <w:t>ex [</w:t>
-            </w:r>
-            <w:r>
-              <w:rPr>
-                <w:rFonts w:eastAsiaTheme="minorHAnsi" w:cs="굴림" w:hint="eastAsia"/>
-                <w:b/>
-                <w:kern w:val="0"/>
-                <w:sz w:val="22"/>
-              </w:rPr>
-              <w:t>어떤</w:t>
-            </w:r>
-            <w:r>
-              <w:rPr>
-                <w:rFonts w:eastAsiaTheme="minorHAnsi" w:cs="굴림" w:hint="eastAsia"/>
-                <w:b/>
-                <w:kern w:val="0"/>
-                <w:sz w:val="22"/>
-              </w:rPr>
-              <w:t xml:space="preserve"> </w:t>
-            </w:r>
-            <w:r>
-              <w:rPr>
-                <w:rFonts w:eastAsiaTheme="minorHAnsi" w:cs="굴림" w:hint="eastAsia"/>
-                <w:b/>
-                <w:kern w:val="0"/>
-                <w:sz w:val="22"/>
-              </w:rPr>
-              <w:t xml:space="preserve">환경에서도 </w:t>
-            </w:r>
-            <w:r>
-              <w:rPr>
-                <w:rFonts w:eastAsiaTheme="minorHAnsi" w:cs="굴림" w:hint="eastAsia"/>
-                <w:b/>
-                <w:kern w:val="0"/>
-                <w:sz w:val="22"/>
-              </w:rPr>
-              <w:t>밝</w:t>
-            </w:r>
-            <w:r>
-              <w:rPr>
-                <w:rFonts w:eastAsiaTheme="minorHAnsi" w:cs="굴림" w:hint="eastAsia"/>
-                <w:b/>
-                <w:kern w:val="0"/>
-                <w:sz w:val="22"/>
-              </w:rPr>
-              <w:t>고, 근면 성실한 자세로</w:t>
-            </w:r>
-            <w:r>
-              <w:rPr>
-                <w:rFonts w:eastAsiaTheme="minorHAnsi" w:cs="굴림" w:hint="eastAsia"/>
-                <w:b/>
-                <w:kern w:val="0"/>
-                <w:sz w:val="22"/>
-              </w:rPr>
-              <w:t xml:space="preserve"> 감사한 마음을 가지고 한결같이 정성을 다해왔습니다.]</w:t>
-            </w:r>
-          </w:p>
-          <w:p>
-            <w:pPr>
-              <w:ind w:rightChars="100" w:right="200"/>
-              <w:rPr>
-                <w:rFonts w:eastAsia="맑은 고딕" w:cs="굴림"/>
-                <w:sz w:val="22"/>
-              </w:rPr>
-            </w:pPr>
-          </w:p>
-          <w:p>
-            <w:pPr>
-              <w:ind w:rightChars="100" w:right="200"/>
-              <w:rPr>
-                <w:rFonts w:eastAsia="맑은 고딕" w:cs="굴림"/>
-                <w:sz w:val="22"/>
-              </w:rPr>
-            </w:pPr>
-          </w:p>
-          <w:p>
-            <w:pPr>
-              <w:ind w:rightChars="100" w:right="200"/>
-              <w:rPr>
-                <w:rFonts w:eastAsia="맑은 고딕" w:cs="굴림"/>
-                <w:sz w:val="22"/>
-              </w:rPr>
-            </w:pPr>
-          </w:p>
-          <w:p>
-            <w:pPr>
-              <w:ind w:rightChars="100" w:right="200"/>
-              <w:rPr>
-                <w:rFonts w:eastAsia="맑은 고딕" w:cs="굴림"/>
-                <w:sz w:val="22"/>
-              </w:rPr>
-            </w:pPr>
-          </w:p>
-          <w:p>
-            <w:pPr>
-              <w:ind w:rightChars="100" w:right="200"/>
-              <w:rPr>
-                <w:rFonts w:eastAsia="맑은 고딕" w:cs="굴림"/>
-                <w:sz w:val="22"/>
-              </w:rPr>
-            </w:pPr>
-          </w:p>
-          <w:p>
-            <w:pPr>
-              <w:ind w:rightChars="100" w:right="200"/>
-              <w:rPr>
-                <w:rFonts w:eastAsia="맑은 고딕" w:cs="굴림"/>
-                <w:sz w:val="22"/>
-              </w:rPr>
-            </w:pPr>
-          </w:p>
-          <w:p>
-            <w:pPr>
-              <w:ind w:rightChars="100" w:right="200"/>
-              <w:rPr>
-                <w:rFonts w:eastAsia="맑은 고딕" w:cs="굴림"/>
-                <w:sz w:val="22"/>
-              </w:rPr>
-            </w:pPr>
-          </w:p>
-          <w:p>
-            <w:pPr>
-              <w:ind w:rightChars="100" w:right="200"/>
-              <w:rPr>
-                <w:rFonts w:eastAsia="맑은 고딕" w:cs="굴림"/>
-                <w:sz w:val="22"/>
-              </w:rPr>
-            </w:pPr>
-          </w:p>
-          <w:p>
-            <w:pPr>
-              <w:ind w:rightChars="100" w:right="200"/>
-              <w:rPr>
-                <w:rFonts w:eastAsia="맑은 고딕" w:cs="굴림"/>
-                <w:sz w:val="22"/>
-              </w:rPr>
-            </w:pPr>
-          </w:p>
-          <w:p>
-            <w:pPr>
-              <w:ind w:rightChars="100" w:right="200"/>
-              <w:rPr>
-                <w:rFonts w:eastAsia="맑은 고딕" w:cs="굴림"/>
-                <w:sz w:val="22"/>
-              </w:rPr>
-            </w:pPr>
-          </w:p>
-          <w:p>
-            <w:pPr>
-              <w:ind w:rightChars="100" w:right="200"/>
-              <w:rPr>
-                <w:rFonts w:eastAsia="맑은 고딕" w:cs="굴림"/>
-                <w:sz w:val="22"/>
-              </w:rPr>
-            </w:pPr>
-          </w:p>
-          <w:p>
-            <w:pPr>
-              <w:ind w:rightChars="100" w:right="200"/>
-              <w:rPr>
-                <w:rFonts w:eastAsia="맑은 고딕" w:cs="굴림"/>
-                <w:sz w:val="22"/>
-              </w:rPr>
-            </w:pPr>
-          </w:p>
-          <w:p>
-            <w:pPr>
-              <w:ind w:rightChars="100" w:right="200"/>
-              <w:rPr>
-                <w:rFonts w:eastAsia="맑은 고딕" w:cs="굴림"/>
-                <w:sz w:val="22"/>
-              </w:rPr>
-            </w:pPr>
-          </w:p>
-          <w:p>
-            <w:pPr>
-              <w:ind w:rightChars="100" w:right="200"/>
-              <w:rPr>
-                <w:rFonts w:eastAsia="맑은 고딕" w:cs="굴림"/>
-                <w:sz w:val="22"/>
-              </w:rPr>
-            </w:pPr>
-          </w:p>
-          <w:p>
-            <w:pPr>
-              <w:ind w:rightChars="100" w:right="200"/>
-              <w:rPr>
-                <w:rFonts w:eastAsia="맑은 고딕" w:cs="굴림"/>
-                <w:sz w:val="22"/>
-              </w:rPr>
-            </w:pPr>
-          </w:p>
-          <w:p>
-            <w:pPr>
-              <w:ind w:rightChars="100" w:right="200"/>
-              <w:rPr>
-                <w:rFonts w:eastAsia="맑은 고딕" w:cs="굴림"/>
-                <w:sz w:val="22"/>
-              </w:rPr>
-            </w:pPr>
-          </w:p>
-          <w:p>
-            <w:pPr>
-              <w:ind w:rightChars="100" w:right="200"/>
-              <w:rPr>
-                <w:rFonts w:eastAsia="맑은 고딕" w:cs="굴림"/>
-                <w:sz w:val="22"/>
-              </w:rPr>
-            </w:pPr>
-          </w:p>
-          <w:p>
-            <w:pPr>
-              <w:ind w:rightChars="100" w:right="200"/>
-              <w:rPr>
-                <w:rFonts w:eastAsia="맑은 고딕" w:cs="굴림"/>
-                <w:sz w:val="22"/>
-              </w:rPr>
-            </w:pPr>
-          </w:p>
-          <w:p>
-            <w:pPr>
-              <w:ind w:rightChars="100" w:right="200"/>
-              <w:rPr>
-                <w:rFonts w:eastAsia="맑은 고딕" w:cs="굴림"/>
-                <w:sz w:val="22"/>
-              </w:rPr>
-            </w:pPr>
           </w:p>
         </w:tc>
       </w:tr>
@@ -6466,33 +5113,6 @@
                 <w:sz w:val="22"/>
               </w:rPr>
             </w:pPr>
-            <w:r>
-              <w:rPr>
-                <w:rFonts w:eastAsiaTheme="minorHAnsi" w:cs="굴림"/>
-                <w:b/>
-                <w:kern w:val="0"/>
-                <w:sz w:val="22"/>
-              </w:rPr>
-              <w:t xml:space="preserve">[ex </w:t>
-            </w:r>
-            <w:r>
-              <w:rPr>
-                <w:rFonts w:eastAsiaTheme="minorHAnsi" w:cs="굴림" w:hint="eastAsia"/>
-                <w:b/>
-                <w:kern w:val="0"/>
-                <w:sz w:val="22"/>
-              </w:rPr>
-              <w:t xml:space="preserve">경청과 배려를 잘하고, 어려운 일도 앞장서서 해결하는 자세와 유연한 융통성을 가지고 문제 해결을 잘합니다. </w:t>
-            </w:r>
-          </w:p>
-          <w:p>
-            <w:pPr>
-              <w:ind w:rightChars="100" w:right="200"/>
-              <w:rPr>
-                <w:rFonts w:eastAsia="맑은 고딕" w:cs="굴림"/>
-                <w:sz w:val="22"/>
-              </w:rPr>
-            </w:pPr>
           </w:p>
           <w:p>
             <w:pPr>
@@ -6715,1532 +5335,7 @@
             <w:tcW w:w="8494" w:type="dxa"/>
             <w:vAlign w:val="center"/>
           </w:tcPr>
-          <w:p>
-            <w:pPr>
-              <w:pStyle w:val="a4"/>
-              <w:ind w:rightChars="100" w:right="200"/>
-              <w:jc w:val="left"/>
-              <w:rPr>
-                <w:b/>
-                <w:bCs/>
-                <w:color w:val="EE0000"/>
-                <w:sz w:val="22"/>
-                <w:szCs w:val="24"/>
-              </w:rPr>
-            </w:pPr>
-            <w:r>
-              <w:rPr>
-                <w:rFonts w:hint="eastAsia"/>
-                <w:color w:val="EE0000"/>
-                <w:sz w:val="22"/>
-                <w:szCs w:val="24"/>
-              </w:rPr>
-              <w:t>[</w:t>
-            </w:r>
-            <w:r>
-              <w:rPr>
-                <w:rFonts w:hint="eastAsia"/>
-                <w:b/>
-                <w:bCs/>
-                <w:color w:val="EE0000"/>
-                <w:sz w:val="22"/>
-                <w:szCs w:val="24"/>
-              </w:rPr>
-              <w:t>여기항목은</w:t>
-            </w:r>
-            <w:r>
-              <w:rPr>
-                <w:b/>
-                <w:bCs/>
-                <w:color w:val="EE0000"/>
-                <w:sz w:val="22"/>
-                <w:szCs w:val="24"/>
-              </w:rPr>
-              <w:t xml:space="preserve"> 대주제 작성하지 않습니다. 서로 너무같게 작성금지]</w:t>
-            </w:r>
-          </w:p>
-          <w:p>
-            <w:pPr>
-              <w:pStyle w:val="a4"/>
-              <w:ind w:rightChars="100" w:right="200"/>
-              <w:jc w:val="left"/>
-              <w:rPr>
-                <w:sz w:val="22"/>
-                <w:szCs w:val="24"/>
-              </w:rPr>
-            </w:pPr>
-            <w:r>
-              <w:rPr>
-                <w:rFonts w:hint="eastAsia"/>
-                <w:sz w:val="22"/>
-                <w:szCs w:val="24"/>
-              </w:rPr>
-              <w:t>J</w:t>
-            </w:r>
-            <w:r>
-              <w:rPr>
-                <w:sz w:val="22"/>
-                <w:szCs w:val="24"/>
-              </w:rPr>
-              <w:t xml:space="preserve">AVA </w:t>
-            </w:r>
-            <w:r>
-              <w:rPr>
-                <w:rFonts w:hint="eastAsia"/>
-                <w:sz w:val="22"/>
-                <w:szCs w:val="24"/>
-              </w:rPr>
-              <w:t>언어의 특징을 이해하여 코드를 작성할 수 있으며</w:t>
-            </w:r>
-          </w:p>
-          <w:p>
-            <w:pPr>
-              <w:pStyle w:val="a4"/>
-              <w:ind w:rightChars="100" w:right="200"/>
-              <w:jc w:val="left"/>
-              <w:rPr>
-                <w:sz w:val="22"/>
-                <w:szCs w:val="24"/>
-              </w:rPr>
-            </w:pPr>
-            <w:r>
-              <w:rPr>
-                <w:color w:val="000000"/>
-                <w:sz w:val="22"/>
-              </w:rPr>
-              <w:t xml:space="preserve">HTML/CSS/JS 를 </w:t>
-            </w:r>
-            <w:r>
-              <w:rPr>
-                <w:sz w:val="22"/>
-              </w:rPr>
-              <w:t xml:space="preserve">활용하여 웹 페이지의 구조와 콘텐츠를 </w:t>
-            </w:r>
-            <w:r>
-              <w:rPr>
-                <w:rFonts w:hint="eastAsia"/>
-                <w:sz w:val="22"/>
-              </w:rPr>
-              <w:t xml:space="preserve">구현하며, </w:t>
-            </w:r>
-            <w:r>
-              <w:rPr>
-                <w:rFonts w:hint="eastAsia"/>
-                <w:sz w:val="22"/>
-                <w:szCs w:val="24"/>
-              </w:rPr>
-              <w:t>J</w:t>
-            </w:r>
-            <w:r>
-              <w:rPr>
-                <w:sz w:val="22"/>
-                <w:szCs w:val="24"/>
-              </w:rPr>
-              <w:t>avaScript</w:t>
-            </w:r>
-            <w:r>
-              <w:rPr>
-                <w:rFonts w:hint="eastAsia"/>
-                <w:sz w:val="22"/>
-                <w:szCs w:val="24"/>
-              </w:rPr>
-              <w:t xml:space="preserve">와 </w:t>
-            </w:r>
-            <w:r>
-              <w:rPr>
-                <w:sz w:val="22"/>
-                <w:szCs w:val="24"/>
-              </w:rPr>
-              <w:t>JQuery</w:t>
-            </w:r>
-            <w:r>
-              <w:rPr>
-                <w:rFonts w:hint="eastAsia"/>
-                <w:sz w:val="22"/>
-                <w:szCs w:val="24"/>
-              </w:rPr>
-              <w:t xml:space="preserve">를 활용하여 </w:t>
-            </w:r>
-            <w:r>
-              <w:rPr>
-                <w:sz w:val="22"/>
-                <w:szCs w:val="24"/>
-              </w:rPr>
-              <w:t>다</w:t>
-            </w:r>
-            <w:r>
-              <w:rPr>
-                <w:rFonts w:hint="eastAsia"/>
-                <w:sz w:val="22"/>
-                <w:szCs w:val="24"/>
-              </w:rPr>
-              <w:t>양</w:t>
-            </w:r>
-            <w:r>
-              <w:rPr>
-                <w:sz w:val="22"/>
-                <w:szCs w:val="24"/>
-              </w:rPr>
-              <w:t xml:space="preserve">한 </w:t>
-            </w:r>
-            <w:r>
-              <w:rPr>
-                <w:rFonts w:hint="eastAsia"/>
-                <w:sz w:val="22"/>
-                <w:szCs w:val="24"/>
-              </w:rPr>
-              <w:t xml:space="preserve">이벤트를 처리할 수 있습니다. </w:t>
-            </w:r>
-          </w:p>
-          <w:p>
-            <w:pPr>
-              <w:pStyle w:val="a4"/>
-              <w:ind w:rightChars="100" w:right="200"/>
-              <w:jc w:val="left"/>
-              <w:rPr>
-                <w:sz w:val="22"/>
-                <w:szCs w:val="24"/>
-              </w:rPr>
-            </w:pPr>
-            <w:r>
-              <w:rPr>
-                <w:rFonts w:hint="eastAsia"/>
-                <w:sz w:val="22"/>
-                <w:szCs w:val="24"/>
-              </w:rPr>
-              <w:t>A</w:t>
-            </w:r>
-            <w:r>
-              <w:rPr>
-                <w:sz w:val="22"/>
-                <w:szCs w:val="24"/>
-              </w:rPr>
-              <w:t>jax</w:t>
-            </w:r>
-            <w:r>
-              <w:rPr>
-                <w:rFonts w:hint="eastAsia"/>
-                <w:sz w:val="22"/>
-                <w:szCs w:val="24"/>
-              </w:rPr>
-              <w:t>를 활용해 페이지를 비동기 방식으로 처리가 가능하며,</w:t>
-            </w:r>
-            <w:r>
-              <w:rPr>
-                <w:sz w:val="22"/>
-                <w:szCs w:val="24"/>
-              </w:rPr>
-              <w:t xml:space="preserve"> </w:t>
-            </w:r>
-            <w:r>
-              <w:rPr>
-                <w:rFonts w:hint="eastAsia"/>
-                <w:sz w:val="22"/>
-                <w:szCs w:val="24"/>
-              </w:rPr>
-              <w:t>웹페이지의 전체 페이지를 새로 고치지 않고,</w:t>
-            </w:r>
-            <w:r>
-              <w:rPr>
-                <w:sz w:val="22"/>
-                <w:szCs w:val="24"/>
-              </w:rPr>
-              <w:t xml:space="preserve"> </w:t>
-            </w:r>
-            <w:r>
-              <w:rPr>
-                <w:rFonts w:hint="eastAsia"/>
-                <w:sz w:val="22"/>
-                <w:szCs w:val="24"/>
-              </w:rPr>
-              <w:t>변경이 필요한</w:t>
-            </w:r>
-            <w:r>
-              <w:rPr>
-                <w:sz w:val="22"/>
-                <w:szCs w:val="24"/>
-              </w:rPr>
-              <w:t xml:space="preserve"> </w:t>
-            </w:r>
-            <w:r>
-              <w:rPr>
-                <w:rFonts w:hint="eastAsia"/>
-                <w:sz w:val="22"/>
-                <w:szCs w:val="24"/>
-              </w:rPr>
-              <w:t>부분만을 서버에서 가져와서 빠르게 동적으로 웹페이지 갱신을 할 수 있습니다.</w:t>
-            </w:r>
-          </w:p>
-          <w:p>
-            <w:pPr>
-              <w:pStyle w:val="a4"/>
-              <w:ind w:rightChars="100" w:right="200"/>
-              <w:jc w:val="left"/>
-              <w:rPr>
-                <w:sz w:val="22"/>
-                <w:szCs w:val="24"/>
-              </w:rPr>
-            </w:pPr>
-            <w:r>
-              <w:rPr>
-                <w:rFonts w:hint="eastAsia"/>
-                <w:sz w:val="22"/>
-                <w:szCs w:val="24"/>
-              </w:rPr>
-              <w:t>B</w:t>
-            </w:r>
-            <w:r>
-              <w:rPr>
-                <w:sz w:val="22"/>
-                <w:szCs w:val="24"/>
-              </w:rPr>
-              <w:t>ootStrap</w:t>
-            </w:r>
-            <w:r>
-              <w:rPr>
-                <w:rFonts w:hint="eastAsia"/>
-                <w:sz w:val="22"/>
-                <w:szCs w:val="24"/>
-              </w:rPr>
-              <w:t xml:space="preserve">을 이용가능하며 반응형 웹페이지를 구현할 수 있으며, </w:t>
-            </w:r>
-            <w:r>
-              <w:rPr>
-                <w:sz w:val="22"/>
-                <w:szCs w:val="24"/>
-              </w:rPr>
-              <w:t>CSS</w:t>
-            </w:r>
-            <w:r>
-              <w:rPr>
-                <w:rFonts w:hint="eastAsia"/>
-                <w:sz w:val="22"/>
-                <w:szCs w:val="24"/>
-              </w:rPr>
-              <w:t xml:space="preserve">를 사용하여 화면의 틀을 짜고 각 태그에 </w:t>
-            </w:r>
-            <w:r>
-              <w:rPr>
-                <w:sz w:val="22"/>
-                <w:szCs w:val="24"/>
-              </w:rPr>
-              <w:t>Style</w:t>
-            </w:r>
-            <w:r>
-              <w:rPr>
-                <w:rFonts w:hint="eastAsia"/>
-                <w:sz w:val="22"/>
-                <w:szCs w:val="24"/>
-              </w:rPr>
-              <w:t>을</w:t>
-            </w:r>
-            <w:r>
-              <w:rPr>
-                <w:sz w:val="22"/>
-                <w:szCs w:val="24"/>
-              </w:rPr>
-              <w:t xml:space="preserve"> </w:t>
-            </w:r>
-            <w:r>
-              <w:rPr>
-                <w:rFonts w:hint="eastAsia"/>
-                <w:sz w:val="22"/>
-                <w:szCs w:val="24"/>
-              </w:rPr>
-              <w:t xml:space="preserve">지정해 디자인할 수 있습니다. </w:t>
-            </w:r>
-          </w:p>
-          <w:p>
-            <w:pPr>
-              <w:pStyle w:val="a4"/>
-              <w:ind w:rightChars="100" w:right="200"/>
-              <w:jc w:val="left"/>
-              <w:rPr>
-                <w:sz w:val="22"/>
-                <w:szCs w:val="24"/>
-              </w:rPr>
-            </w:pPr>
-            <w:r>
-              <w:rPr>
-                <w:sz w:val="22"/>
-                <w:szCs w:val="24"/>
-              </w:rPr>
-              <w:t>SQL</w:t>
-            </w:r>
-            <w:r>
-              <w:rPr>
-                <w:rFonts w:hint="eastAsia"/>
-                <w:sz w:val="22"/>
-                <w:szCs w:val="24"/>
-              </w:rPr>
-              <w:t xml:space="preserve">을 이용해 </w:t>
-            </w:r>
-            <w:r>
-              <w:rPr>
-                <w:sz w:val="22"/>
-                <w:szCs w:val="24"/>
-              </w:rPr>
-              <w:t>DB</w:t>
-            </w:r>
-            <w:r>
-              <w:rPr>
-                <w:rFonts w:hint="eastAsia"/>
-                <w:sz w:val="22"/>
-                <w:szCs w:val="24"/>
-              </w:rPr>
-              <w:t xml:space="preserve">를 관리하고 </w:t>
-            </w:r>
-            <w:r>
-              <w:rPr>
-                <w:sz w:val="22"/>
-                <w:szCs w:val="24"/>
-              </w:rPr>
-              <w:t>DDL</w:t>
-            </w:r>
-            <w:r>
-              <w:rPr>
-                <w:rFonts w:hint="eastAsia"/>
-                <w:sz w:val="22"/>
-                <w:szCs w:val="24"/>
-              </w:rPr>
-              <w:t>과 C</w:t>
-            </w:r>
-            <w:r>
-              <w:rPr>
-                <w:sz w:val="22"/>
-                <w:szCs w:val="24"/>
-              </w:rPr>
-              <w:t>RUD</w:t>
-            </w:r>
-            <w:r>
-              <w:rPr>
-                <w:rFonts w:hint="eastAsia"/>
-                <w:sz w:val="22"/>
-                <w:szCs w:val="24"/>
-              </w:rPr>
-              <w:t>를 비롯한 J</w:t>
-            </w:r>
-            <w:r>
-              <w:rPr>
-                <w:sz w:val="22"/>
-                <w:szCs w:val="24"/>
-              </w:rPr>
-              <w:t xml:space="preserve">OIN, </w:t>
-            </w:r>
-            <w:r>
-              <w:rPr>
-                <w:rFonts w:hint="eastAsia"/>
-                <w:sz w:val="22"/>
-                <w:szCs w:val="24"/>
-              </w:rPr>
-              <w:t>시퀀스,</w:t>
-            </w:r>
-            <w:r>
-              <w:rPr>
-                <w:sz w:val="22"/>
-                <w:szCs w:val="24"/>
-              </w:rPr>
-              <w:t xml:space="preserve"> </w:t>
-            </w:r>
-            <w:r>
-              <w:rPr>
-                <w:rFonts w:hint="eastAsia"/>
-                <w:sz w:val="22"/>
-                <w:szCs w:val="24"/>
-              </w:rPr>
-              <w:t>뷰,</w:t>
-            </w:r>
-            <w:r>
-              <w:rPr>
-                <w:sz w:val="22"/>
-                <w:szCs w:val="24"/>
-              </w:rPr>
-              <w:t xml:space="preserve"> </w:t>
-            </w:r>
-            <w:r>
-              <w:rPr>
-                <w:rFonts w:hint="eastAsia"/>
-                <w:sz w:val="22"/>
-                <w:szCs w:val="24"/>
-              </w:rPr>
-              <w:t>함수 등을 이용하여 데이터를 관리 및 사용할 수 있습니다.</w:t>
-            </w:r>
-            <w:r>
-              <w:rPr>
-                <w:sz w:val="22"/>
-                <w:szCs w:val="24"/>
-              </w:rPr>
-              <w:t xml:space="preserve"> </w:t>
-            </w:r>
-            <w:r>
-              <w:rPr>
-                <w:rFonts w:hint="eastAsia"/>
-                <w:sz w:val="22"/>
-                <w:szCs w:val="24"/>
-              </w:rPr>
-              <w:t>업무에 필요한 테이블을 설계하고,</w:t>
-            </w:r>
-            <w:r>
-              <w:rPr>
-                <w:sz w:val="22"/>
-                <w:szCs w:val="24"/>
-              </w:rPr>
-              <w:t xml:space="preserve"> erdCloud</w:t>
-            </w:r>
-            <w:r>
-              <w:rPr>
-                <w:rFonts w:hint="eastAsia"/>
-                <w:sz w:val="22"/>
-                <w:szCs w:val="24"/>
-              </w:rPr>
-              <w:t xml:space="preserve">로 </w:t>
-            </w:r>
-            <w:r>
-              <w:rPr>
-                <w:sz w:val="22"/>
-                <w:szCs w:val="24"/>
-              </w:rPr>
-              <w:t>ERD</w:t>
-            </w:r>
-            <w:r>
-              <w:rPr>
-                <w:rFonts w:hint="eastAsia"/>
-                <w:sz w:val="22"/>
-                <w:szCs w:val="24"/>
-              </w:rPr>
-              <w:t>를 작성할 수 있습니다. O</w:t>
-            </w:r>
-            <w:r>
-              <w:rPr>
-                <w:sz w:val="22"/>
-                <w:szCs w:val="24"/>
-              </w:rPr>
-              <w:t>racle, MariaDB, PostgreSQL</w:t>
-            </w:r>
-            <w:r>
-              <w:rPr>
-                <w:rFonts w:hint="eastAsia"/>
-                <w:sz w:val="22"/>
-                <w:szCs w:val="24"/>
-              </w:rPr>
-              <w:t>을 사용할 수 있습니다.</w:t>
-            </w:r>
-            <w:r>
-              <w:rPr>
-                <w:sz w:val="22"/>
-                <w:szCs w:val="24"/>
-              </w:rPr>
-              <w:t xml:space="preserve"> </w:t>
-            </w:r>
-            <w:r>
-              <w:rPr>
-                <w:rFonts w:hint="eastAsia"/>
-                <w:sz w:val="22"/>
-                <w:szCs w:val="24"/>
-              </w:rPr>
-              <w:t>J</w:t>
-            </w:r>
-            <w:r>
-              <w:rPr>
-                <w:sz w:val="22"/>
-                <w:szCs w:val="24"/>
-              </w:rPr>
-              <w:t>DBC</w:t>
-            </w:r>
-            <w:r>
-              <w:rPr>
-                <w:rFonts w:hint="eastAsia"/>
-                <w:sz w:val="22"/>
-                <w:szCs w:val="24"/>
-              </w:rPr>
-              <w:t xml:space="preserve">를 적용하여 자바와 </w:t>
-            </w:r>
-            <w:r>
-              <w:rPr>
-                <w:sz w:val="22"/>
-                <w:szCs w:val="24"/>
-              </w:rPr>
-              <w:t>SQL</w:t>
-            </w:r>
-            <w:r>
-              <w:rPr>
-                <w:rFonts w:hint="eastAsia"/>
-                <w:sz w:val="22"/>
-                <w:szCs w:val="24"/>
-              </w:rPr>
-              <w:t>을 연동할 수 있습니다.</w:t>
-            </w:r>
-            <w:r>
-              <w:rPr>
-                <w:rFonts w:hint="eastAsia"/>
-                <w:sz w:val="22"/>
-                <w:szCs w:val="24"/>
-              </w:rPr>
-              <w:t xml:space="preserve"> </w:t>
-            </w:r>
-            <w:r>
-              <w:rPr>
-                <w:rFonts w:hint="eastAsia"/>
-                <w:sz w:val="22"/>
-                <w:szCs w:val="24"/>
-              </w:rPr>
-              <w:t>J</w:t>
-            </w:r>
-            <w:r>
-              <w:rPr>
-                <w:sz w:val="22"/>
-                <w:szCs w:val="24"/>
-              </w:rPr>
-              <w:t xml:space="preserve">ava </w:t>
-            </w:r>
-            <w:r>
-              <w:rPr>
-                <w:rFonts w:hint="eastAsia"/>
-                <w:sz w:val="22"/>
-                <w:szCs w:val="24"/>
-              </w:rPr>
-              <w:t>f</w:t>
-            </w:r>
-            <w:r>
-              <w:rPr>
-                <w:sz w:val="22"/>
-                <w:szCs w:val="24"/>
-              </w:rPr>
-              <w:t>ramework</w:t>
-            </w:r>
-            <w:r>
-              <w:rPr>
-                <w:rFonts w:hint="eastAsia"/>
-                <w:sz w:val="22"/>
-                <w:szCs w:val="24"/>
-              </w:rPr>
-              <w:t xml:space="preserve">인 </w:t>
-            </w:r>
-            <w:r>
-              <w:rPr>
-                <w:sz w:val="22"/>
-                <w:szCs w:val="24"/>
-              </w:rPr>
-              <w:t>Spring</w:t>
-            </w:r>
-            <w:r>
-              <w:rPr>
-                <w:rFonts w:hint="eastAsia"/>
-                <w:sz w:val="22"/>
-                <w:szCs w:val="24"/>
-              </w:rPr>
-              <w:t>을 통해서 M</w:t>
-            </w:r>
-            <w:r>
-              <w:rPr>
-                <w:sz w:val="22"/>
-                <w:szCs w:val="24"/>
-              </w:rPr>
-              <w:t>V</w:t>
-            </w:r>
-            <w:r>
-              <w:rPr>
-                <w:rFonts w:hint="eastAsia"/>
-                <w:sz w:val="22"/>
-                <w:szCs w:val="24"/>
-              </w:rPr>
-              <w:t>C를 적용할 수 있고,</w:t>
-            </w:r>
-            <w:r>
-              <w:rPr>
-                <w:sz w:val="22"/>
-                <w:szCs w:val="24"/>
-              </w:rPr>
-              <w:t xml:space="preserve"> Spring에서 자바 오브젝트와 SQL 사이의 자동 매핑 기능을 지원하는 MyBatis를 사용</w:t>
-            </w:r>
-            <w:r>
-              <w:rPr>
-                <w:rFonts w:hint="eastAsia"/>
-                <w:sz w:val="22"/>
-                <w:szCs w:val="24"/>
-              </w:rPr>
-              <w:t>할 수 있</w:t>
-            </w:r>
-            <w:r>
-              <w:rPr>
-                <w:sz w:val="22"/>
-                <w:szCs w:val="24"/>
-              </w:rPr>
-              <w:t>으며, 동적 쿼리를 사용해 효율적인 코드를 작성할 수 있습니다.</w:t>
-            </w:r>
-            <w:r>
-              <w:rPr>
-                <w:rFonts w:hint="eastAsia"/>
-                <w:sz w:val="22"/>
-                <w:szCs w:val="24"/>
-              </w:rPr>
-              <w:t xml:space="preserve"> </w:t>
-            </w:r>
-            <w:r>
-              <w:rPr>
-                <w:rFonts w:hint="eastAsia"/>
-                <w:sz w:val="22"/>
-                <w:szCs w:val="24"/>
-              </w:rPr>
-              <w:t>S</w:t>
-            </w:r>
-            <w:r>
-              <w:rPr>
-                <w:sz w:val="22"/>
-                <w:szCs w:val="24"/>
-              </w:rPr>
-              <w:t>pringBoot</w:t>
-            </w:r>
-            <w:r>
-              <w:rPr>
-                <w:rFonts w:hint="eastAsia"/>
-                <w:sz w:val="22"/>
-                <w:szCs w:val="24"/>
-              </w:rPr>
-              <w:t>에서 H</w:t>
-            </w:r>
-            <w:r>
-              <w:rPr>
-                <w:sz w:val="22"/>
-                <w:szCs w:val="24"/>
-              </w:rPr>
-              <w:t>ibernate</w:t>
-            </w:r>
-            <w:r>
-              <w:rPr>
-                <w:rFonts w:hint="eastAsia"/>
-                <w:sz w:val="22"/>
-                <w:szCs w:val="24"/>
-              </w:rPr>
-              <w:t xml:space="preserve">를 사용해서 </w:t>
-            </w:r>
-            <w:r>
-              <w:rPr>
-                <w:sz w:val="22"/>
-                <w:szCs w:val="24"/>
-              </w:rPr>
-              <w:t>JPA</w:t>
-            </w:r>
-            <w:r>
-              <w:rPr>
-                <w:rFonts w:hint="eastAsia"/>
-                <w:sz w:val="22"/>
-                <w:szCs w:val="24"/>
-              </w:rPr>
-              <w:t>를 구현할 수 있습니다. Q</w:t>
-            </w:r>
-            <w:r>
-              <w:rPr>
-                <w:sz w:val="22"/>
-                <w:szCs w:val="24"/>
-              </w:rPr>
-              <w:t>ueryDSL</w:t>
-            </w:r>
-            <w:r>
-              <w:rPr>
-                <w:rFonts w:hint="eastAsia"/>
-                <w:sz w:val="22"/>
-                <w:szCs w:val="24"/>
-              </w:rPr>
-              <w:t xml:space="preserve">을 이용해 자바코드로 </w:t>
-            </w:r>
-            <w:r>
-              <w:rPr>
-                <w:sz w:val="22"/>
-                <w:szCs w:val="24"/>
-              </w:rPr>
-              <w:t>SQL</w:t>
-            </w:r>
-            <w:r>
-              <w:rPr>
-                <w:rFonts w:hint="eastAsia"/>
-                <w:sz w:val="22"/>
-                <w:szCs w:val="24"/>
-              </w:rPr>
-              <w:t>을</w:t>
-            </w:r>
-            <w:r>
-              <w:rPr>
-                <w:sz w:val="22"/>
-                <w:szCs w:val="24"/>
-              </w:rPr>
-              <w:t xml:space="preserve"> 작성하여 </w:t>
-            </w:r>
-            <w:r>
-              <w:rPr>
-                <w:rFonts w:hint="eastAsia"/>
-                <w:sz w:val="22"/>
-                <w:szCs w:val="24"/>
-              </w:rPr>
-              <w:t>컴파일시점에 쿼리 오류를 미리 발견하고</w:t>
-            </w:r>
-            <w:r>
-              <w:rPr>
-                <w:sz w:val="22"/>
-                <w:szCs w:val="24"/>
-              </w:rPr>
-              <w:t xml:space="preserve">, </w:t>
-            </w:r>
-            <w:r>
-              <w:rPr>
-                <w:rFonts w:hint="eastAsia"/>
-                <w:sz w:val="22"/>
-                <w:szCs w:val="24"/>
-              </w:rPr>
-              <w:t>복잡한 동적 쿼리를 간결하게 작성하여 가독성과 유지보수성을 높일수 있습니다. J</w:t>
-            </w:r>
-            <w:r>
-              <w:rPr>
-                <w:sz w:val="22"/>
-                <w:szCs w:val="24"/>
-              </w:rPr>
-              <w:t xml:space="preserve">ava </w:t>
-            </w:r>
-            <w:r>
-              <w:rPr>
-                <w:rFonts w:hint="eastAsia"/>
-                <w:sz w:val="22"/>
-                <w:szCs w:val="24"/>
-              </w:rPr>
-              <w:t>기반의 서버사이드 템플릿 엔진인 T</w:t>
-            </w:r>
-            <w:r>
-              <w:rPr>
-                <w:sz w:val="22"/>
-                <w:szCs w:val="24"/>
-              </w:rPr>
-              <w:t>hymeleaf(</w:t>
-            </w:r>
-            <w:r>
-              <w:rPr>
-                <w:rFonts w:hint="eastAsia"/>
-                <w:sz w:val="22"/>
-                <w:szCs w:val="24"/>
-              </w:rPr>
-              <w:t xml:space="preserve">타임리프)를 통해 동적으로 </w:t>
-            </w:r>
-            <w:r>
-              <w:rPr>
-                <w:sz w:val="22"/>
-                <w:szCs w:val="24"/>
-              </w:rPr>
-              <w:t>HTML, XML, JavaScript, CSS</w:t>
-            </w:r>
-            <w:r>
-              <w:rPr>
-                <w:rFonts w:hint="eastAsia"/>
-                <w:sz w:val="22"/>
-                <w:szCs w:val="24"/>
-              </w:rPr>
-              <w:t xml:space="preserve">등 다양한 형식의 템플릿을 처리할 수 있습니다. </w:t>
-            </w:r>
-            <w:r>
-              <w:rPr>
-                <w:sz w:val="22"/>
-                <w:szCs w:val="24"/>
-              </w:rPr>
-              <w:t>R</w:t>
-            </w:r>
-            <w:r>
-              <w:rPr>
-                <w:rFonts w:hint="eastAsia"/>
-                <w:sz w:val="22"/>
-                <w:szCs w:val="24"/>
-              </w:rPr>
-              <w:t>E</w:t>
-            </w:r>
-            <w:r>
-              <w:rPr>
-                <w:sz w:val="22"/>
-                <w:szCs w:val="24"/>
-              </w:rPr>
-              <w:t>STful API</w:t>
-            </w:r>
-            <w:r>
-              <w:rPr>
-                <w:rFonts w:hint="eastAsia"/>
-                <w:sz w:val="22"/>
-                <w:szCs w:val="24"/>
-              </w:rPr>
-              <w:t>의</w:t>
-            </w:r>
-            <w:r>
-              <w:rPr>
-                <w:sz w:val="22"/>
-                <w:szCs w:val="24"/>
-              </w:rPr>
-              <w:t xml:space="preserve"> </w:t>
-            </w:r>
-            <w:r>
-              <w:rPr>
-                <w:rFonts w:hint="eastAsia"/>
-                <w:sz w:val="22"/>
-                <w:szCs w:val="24"/>
-              </w:rPr>
-              <w:t>장점을 이해하며,</w:t>
-            </w:r>
-            <w:r>
-              <w:rPr>
-                <w:sz w:val="22"/>
-                <w:szCs w:val="24"/>
-              </w:rPr>
-              <w:t xml:space="preserve"> Postman</w:t>
-            </w:r>
-            <w:r>
-              <w:rPr>
-                <w:rFonts w:hint="eastAsia"/>
-                <w:sz w:val="22"/>
-                <w:szCs w:val="24"/>
-              </w:rPr>
-              <w:t xml:space="preserve">을 이용해서 </w:t>
-            </w:r>
-            <w:r>
-              <w:rPr>
-                <w:sz w:val="22"/>
-                <w:szCs w:val="24"/>
-              </w:rPr>
-              <w:t xml:space="preserve">HTTP </w:t>
-            </w:r>
-            <w:r>
-              <w:rPr>
-                <w:rFonts w:hint="eastAsia"/>
-                <w:sz w:val="22"/>
-                <w:szCs w:val="24"/>
-              </w:rPr>
-              <w:t>메서드별로 값을 전송하고 처리할 수 있습니다.</w:t>
-            </w:r>
-            <w:r>
-              <w:rPr>
-                <w:rFonts w:hint="eastAsia"/>
-                <w:sz w:val="22"/>
-                <w:szCs w:val="24"/>
-              </w:rPr>
-              <w:t xml:space="preserve"> </w:t>
-            </w:r>
-            <w:r>
-              <w:rPr>
-                <w:rFonts w:hint="eastAsia"/>
-                <w:sz w:val="22"/>
-                <w:szCs w:val="24"/>
-              </w:rPr>
-              <w:t>R</w:t>
-            </w:r>
-            <w:r>
-              <w:rPr>
-                <w:sz w:val="22"/>
-                <w:szCs w:val="24"/>
-              </w:rPr>
-              <w:t>eact.js</w:t>
-            </w:r>
-            <w:r>
-              <w:rPr>
-                <w:rFonts w:hint="eastAsia"/>
-                <w:sz w:val="22"/>
-                <w:szCs w:val="24"/>
-              </w:rPr>
-              <w:t xml:space="preserve">의 </w:t>
-            </w:r>
-            <w:r>
-              <w:rPr>
-                <w:rFonts w:hint="eastAsia"/>
-                <w:sz w:val="22"/>
-                <w:szCs w:val="24"/>
-              </w:rPr>
-              <w:t>구동방식을</w:t>
-            </w:r>
-            <w:r>
-              <w:rPr>
-                <w:sz w:val="22"/>
-                <w:szCs w:val="24"/>
-              </w:rPr>
-              <w:t xml:space="preserve"> 이해하며, </w:t>
-            </w:r>
-            <w:r>
-              <w:rPr>
-                <w:rFonts w:hint="eastAsia"/>
-                <w:sz w:val="22"/>
-                <w:szCs w:val="24"/>
-              </w:rPr>
-              <w:t>스프링부트와 연동하여 구축할 수 있습니다.h</w:t>
-            </w:r>
-            <w:r>
-              <w:rPr>
-                <w:sz w:val="22"/>
-                <w:szCs w:val="24"/>
-              </w:rPr>
-              <w:t xml:space="preserve">eader, payload, signature </w:t>
-            </w:r>
-            <w:r>
-              <w:rPr>
-                <w:rFonts w:hint="eastAsia"/>
-                <w:sz w:val="22"/>
-                <w:szCs w:val="24"/>
-              </w:rPr>
-              <w:t xml:space="preserve">세 파트로 구성되는 </w:t>
-            </w:r>
-            <w:r>
-              <w:rPr>
-                <w:sz w:val="22"/>
-                <w:szCs w:val="24"/>
-              </w:rPr>
-              <w:t>JWT(Json Web Token)</w:t>
-            </w:r>
-            <w:r>
-              <w:rPr>
-                <w:rFonts w:hint="eastAsia"/>
-                <w:sz w:val="22"/>
-                <w:szCs w:val="24"/>
-              </w:rPr>
-              <w:t>의</w:t>
-            </w:r>
-            <w:r>
-              <w:rPr>
-                <w:sz w:val="22"/>
-                <w:szCs w:val="24"/>
-              </w:rPr>
-              <w:t xml:space="preserve"> </w:t>
-            </w:r>
-            <w:r>
-              <w:rPr>
-                <w:rFonts w:hint="eastAsia"/>
-                <w:sz w:val="22"/>
-                <w:szCs w:val="24"/>
-              </w:rPr>
-              <w:t>동작방식을 이해하며,</w:t>
-            </w:r>
-            <w:r>
-              <w:rPr>
-                <w:sz w:val="22"/>
-                <w:szCs w:val="24"/>
-              </w:rPr>
-              <w:t xml:space="preserve"> </w:t>
-            </w:r>
-            <w:r>
-              <w:rPr>
-                <w:rFonts w:hint="eastAsia"/>
-                <w:sz w:val="22"/>
-                <w:szCs w:val="24"/>
-              </w:rPr>
-              <w:t>리액트에 구현 가능합니다.</w:t>
-            </w:r>
-            <w:r>
-              <w:rPr>
-                <w:rFonts w:hint="eastAsia"/>
-                <w:sz w:val="22"/>
-                <w:szCs w:val="24"/>
-              </w:rPr>
-              <w:t xml:space="preserve"> </w:t>
-            </w:r>
-          </w:p>
-          <w:p>
-            <w:pPr>
-              <w:pStyle w:val="a4"/>
-              <w:ind w:rightChars="100" w:right="200"/>
-              <w:jc w:val="left"/>
-              <w:rPr>
-                <w:sz w:val="22"/>
-                <w:szCs w:val="24"/>
-              </w:rPr>
-            </w:pPr>
-            <w:r>
-              <w:rPr>
-                <w:sz w:val="22"/>
-                <w:szCs w:val="24"/>
-              </w:rPr>
-              <w:t xml:space="preserve">Python의 BeautifulSoup </w:t>
-            </w:r>
-            <w:r>
-              <w:rPr>
-                <w:rFonts w:hint="eastAsia"/>
-                <w:sz w:val="22"/>
-                <w:szCs w:val="24"/>
-              </w:rPr>
-              <w:t>라이브러리를</w:t>
-            </w:r>
-            <w:r>
-              <w:rPr>
-                <w:sz w:val="22"/>
-                <w:szCs w:val="24"/>
-              </w:rPr>
-              <w:t xml:space="preserve"> 이용해서 </w:t>
-            </w:r>
-            <w:r>
-              <w:rPr>
-                <w:rFonts w:hint="eastAsia"/>
-                <w:sz w:val="22"/>
-                <w:szCs w:val="24"/>
-              </w:rPr>
-              <w:t xml:space="preserve">공공데이터를 </w:t>
-            </w:r>
-            <w:r>
-              <w:rPr>
-                <w:sz w:val="22"/>
-                <w:szCs w:val="24"/>
-              </w:rPr>
-              <w:t>웹</w:t>
-            </w:r>
-            <w:r>
-              <w:rPr>
-                <w:rFonts w:hint="eastAsia"/>
-                <w:sz w:val="22"/>
-                <w:szCs w:val="24"/>
-              </w:rPr>
-              <w:t xml:space="preserve"> 크롤링</w:t>
-            </w:r>
-            <w:r>
-              <w:rPr>
-                <w:sz w:val="22"/>
-                <w:szCs w:val="24"/>
-              </w:rPr>
-              <w:t xml:space="preserve">할 수 있습니다. Python의 Numpy, Pandas </w:t>
-            </w:r>
-            <w:r>
-              <w:rPr>
-                <w:rFonts w:hint="eastAsia"/>
-                <w:sz w:val="22"/>
-                <w:szCs w:val="24"/>
-              </w:rPr>
-              <w:t>라이브러리를</w:t>
-            </w:r>
-            <w:r>
-              <w:rPr>
-                <w:sz w:val="22"/>
-                <w:szCs w:val="24"/>
-              </w:rPr>
-              <w:t xml:space="preserve"> 사용하여 데이터 변환과 전처리를 할 수 있고, Matplotlib </w:t>
-            </w:r>
-            <w:r>
-              <w:rPr>
-                <w:rFonts w:hint="eastAsia"/>
-                <w:sz w:val="22"/>
-                <w:szCs w:val="24"/>
-              </w:rPr>
-              <w:t>라이브러리를</w:t>
-            </w:r>
-            <w:r>
-              <w:rPr>
-                <w:sz w:val="22"/>
-                <w:szCs w:val="24"/>
-              </w:rPr>
-              <w:t xml:space="preserve"> 사용하여 시각화할 수 있습니다.  JavaScript와 Python을 통해 Open API를 </w:t>
-            </w:r>
-            <w:r>
-              <w:rPr>
-                <w:rFonts w:hint="eastAsia"/>
-                <w:sz w:val="22"/>
-                <w:szCs w:val="24"/>
-              </w:rPr>
-              <w:t xml:space="preserve">활용할 수 </w:t>
-            </w:r>
-            <w:r>
-              <w:rPr>
-                <w:sz w:val="22"/>
-                <w:szCs w:val="24"/>
-              </w:rPr>
-              <w:t xml:space="preserve">있습니다. </w:t>
-            </w:r>
-          </w:p>
-          <w:p>
-            <w:pPr>
-              <w:pStyle w:val="a4"/>
-              <w:ind w:rightChars="100" w:right="200"/>
-              <w:jc w:val="left"/>
-              <w:rPr>
-                <w:sz w:val="22"/>
-                <w:szCs w:val="24"/>
-              </w:rPr>
-            </w:pPr>
-            <w:r>
-              <w:rPr>
-                <w:rFonts w:hint="eastAsia"/>
-                <w:sz w:val="22"/>
-                <w:szCs w:val="24"/>
-              </w:rPr>
-              <w:t>L</w:t>
-            </w:r>
-            <w:r>
-              <w:rPr>
-                <w:sz w:val="22"/>
-                <w:szCs w:val="24"/>
-              </w:rPr>
-              <w:t>inux(Ubuntu)</w:t>
-            </w:r>
-            <w:r>
-              <w:rPr>
-                <w:rFonts w:hint="eastAsia"/>
-                <w:sz w:val="22"/>
-                <w:szCs w:val="24"/>
-              </w:rPr>
-              <w:t xml:space="preserve">를 활용하여 웹서버를 구축할 수 있습니다. </w:t>
-            </w:r>
-          </w:p>
-          <w:p>
-            <w:pPr>
-              <w:pStyle w:val="a4"/>
-              <w:ind w:rightChars="100" w:right="200"/>
-              <w:jc w:val="left"/>
-              <w:rPr>
-                <w:sz w:val="22"/>
-                <w:szCs w:val="24"/>
-              </w:rPr>
-            </w:pPr>
-            <w:r>
-              <w:rPr>
-                <w:rFonts w:hint="eastAsia"/>
-                <w:sz w:val="22"/>
-                <w:szCs w:val="24"/>
-              </w:rPr>
-              <w:t>A</w:t>
-            </w:r>
-            <w:r>
-              <w:rPr>
-                <w:sz w:val="22"/>
-                <w:szCs w:val="24"/>
-              </w:rPr>
-              <w:t xml:space="preserve">WS </w:t>
-            </w:r>
-            <w:r>
-              <w:rPr>
-                <w:rFonts w:hint="eastAsia"/>
-                <w:sz w:val="22"/>
-                <w:szCs w:val="24"/>
-              </w:rPr>
-              <w:t>ec</w:t>
-            </w:r>
-            <w:r>
-              <w:rPr>
-                <w:sz w:val="22"/>
-                <w:szCs w:val="24"/>
-              </w:rPr>
-              <w:t>2</w:t>
-            </w:r>
-            <w:r>
-              <w:rPr>
-                <w:rFonts w:hint="eastAsia"/>
-                <w:sz w:val="22"/>
-                <w:szCs w:val="24"/>
-              </w:rPr>
-              <w:t>의 웹서버에서 인스턴스 생성,</w:t>
-            </w:r>
-            <w:r>
-              <w:rPr>
-                <w:sz w:val="22"/>
-                <w:szCs w:val="24"/>
-              </w:rPr>
-              <w:t xml:space="preserve"> </w:t>
-            </w:r>
-            <w:r>
-              <w:rPr>
-                <w:rFonts w:hint="eastAsia"/>
-                <w:sz w:val="22"/>
-                <w:szCs w:val="24"/>
-              </w:rPr>
-              <w:t xml:space="preserve">탄력적 </w:t>
-            </w:r>
-            <w:r>
-              <w:rPr>
-                <w:sz w:val="22"/>
-                <w:szCs w:val="24"/>
-              </w:rPr>
-              <w:t xml:space="preserve">IP </w:t>
-            </w:r>
-            <w:r>
-              <w:rPr>
-                <w:rFonts w:hint="eastAsia"/>
-                <w:sz w:val="22"/>
-                <w:szCs w:val="24"/>
-              </w:rPr>
-              <w:t>키페어 설정을 할 수 있습니다.</w:t>
-            </w:r>
-            <w:r>
-              <w:rPr>
-                <w:sz w:val="22"/>
-                <w:szCs w:val="24"/>
-              </w:rPr>
-              <w:t xml:space="preserve"> Putty</w:t>
-            </w:r>
-            <w:r>
-              <w:rPr>
-                <w:rFonts w:hint="eastAsia"/>
-                <w:sz w:val="22"/>
-                <w:szCs w:val="24"/>
-              </w:rPr>
-              <w:t xml:space="preserve">를 이용한 터미널 접속 및 </w:t>
-            </w:r>
-            <w:r>
-              <w:rPr>
-                <w:sz w:val="22"/>
-                <w:szCs w:val="24"/>
-              </w:rPr>
-              <w:t xml:space="preserve">key </w:t>
-            </w:r>
-            <w:r>
-              <w:rPr>
-                <w:rFonts w:hint="eastAsia"/>
-                <w:sz w:val="22"/>
-                <w:szCs w:val="24"/>
-              </w:rPr>
-              <w:t>설정과 클라우드 연결이 가능합니다.</w:t>
-            </w:r>
-            <w:r>
-              <w:rPr>
-                <w:sz w:val="22"/>
-                <w:szCs w:val="24"/>
-              </w:rPr>
-              <w:t xml:space="preserve"> </w:t>
-            </w:r>
-          </w:p>
-          <w:p>
-            <w:pPr>
-              <w:pStyle w:val="a4"/>
-              <w:ind w:rightChars="100" w:right="200"/>
-              <w:jc w:val="left"/>
-              <w:rPr>
-                <w:sz w:val="22"/>
-                <w:szCs w:val="24"/>
-              </w:rPr>
-            </w:pPr>
-            <w:r>
-              <w:rPr>
-                <w:rFonts w:hint="eastAsia"/>
-                <w:sz w:val="22"/>
-                <w:szCs w:val="24"/>
-              </w:rPr>
-              <w:t>구축한 프로젝트를 AW</w:t>
-            </w:r>
-            <w:r>
-              <w:rPr>
-                <w:sz w:val="22"/>
-                <w:szCs w:val="24"/>
-              </w:rPr>
-              <w:t xml:space="preserve">S </w:t>
-            </w:r>
-            <w:r>
-              <w:rPr>
-                <w:rFonts w:hint="eastAsia"/>
-                <w:sz w:val="22"/>
-                <w:szCs w:val="24"/>
-              </w:rPr>
-              <w:t>클라우드 서비스를 이용해 배포할 수 있습니다.</w:t>
-            </w:r>
-          </w:p>
-          <w:p>
-            <w:pPr>
-              <w:pStyle w:val="a4"/>
-              <w:ind w:rightChars="100" w:right="200"/>
-              <w:jc w:val="left"/>
-              <w:rPr>
-                <w:sz w:val="22"/>
-                <w:szCs w:val="24"/>
-              </w:rPr>
-            </w:pPr>
-            <w:r>
-              <w:rPr>
-                <w:rFonts w:hint="eastAsia"/>
-                <w:sz w:val="22"/>
-                <w:szCs w:val="24"/>
-              </w:rPr>
-              <w:t>형상관리 툴인 G</w:t>
-            </w:r>
-            <w:r>
-              <w:rPr>
-                <w:sz w:val="22"/>
-                <w:szCs w:val="24"/>
-              </w:rPr>
-              <w:t xml:space="preserve">it, </w:t>
-            </w:r>
-            <w:r>
-              <w:rPr>
-                <w:rFonts w:hint="eastAsia"/>
-                <w:sz w:val="22"/>
-                <w:szCs w:val="24"/>
-              </w:rPr>
-              <w:t>G</w:t>
-            </w:r>
-            <w:r>
-              <w:rPr>
-                <w:sz w:val="22"/>
-                <w:szCs w:val="24"/>
-              </w:rPr>
-              <w:t>itHub</w:t>
-            </w:r>
-            <w:r>
-              <w:rPr>
-                <w:rFonts w:hint="eastAsia"/>
-                <w:sz w:val="22"/>
-                <w:szCs w:val="24"/>
-              </w:rPr>
-              <w:t>를 이용하여 수업소스를 공유하고 팀 간의 협업을 할 수 있습니다. 이로써 웹의 프론트엔드와 백엔드 개발을 모두 수행할 수 있는 풀스택 개발능력을 갖추게 되었습니다. 애플리케이션의 전체적인 구조를 이해하고,</w:t>
-            </w:r>
-            <w:r>
-              <w:rPr>
-                <w:sz w:val="22"/>
-                <w:szCs w:val="24"/>
-              </w:rPr>
-              <w:t xml:space="preserve"> </w:t>
-            </w:r>
-            <w:r>
-              <w:rPr>
-                <w:rFonts w:hint="eastAsia"/>
-                <w:sz w:val="22"/>
-                <w:szCs w:val="24"/>
-              </w:rPr>
-              <w:t>요구사항분석부터 설계(화면설계,</w:t>
-            </w:r>
-            <w:r>
-              <w:rPr>
-                <w:sz w:val="22"/>
-                <w:szCs w:val="24"/>
-              </w:rPr>
-              <w:t xml:space="preserve"> DB</w:t>
-            </w:r>
-            <w:r>
-              <w:rPr>
-                <w:rFonts w:hint="eastAsia"/>
-                <w:sz w:val="22"/>
-                <w:szCs w:val="24"/>
-              </w:rPr>
-              <w:t>설계</w:t>
-            </w:r>
-            <w:r>
-              <w:rPr>
-                <w:sz w:val="22"/>
-                <w:szCs w:val="24"/>
-              </w:rPr>
-              <w:t xml:space="preserve">), </w:t>
-            </w:r>
-            <w:r>
-              <w:rPr>
-                <w:rFonts w:hint="eastAsia"/>
-                <w:sz w:val="22"/>
-                <w:szCs w:val="24"/>
-              </w:rPr>
-              <w:t>개발,</w:t>
-            </w:r>
-            <w:r>
-              <w:rPr>
-                <w:sz w:val="22"/>
-                <w:szCs w:val="24"/>
-              </w:rPr>
-              <w:t xml:space="preserve"> </w:t>
-            </w:r>
-            <w:r>
-              <w:rPr>
-                <w:rFonts w:hint="eastAsia"/>
-                <w:sz w:val="22"/>
-                <w:szCs w:val="24"/>
-              </w:rPr>
-              <w:t>테스트,</w:t>
-            </w:r>
-            <w:r>
-              <w:rPr>
-                <w:sz w:val="22"/>
-                <w:szCs w:val="24"/>
-              </w:rPr>
-              <w:t xml:space="preserve"> </w:t>
-            </w:r>
-            <w:r>
-              <w:rPr>
-                <w:rFonts w:hint="eastAsia"/>
-                <w:sz w:val="22"/>
-                <w:szCs w:val="24"/>
-              </w:rPr>
-              <w:t xml:space="preserve">배포까지 전 과정을 수행할 수 있습니다. 스프링과 </w:t>
-            </w:r>
-            <w:r>
-              <w:rPr>
-                <w:sz w:val="22"/>
-                <w:szCs w:val="24"/>
-              </w:rPr>
-              <w:t>MyBatis</w:t>
-            </w:r>
-            <w:r>
-              <w:rPr>
-                <w:rFonts w:hint="eastAsia"/>
-                <w:sz w:val="22"/>
-                <w:szCs w:val="24"/>
-              </w:rPr>
-              <w:t xml:space="preserve"> 기반으로 웹사이트 구축이 가능합니다.</w:t>
-            </w:r>
-            <w:r>
-              <w:rPr>
-                <w:rFonts w:hint="eastAsia"/>
-                <w:sz w:val="22"/>
-                <w:szCs w:val="24"/>
-              </w:rPr>
-              <w:t xml:space="preserve"> </w:t>
-            </w:r>
-            <w:r>
-              <w:rPr>
-                <w:rFonts w:hint="eastAsia"/>
-                <w:sz w:val="22"/>
-                <w:szCs w:val="24"/>
-              </w:rPr>
-              <w:t>스프링부트와 리액트</w:t>
-            </w:r>
-            <w:r>
-              <w:rPr>
-                <w:sz w:val="22"/>
-                <w:szCs w:val="24"/>
-              </w:rPr>
-              <w:t xml:space="preserve"> </w:t>
-            </w:r>
-            <w:r>
-              <w:rPr>
-                <w:rFonts w:hint="eastAsia"/>
-                <w:sz w:val="22"/>
-                <w:szCs w:val="24"/>
-              </w:rPr>
-              <w:t>기반으로 웹사이트 구축이 가능합니다.</w:t>
-            </w:r>
-          </w:p>
-          <w:p>
-            <w:r>
-              <w:rPr>
-                <w:rFonts w:hint="eastAsia"/>
-                <w:sz w:val="22"/>
-                <w:szCs w:val="24"/>
-              </w:rPr>
-              <w:t>스프링부트와 T</w:t>
-            </w:r>
-            <w:r>
-              <w:rPr>
-                <w:sz w:val="22"/>
-                <w:szCs w:val="24"/>
-              </w:rPr>
-              <w:t>hymeleaf(</w:t>
-            </w:r>
-            <w:r>
-              <w:rPr>
-                <w:rFonts w:hint="eastAsia"/>
-                <w:sz w:val="22"/>
-                <w:szCs w:val="24"/>
-              </w:rPr>
-              <w:t>타임리프)</w:t>
-            </w:r>
-            <w:r>
-              <w:rPr>
-                <w:sz w:val="22"/>
-                <w:szCs w:val="24"/>
-              </w:rPr>
-              <w:t xml:space="preserve"> </w:t>
-            </w:r>
-            <w:r>
-              <w:rPr>
-                <w:rFonts w:hint="eastAsia"/>
-                <w:sz w:val="22"/>
-                <w:szCs w:val="24"/>
-              </w:rPr>
-              <w:t>기반으로 웹사이트 구축이 가능합니다.</w:t>
-            </w:r>
-            <w:r>
-              <w:rPr>
-                <w:sz w:val="22"/>
-                <w:szCs w:val="24"/>
-              </w:rPr>
-              <w:t xml:space="preserve"> </w:t>
-            </w:r>
-          </w:p>
+          <w:p/>
         </w:tc>
       </w:tr>
       <w:tr>
@@ -8379,147 +5474,6 @@
           </w:tcPr>
           <w:p>
             <w:pPr>
-              <w:pStyle w:val="a4"/>
-              <w:ind w:rightChars="100" w:right="200"/>
-              <w:rPr>
-                <w:rFonts w:eastAsiaTheme="minorHAnsi" w:cs="굴림"/>
-                <w:b/>
-                <w:kern w:val="0"/>
-                <w:sz w:val="22"/>
-              </w:rPr>
-            </w:pPr>
-            <w:r>
-              <w:rPr>
-                <w:rFonts w:eastAsiaTheme="minorHAnsi" w:cs="굴림"/>
-                <w:b/>
-                <w:kern w:val="0"/>
-                <w:sz w:val="22"/>
-              </w:rPr>
-              <w:t xml:space="preserve">[소중한 회사와 동료들을 위해 항상 감사와 협력의 즐거움을 가지고 </w:t>
-            </w:r>
-            <w:r>
-              <w:rPr>
-                <w:rFonts w:eastAsiaTheme="minorHAnsi" w:cs="굴림" w:hint="eastAsia"/>
-                <w:b/>
-                <w:kern w:val="0"/>
-                <w:sz w:val="22"/>
-              </w:rPr>
-              <w:t xml:space="preserve">회사의 미래를 창출해가는 도전적인 </w:t>
-            </w:r>
-            <w:r>
-              <w:rPr>
-                <w:rFonts w:eastAsiaTheme="minorHAnsi" w:cs="굴림"/>
-                <w:b/>
-                <w:kern w:val="0"/>
-                <w:sz w:val="22"/>
-              </w:rPr>
-              <w:t>개발자(인재)가 되겠습니다.</w:t>
-            </w:r>
-          </w:p>
-          <w:p>
-            <w:pPr>
-              <w:pStyle w:val="a4"/>
-              <w:ind w:rightChars="100" w:right="200"/>
-              <w:rPr>
-                <w:rFonts w:eastAsiaTheme="minorHAnsi" w:cs="굴림"/>
-                <w:b/>
-                <w:kern w:val="0"/>
-                <w:sz w:val="22"/>
-              </w:rPr>
-            </w:pPr>
-          </w:p>
-          <w:p>
-            <w:pPr>
-              <w:ind w:rightChars="100" w:right="200"/>
-              <w:rPr>
-                <w:rFonts w:eastAsia="맑은 고딕" w:cs="굴림"/>
-                <w:sz w:val="22"/>
-              </w:rPr>
-            </w:pPr>
-          </w:p>
-          <w:p>
-            <w:pPr>
-              <w:ind w:rightChars="100" w:right="200"/>
-              <w:rPr>
-                <w:rFonts w:eastAsia="맑은 고딕" w:cs="굴림"/>
-                <w:sz w:val="22"/>
-              </w:rPr>
-            </w:pPr>
-          </w:p>
-          <w:p>
-            <w:pPr>
-              <w:ind w:rightChars="100" w:right="200"/>
-              <w:rPr>
-                <w:rFonts w:eastAsia="맑은 고딕" w:cs="굴림"/>
-                <w:sz w:val="22"/>
-              </w:rPr>
-            </w:pPr>
-          </w:p>
-          <w:p>
-            <w:pPr>
-              <w:ind w:rightChars="100" w:right="200"/>
-              <w:rPr>
-                <w:rFonts w:eastAsia="맑은 고딕" w:cs="굴림"/>
-                <w:sz w:val="22"/>
-              </w:rPr>
-            </w:pPr>
-          </w:p>
-          <w:p>
-            <w:pPr>
-              <w:ind w:rightChars="100" w:right="200"/>
-              <w:rPr>
-                <w:rFonts w:eastAsia="맑은 고딕" w:cs="굴림"/>
-                <w:sz w:val="22"/>
-              </w:rPr>
-            </w:pPr>
-          </w:p>
-          <w:p>
-            <w:pPr>
-              <w:ind w:rightChars="100" w:right="200"/>
-              <w:rPr>
-                <w:rFonts w:eastAsia="맑은 고딕" w:cs="굴림"/>
-                <w:sz w:val="22"/>
-              </w:rPr>
-            </w:pPr>
-          </w:p>
-          <w:p>
-            <w:pPr>
-              <w:ind w:rightChars="100" w:right="200"/>
-              <w:rPr>
-                <w:rFonts w:eastAsia="맑은 고딕" w:cs="굴림"/>
-                <w:sz w:val="22"/>
-              </w:rPr>
-            </w:pPr>
-          </w:p>
-          <w:p>
-            <w:pPr>
-              <w:ind w:rightChars="100" w:right="200"/>
-              <w:rPr>
-                <w:rFonts w:eastAsia="맑은 고딕" w:cs="굴림"/>
-                <w:sz w:val="22"/>
-              </w:rPr>
-            </w:pPr>
-          </w:p>
-          <w:p>
-            <w:pPr>
-              <w:ind w:rightChars="100" w:right="200"/>
-              <w:rPr>
-                <w:rFonts w:eastAsia="맑은 고딕" w:cs="굴림"/>
-                <w:sz w:val="22"/>
-              </w:rPr>
-            </w:pPr>
-          </w:p>
-          <w:p>
-            <w:pPr>
-              <w:ind w:rightChars="100" w:right="200"/>
-              <w:rPr>
-                <w:rFonts w:eastAsia="맑은 고딕" w:cs="굴림"/>
-                <w:sz w:val="22"/>
-              </w:rPr>
-            </w:pPr>
-          </w:p>
-          <w:p>
-            <w:pPr>
               <w:ind w:rightChars="100" w:right="200"/>
               <w:rPr>
                 <w:rFonts w:eastAsia="맑은 고딕" w:cs="굴림"/>
@@ -8584,6 +5538,46 @@
       <w:pPr>
         <w:rPr>
           <w:rFonts w:eastAsia="맑은 고딕" w:cs="굴림"/>
+          <w:b/>
+          <w:color w:val="000000"/>
+          <w:sz w:val="6"/>
+        </w:rPr>
+      </w:pPr>
+    </w:p>
+    <w:p>
+      <w:pPr>
+        <w:rPr>
+          <w:rFonts w:eastAsia="맑은 고딕" w:cs="굴림"/>
+          <w:b/>
+          <w:color w:val="000000"/>
+          <w:sz w:val="6"/>
+        </w:rPr>
+      </w:pPr>
+    </w:p>
+    <w:p>
+      <w:pPr>
+        <w:rPr>
+          <w:rFonts w:eastAsia="맑은 고딕" w:cs="굴림"/>
+          <w:b/>
+          <w:color w:val="000000"/>
+          <w:sz w:val="6"/>
+        </w:rPr>
+      </w:pPr>
+    </w:p>
+    <w:p>
+      <w:pPr>
+        <w:rPr>
+          <w:rFonts w:eastAsia="맑은 고딕" w:cs="굴림"/>
+          <w:b/>
+          <w:color w:val="000000"/>
+          <w:sz w:val="6"/>
+        </w:rPr>
+      </w:pPr>
+    </w:p>
+    <w:p>
+      <w:pPr>
+        <w:rPr>
+          <w:rFonts w:eastAsia="맑은 고딕" w:cs="굴림" w:hint="eastAsia"/>
           <w:b/>
           <w:color w:val="000000"/>
           <w:sz w:val="6"/>
@@ -8777,15 +5771,6 @@
                 <w:sz w:val="22"/>
               </w:rPr>
             </w:pPr>
-            <w:r>
-              <w:rPr>
-                <w:rFonts w:eastAsiaTheme="minorHAnsi"/>
-                <w:color w:val="000000"/>
-                <w:kern w:val="0"/>
-                <w:sz w:val="22"/>
-              </w:rPr>
-              <w:t>NICE Group Ware (그룹웨어)</w:t>
-            </w:r>
           </w:p>
         </w:tc>
       </w:tr>
@@ -8837,6 +5822,7 @@
                 <w:sz w:val="24"/>
                 <w:szCs w:val="24"/>
               </w:rPr>
+              <w:lastRenderedPageBreak/>
               <w:t>기간</w:t>
             </w:r>
           </w:p>
@@ -8870,123 +5856,6 @@
                 <w:sz w:val="22"/>
               </w:rPr>
             </w:pPr>
-            <w:r>
-              <w:rPr>
-                <w:rFonts w:eastAsiaTheme="minorHAnsi"/>
-                <w:color w:val="000000"/>
-                <w:kern w:val="0"/>
-                <w:sz w:val="22"/>
-              </w:rPr>
-              <w:t>2</w:t>
-            </w:r>
-            <w:r>
-              <w:rPr>
-                <w:rFonts w:eastAsiaTheme="minorHAnsi" w:hint="eastAsia"/>
-                <w:color w:val="000000"/>
-                <w:kern w:val="0"/>
-                <w:sz w:val="22"/>
-              </w:rPr>
-              <w:t>6</w:t>
-            </w:r>
-            <w:r>
-              <w:rPr>
-                <w:rFonts w:eastAsiaTheme="minorHAnsi"/>
-                <w:color w:val="000000"/>
-                <w:kern w:val="0"/>
-                <w:sz w:val="22"/>
-              </w:rPr>
-              <w:t>.</w:t>
-            </w:r>
-            <w:r>
-              <w:rPr>
-                <w:rFonts w:eastAsiaTheme="minorHAnsi" w:hint="eastAsia"/>
-                <w:color w:val="000000"/>
-                <w:kern w:val="0"/>
-                <w:sz w:val="22"/>
-              </w:rPr>
-              <w:t>0</w:t>
-            </w:r>
-            <w:r>
-              <w:rPr>
-                <w:rFonts w:eastAsiaTheme="minorHAnsi" w:hint="eastAsia"/>
-                <w:color w:val="000000"/>
-                <w:kern w:val="0"/>
-                <w:sz w:val="22"/>
-              </w:rPr>
-              <w:t>5</w:t>
-            </w:r>
-            <w:r>
-              <w:rPr>
-                <w:rFonts w:eastAsiaTheme="minorHAnsi"/>
-                <w:color w:val="000000"/>
-                <w:kern w:val="0"/>
-                <w:sz w:val="22"/>
-              </w:rPr>
-              <w:t>.</w:t>
-            </w:r>
-            <w:r>
-              <w:rPr>
-                <w:rFonts w:eastAsiaTheme="minorHAnsi" w:hint="eastAsia"/>
-                <w:color w:val="000000"/>
-                <w:kern w:val="0"/>
-                <w:sz w:val="22"/>
-              </w:rPr>
-              <w:t>01</w:t>
-            </w:r>
-            <w:r>
-              <w:rPr>
-                <w:rFonts w:eastAsiaTheme="minorHAnsi"/>
-                <w:color w:val="000000"/>
-                <w:kern w:val="0"/>
-                <w:sz w:val="22"/>
-              </w:rPr>
-              <w:t>~2</w:t>
-            </w:r>
-            <w:r>
-              <w:rPr>
-                <w:rFonts w:eastAsiaTheme="minorHAnsi" w:hint="eastAsia"/>
-                <w:color w:val="000000"/>
-                <w:kern w:val="0"/>
-                <w:sz w:val="22"/>
-              </w:rPr>
-              <w:t>6</w:t>
-            </w:r>
-            <w:r>
-              <w:rPr>
-                <w:rFonts w:eastAsiaTheme="minorHAnsi"/>
-                <w:color w:val="000000"/>
-                <w:kern w:val="0"/>
-                <w:sz w:val="22"/>
-              </w:rPr>
-              <w:t>.</w:t>
-            </w:r>
-            <w:r>
-              <w:rPr>
-                <w:rFonts w:eastAsiaTheme="minorHAnsi" w:hint="eastAsia"/>
-                <w:color w:val="000000"/>
-                <w:kern w:val="0"/>
-                <w:sz w:val="22"/>
-              </w:rPr>
-              <w:t>0</w:t>
-            </w:r>
-            <w:r>
-              <w:rPr>
-                <w:rFonts w:eastAsiaTheme="minorHAnsi" w:hint="eastAsia"/>
-                <w:color w:val="000000"/>
-                <w:kern w:val="0"/>
-                <w:sz w:val="22"/>
-              </w:rPr>
-              <w:t>6.05</w:t>
-            </w:r>
-            <w:r>
-              <w:rPr>
-                <w:rFonts w:eastAsiaTheme="minorHAnsi"/>
-                <w:color w:val="000000"/>
-                <w:kern w:val="0"/>
-                <w:sz w:val="22"/>
-              </w:rPr>
-              <w:t xml:space="preserve"> (5주)</w:t>
-            </w:r>
           </w:p>
         </w:tc>
       </w:tr>
@@ -9084,185 +5953,7 @@
               <w:right w:w="99" w:type="dxa"/>
             </w:tcMar>
             <w:vAlign w:val="center"/>
-            <w:hideMark/>
-          </w:tcPr>
-          <w:p>
-            <w:pPr>
-              <w:pStyle w:val="1c"/>
-              <w:spacing w:before="0" w:beforeAutospacing="0" w:after="0" w:afterAutospacing="0"/>
-              <w:rPr>
-                <w:rFonts w:asciiTheme="minorHAnsi" w:eastAsiaTheme="minorHAnsi" w:hAnsiTheme="minorHAnsi"/>
-                <w:color w:val="000000"/>
-              </w:rPr>
-            </w:pPr>
-            <w:r>
-              <w:rPr>
-                <w:rFonts w:asciiTheme="minorHAnsi" w:eastAsiaTheme="minorHAnsi" w:hAnsiTheme="minorHAnsi" w:cs="Arial"/>
-                <w:color w:val="000000"/>
-                <w:sz w:val="22"/>
-                <w:szCs w:val="22"/>
-              </w:rPr>
-              <w:t>- OS: Windows 10</w:t>
-            </w:r>
-          </w:p>
-          <w:p>
-            <w:pPr>
-              <w:pStyle w:val="1c"/>
-              <w:spacing w:before="0" w:beforeAutospacing="0" w:after="0" w:afterAutospacing="0"/>
-              <w:rPr>
-                <w:rFonts w:asciiTheme="minorHAnsi" w:eastAsiaTheme="minorHAnsi" w:hAnsiTheme="minorHAnsi"/>
-                <w:color w:val="000000"/>
-              </w:rPr>
-            </w:pPr>
-            <w:r>
-              <w:rPr>
-                <w:rFonts w:asciiTheme="minorHAnsi" w:eastAsiaTheme="minorHAnsi" w:hAnsiTheme="minorHAnsi" w:cs="Arial"/>
-                <w:color w:val="000000"/>
-                <w:sz w:val="22"/>
-                <w:szCs w:val="22"/>
-              </w:rPr>
-              <w:t>- Database: Oracle11</w:t>
-            </w:r>
-          </w:p>
-          <w:p>
-            <w:pPr>
-              <w:pStyle w:val="1c"/>
-              <w:spacing w:before="0" w:beforeAutospacing="0" w:after="0" w:afterAutospacing="0"/>
-              <w:ind w:left="220" w:hangingChars="100" w:hanging="220"/>
-              <w:rPr>
-                <w:rFonts w:asciiTheme="minorHAnsi" w:eastAsiaTheme="minorHAnsi" w:hAnsiTheme="minorHAnsi"/>
-                <w:color w:val="000000"/>
-              </w:rPr>
-            </w:pPr>
-            <w:r>
-              <w:rPr>
-                <w:rFonts w:asciiTheme="minorHAnsi" w:eastAsiaTheme="minorHAnsi" w:hAnsiTheme="minorHAnsi" w:cs="Arial"/>
-                <w:color w:val="000000"/>
-                <w:sz w:val="22"/>
-                <w:szCs w:val="22"/>
-              </w:rPr>
-              <w:t>- Service System: Apache Tomcat, Spring4(Tiles/Security/Websocket), Node.js(WebRTC), MyBatis, Flask </w:t>
-            </w:r>
-          </w:p>
-          <w:p>
-            <w:pPr>
-              <w:pStyle w:val="1c"/>
-              <w:spacing w:before="0" w:beforeAutospacing="0" w:after="0" w:afterAutospacing="0"/>
-              <w:rPr>
-                <w:rFonts w:asciiTheme="minorHAnsi" w:eastAsiaTheme="minorHAnsi" w:hAnsiTheme="minorHAnsi"/>
-                <w:color w:val="000000"/>
-              </w:rPr>
-            </w:pPr>
-            <w:r>
-              <w:rPr>
-                <w:rFonts w:asciiTheme="minorHAnsi" w:eastAsiaTheme="minorHAnsi" w:hAnsiTheme="minorHAnsi" w:cs="Arial"/>
-                <w:color w:val="000000"/>
-                <w:sz w:val="22"/>
-                <w:szCs w:val="22"/>
-              </w:rPr>
-              <w:t>- 언어: JAVA, JSP, HTML5, CSS3, Javascript, Python, SQL, JQuery (Ajax)</w:t>
-            </w:r>
-          </w:p>
-          <w:p>
-            <w:pPr>
-              <w:pStyle w:val="1c"/>
-              <w:spacing w:before="0" w:beforeAutospacing="0" w:after="0" w:afterAutospacing="0"/>
-              <w:ind w:left="220" w:hangingChars="100" w:hanging="220"/>
-              <w:rPr>
-                <w:rFonts w:asciiTheme="minorHAnsi" w:eastAsiaTheme="minorHAnsi" w:hAnsiTheme="minorHAnsi"/>
-                <w:color w:val="000000"/>
-              </w:rPr>
-            </w:pPr>
-            <w:r>
-              <w:rPr>
-                <w:rFonts w:asciiTheme="minorHAnsi" w:eastAsiaTheme="minorHAnsi" w:hAnsiTheme="minorHAnsi" w:cs="Arial"/>
-                <w:color w:val="000000"/>
-                <w:sz w:val="22"/>
-                <w:szCs w:val="22"/>
-              </w:rPr>
-              <w:t>- Tool: Eclipse, Sql developer, DBeaver, ERMaster, Visual Studio Code, Json, StarUML, ERCloud, draw.io, Jupyter Notebook</w:t>
-            </w:r>
-          </w:p>
-          <w:p>
-            <w:pPr>
-              <w:pStyle w:val="1c"/>
-              <w:spacing w:before="0" w:beforeAutospacing="0" w:after="0" w:afterAutospacing="0"/>
-              <w:rPr>
-                <w:rFonts w:asciiTheme="minorHAnsi" w:eastAsiaTheme="minorHAnsi" w:hAnsiTheme="minorHAnsi" w:cs="Arial"/>
-                <w:color w:val="000000"/>
-                <w:sz w:val="22"/>
-                <w:szCs w:val="22"/>
-              </w:rPr>
-            </w:pPr>
-            <w:r>
-              <w:rPr>
-                <w:rFonts w:asciiTheme="minorHAnsi" w:eastAsiaTheme="minorHAnsi" w:hAnsiTheme="minorHAnsi" w:cs="Arial"/>
-                <w:color w:val="000000"/>
-                <w:sz w:val="22"/>
-                <w:szCs w:val="22"/>
-              </w:rPr>
-              <w:t xml:space="preserve">- 오픈 API: FullCalendar, Kakao Map, 챗봇(DialogFlow), javax.mail API, </w:t>
-            </w:r>
-          </w:p>
-          <w:p>
-            <w:pPr>
-              <w:pStyle w:val="1c"/>
-              <w:spacing w:before="0" w:beforeAutospacing="0" w:after="0" w:afterAutospacing="0"/>
-              <w:ind w:leftChars="110" w:left="220"/>
-              <w:rPr>
-                <w:rFonts w:asciiTheme="minorHAnsi" w:eastAsiaTheme="minorHAnsi" w:hAnsiTheme="minorHAnsi"/>
-                <w:color w:val="000000"/>
-              </w:rPr>
-            </w:pPr>
-            <w:r>
-              <w:rPr>
-                <w:rFonts w:asciiTheme="minorHAnsi" w:eastAsiaTheme="minorHAnsi" w:hAnsiTheme="minorHAnsi" w:cs="Arial"/>
-                <w:color w:val="000000"/>
-                <w:sz w:val="22"/>
-                <w:szCs w:val="22"/>
-              </w:rPr>
-              <w:t>Push API, Notification API, Folium, summer note API, Peer.js, Chart.js, QRcode.js, jsQR</w:t>
-            </w:r>
-          </w:p>
-          <w:p>
-            <w:pPr>
-              <w:pStyle w:val="1c"/>
-              <w:spacing w:before="0" w:beforeAutospacing="0" w:after="0" w:afterAutospacing="0"/>
-              <w:ind w:firstLineChars="100" w:firstLine="220"/>
-              <w:rPr>
-                <w:rFonts w:asciiTheme="minorHAnsi" w:eastAsiaTheme="minorHAnsi" w:hAnsiTheme="minorHAnsi"/>
-                <w:color w:val="000000"/>
-              </w:rPr>
-            </w:pPr>
-            <w:r>
-              <w:rPr>
-                <w:rFonts w:asciiTheme="minorHAnsi" w:eastAsiaTheme="minorHAnsi" w:hAnsiTheme="minorHAnsi" w:cs="Arial"/>
-                <w:color w:val="000000"/>
-                <w:sz w:val="22"/>
-                <w:szCs w:val="22"/>
-              </w:rPr>
-              <w:t>Socket.io, Selenium API, BeautifulSoup API</w:t>
-            </w:r>
-          </w:p>
-          <w:p>
-            <w:pPr>
-              <w:pStyle w:val="1c"/>
-              <w:spacing w:before="0" w:beforeAutospacing="0" w:after="0" w:afterAutospacing="0"/>
-              <w:rPr>
-                <w:rFonts w:asciiTheme="minorHAnsi" w:eastAsiaTheme="minorHAnsi" w:hAnsiTheme="minorHAnsi"/>
-                <w:color w:val="000000"/>
-              </w:rPr>
-            </w:pPr>
-            <w:r>
-              <w:rPr>
-                <w:rFonts w:asciiTheme="minorHAnsi" w:eastAsiaTheme="minorHAnsi" w:hAnsiTheme="minorHAnsi" w:cs="Arial"/>
-                <w:color w:val="000000"/>
-                <w:sz w:val="22"/>
-                <w:szCs w:val="22"/>
-              </w:rPr>
-              <w:t>- 형상관리: Git/Github, Google sheet, Slack</w:t>
-            </w:r>
-          </w:p>
+          </w:tcPr>
           <w:p>
             <w:pPr>
               <w:jc w:val="left"/>
@@ -9270,14 +5961,6 @@
                 <w:sz w:val="22"/>
               </w:rPr>
             </w:pPr>
-            <w:r>
-              <w:rPr>
-                <w:rFonts w:eastAsiaTheme="minorHAnsi" w:cs="Arial"/>
-                <w:color w:val="000000"/>
-                <w:sz w:val="22"/>
-              </w:rPr>
-              <w:t>- UI/UX 프레임워크: Bootstrap</w:t>
-            </w:r>
           </w:p>
         </w:tc>
       </w:tr>
@@ -9349,33 +6032,7 @@
               <w:right w:w="99" w:type="dxa"/>
             </w:tcMar>
             <w:vAlign w:val="center"/>
-            <w:hideMark/>
-          </w:tcPr>
-          <w:p>
-            <w:pPr>
-              <w:pStyle w:val="1c"/>
-              <w:wordWrap w:val="0"/>
-              <w:autoSpaceDE w:val="0"/>
-              <w:autoSpaceDN w:val="0"/>
-              <w:spacing w:before="0" w:beforeAutospacing="0" w:after="0" w:afterAutospacing="0"/>
-              <w:jc w:val="both"/>
-              <w:rPr>
-                <w:rFonts w:asciiTheme="minorHAnsi" w:eastAsiaTheme="minorHAnsi" w:hAnsiTheme="minorHAnsi" w:cs="Arial"/>
-                <w:color w:val="000000"/>
-                <w:sz w:val="22"/>
-                <w:szCs w:val="22"/>
-              </w:rPr>
-            </w:pPr>
-            <w:r>
-              <w:rPr>
-                <w:rFonts w:asciiTheme="minorHAnsi" w:eastAsiaTheme="minorHAnsi" w:hAnsiTheme="minorHAnsi" w:cs="Arial"/>
-                <w:color w:val="000000"/>
-                <w:sz w:val="22"/>
-                <w:szCs w:val="22"/>
-              </w:rPr>
-              <w:t>비대면 진료서비스 및  통합 병원서비스 지원를 통하여</w:t>
-            </w:r>
-          </w:p>
+          </w:tcPr>
           <w:p>
             <w:pPr>
               <w:widowControl/>
@@ -9390,14 +6047,6 @@
                 <w:sz w:val="22"/>
               </w:rPr>
             </w:pPr>
-            <w:r>
-              <w:rPr>
-                <w:rFonts w:eastAsiaTheme="minorHAnsi" w:cs="Arial"/>
-                <w:color w:val="000000"/>
-                <w:sz w:val="22"/>
-              </w:rPr>
-              <w:t>병원을 이용하는 환자들에게 빠르고 안전한 병원진료서비스를 제공합니다.</w:t>
-            </w:r>
           </w:p>
         </w:tc>
       </w:tr>
@@ -9469,108 +6118,7 @@
               <w:right w:w="99" w:type="dxa"/>
             </w:tcMar>
             <w:vAlign w:val="center"/>
-            <w:hideMark/>
-          </w:tcPr>
-          <w:p>
-            <w:pPr>
-              <w:widowControl/>
-              <w:rPr>
-                <w:sz w:val="22"/>
-              </w:rPr>
-            </w:pPr>
-            <w:r>
-              <w:rPr>
-                <w:rFonts w:eastAsiaTheme="minorHAnsi" w:cs="굴림"/>
-                <w:color w:val="000000"/>
-                <w:kern w:val="0"/>
-                <w:sz w:val="22"/>
-              </w:rPr>
-              <w:t xml:space="preserve">- </w:t>
-            </w:r>
-            <w:r>
-              <w:rPr>
-                <w:sz w:val="22"/>
-              </w:rPr>
-              <w:t xml:space="preserve">Database 설계 및 SQL문 작성 </w:t>
-            </w:r>
-          </w:p>
-          <w:p>
-            <w:pPr>
-              <w:widowControl/>
-              <w:rPr>
-                <w:rFonts w:eastAsiaTheme="minorHAnsi" w:cs="굴림"/>
-                <w:color w:val="000000"/>
-                <w:kern w:val="0"/>
-                <w:sz w:val="22"/>
-              </w:rPr>
-            </w:pPr>
-            <w:r>
-              <w:rPr>
-                <w:sz w:val="22"/>
-                <w:shd w:val="clear" w:color="000000" w:fill="auto"/>
-              </w:rPr>
-              <w:t xml:space="preserve">- 관리자 페이지 구현 </w:t>
-            </w:r>
-          </w:p>
-          <w:p>
-            <w:pPr>
-              <w:widowControl/>
-              <w:rPr>
-                <w:rFonts w:eastAsiaTheme="minorHAnsi" w:cs="굴림"/>
-                <w:color w:val="000000"/>
-                <w:kern w:val="0"/>
-                <w:sz w:val="22"/>
-              </w:rPr>
-            </w:pPr>
-            <w:r>
-              <w:rPr>
-                <w:rFonts w:eastAsiaTheme="minorHAnsi" w:cs="굴림"/>
-                <w:color w:val="000000"/>
-                <w:kern w:val="0"/>
-                <w:sz w:val="22"/>
-              </w:rPr>
-              <w:t>- 일정관리 페이지 구현</w:t>
-            </w:r>
-          </w:p>
-          <w:p>
-            <w:pPr>
-              <w:widowControl/>
-              <w:rPr>
-                <w:rFonts w:eastAsiaTheme="minorHAnsi" w:cs="굴림"/>
-                <w:color w:val="000000"/>
-                <w:kern w:val="0"/>
-                <w:sz w:val="22"/>
-              </w:rPr>
-            </w:pPr>
-            <w:r>
-              <w:rPr>
-                <w:rFonts w:eastAsiaTheme="minorHAnsi" w:cs="굴림"/>
-                <w:color w:val="000000"/>
-                <w:kern w:val="0"/>
-                <w:sz w:val="22"/>
-              </w:rPr>
-              <w:t xml:space="preserve">- 페이지 구현에 필요한 로직과 JSP페이지 구현 </w:t>
-            </w:r>
-          </w:p>
-          <w:p>
-            <w:pPr>
-              <w:rPr>
-                <w:rFonts w:eastAsiaTheme="minorHAnsi" w:cs="굴림"/>
-                <w:color w:val="000000"/>
-                <w:kern w:val="0"/>
-                <w:sz w:val="22"/>
-              </w:rPr>
-            </w:pPr>
-            <w:r>
-              <w:rPr>
-                <w:rFonts w:eastAsiaTheme="minorHAnsi" w:cs="굴림"/>
-                <w:color w:val="000000"/>
-                <w:kern w:val="0"/>
-                <w:sz w:val="22"/>
-              </w:rPr>
-              <w:t>- Ajax와 카카오페이를 활용한 실시간 경매기능</w:t>
-            </w:r>
-          </w:p>
+          </w:tcPr>
           <w:p>
             <w:pPr>
               <w:rPr>
@@ -9579,116 +6127,6 @@
                 <w:sz w:val="22"/>
               </w:rPr>
             </w:pPr>
-            <w:r>
-              <w:rPr>
-                <w:rFonts w:eastAsia="맑은 고딕" w:cs="굴림"/>
-                <w:color w:val="000000"/>
-                <w:sz w:val="22"/>
-              </w:rPr>
-              <w:t>- React와 Spring Boot(MyBatis) 기반의 웹 구축</w:t>
-            </w:r>
-          </w:p>
-          <w:p>
-            <w:pPr>
-              <w:rPr>
-                <w:rFonts w:eastAsia="맑은 고딕" w:cs="굴림"/>
-                <w:color w:val="000000"/>
-                <w:sz w:val="22"/>
-              </w:rPr>
-            </w:pPr>
-            <w:r>
-              <w:rPr>
-                <w:rFonts w:eastAsia="맑은 고딕" w:cs="굴림"/>
-                <w:color w:val="000000"/>
-                <w:sz w:val="22"/>
-              </w:rPr>
-              <w:t>- MySQL을 활용한 데이터 모델링 및 테이블 관계 설정</w:t>
-            </w:r>
-          </w:p>
-          <w:p>
-            <w:pPr>
-              <w:rPr>
-                <w:rFonts w:eastAsia="맑은 고딕" w:cs="굴림"/>
-                <w:color w:val="000000"/>
-                <w:sz w:val="22"/>
-              </w:rPr>
-            </w:pPr>
-            <w:r>
-              <w:rPr>
-                <w:rFonts w:eastAsia="맑은 고딕" w:cs="굴림"/>
-                <w:color w:val="000000"/>
-                <w:sz w:val="22"/>
-              </w:rPr>
-              <w:t>- eXerd를 이용한 ERD 설계 및 정규화 적용</w:t>
-            </w:r>
-          </w:p>
-          <w:p>
-            <w:pPr>
-              <w:rPr>
-                <w:rFonts w:eastAsia="맑은 고딕" w:cs="굴림"/>
-                <w:color w:val="000000"/>
-                <w:sz w:val="22"/>
-              </w:rPr>
-            </w:pPr>
-            <w:r>
-              <w:rPr>
-                <w:rFonts w:eastAsia="맑은 고딕" w:cs="굴림"/>
-                <w:color w:val="000000"/>
-                <w:sz w:val="22"/>
-              </w:rPr>
-              <w:t xml:space="preserve">- 검색 및 인덱싱 시스템 구축 (ELK 스택) </w:t>
-            </w:r>
-          </w:p>
-          <w:p>
-            <w:pPr>
-              <w:rPr>
-                <w:rFonts w:eastAsia="맑은 고딕" w:cs="굴림"/>
-                <w:color w:val="000000"/>
-                <w:sz w:val="22"/>
-              </w:rPr>
-            </w:pPr>
-            <w:r>
-              <w:rPr>
-                <w:rFonts w:eastAsia="맑은 고딕" w:cs="굴림"/>
-                <w:color w:val="000000"/>
-                <w:sz w:val="22"/>
-              </w:rPr>
-              <w:t xml:space="preserve">- AWS EC2, Docker, Nginx를 활용한 배포 자동화 </w:t>
-            </w:r>
-          </w:p>
-          <w:p>
-            <w:pPr>
-              <w:rPr>
-                <w:rFonts w:eastAsia="맑은 고딕" w:cs="굴림"/>
-                <w:color w:val="000000"/>
-                <w:sz w:val="22"/>
-              </w:rPr>
-            </w:pPr>
-            <w:r>
-              <w:rPr>
-                <w:rFonts w:eastAsia="맑은 고딕" w:cs="굴림"/>
-                <w:color w:val="000000"/>
-                <w:sz w:val="22"/>
-              </w:rPr>
-              <w:t xml:space="preserve">- GitHub Actions 및 Docker Hub를 이용한 CI/CD 환경 구축 </w:t>
-            </w:r>
-          </w:p>
-          <w:p>
-            <w:pPr>
-              <w:rPr>
-                <w:rFonts w:eastAsia="맑은 고딕" w:cs="굴림"/>
-                <w:color w:val="000000"/>
-                <w:sz w:val="22"/>
-              </w:rPr>
-            </w:pPr>
-            <w:r>
-              <w:rPr>
-                <w:rFonts w:eastAsia="맑은 고딕" w:cs="굴림"/>
-                <w:color w:val="000000"/>
-                <w:sz w:val="22"/>
-              </w:rPr>
-              <w:t>- Figma를 활용한 화면 설계</w:t>
-            </w:r>
           </w:p>
         </w:tc>
       </w:tr>
@@ -9770,55 +6208,6 @@
                 <w:sz w:val="22"/>
               </w:rPr>
             </w:pPr>
-            <w:r>
-              <w:rPr>
-                <w:rFonts w:eastAsiaTheme="minorHAnsi" w:cs="굴림"/>
-                <w:color w:val="000000"/>
-                <w:kern w:val="0"/>
-                <w:sz w:val="22"/>
-              </w:rPr>
-              <w:t>- 초기설계 및 DB의 중요성을 알 수 있었습니다.</w:t>
-            </w:r>
-          </w:p>
-          <w:p>
-            <w:pPr>
-              <w:widowControl/>
-              <w:rPr>
-                <w:rFonts w:eastAsiaTheme="minorHAnsi" w:cs="굴림"/>
-                <w:color w:val="000000"/>
-                <w:kern w:val="0"/>
-                <w:sz w:val="22"/>
-              </w:rPr>
-            </w:pPr>
-            <w:r>
-              <w:rPr>
-                <w:rFonts w:eastAsiaTheme="minorHAnsi" w:cs="굴림"/>
-                <w:color w:val="000000"/>
-                <w:kern w:val="0"/>
-                <w:sz w:val="22"/>
-              </w:rPr>
-              <w:t>-</w:t>
-            </w:r>
-          </w:p>
-          <w:p>
-            <w:pPr>
-              <w:widowControl/>
-              <w:rPr>
-                <w:rFonts w:eastAsiaTheme="minorHAnsi" w:cs="굴림"/>
-                <w:color w:val="000000"/>
-                <w:kern w:val="0"/>
-                <w:sz w:val="22"/>
-              </w:rPr>
-            </w:pPr>
-            <w:r>
-              <w:rPr>
-                <w:rFonts w:eastAsiaTheme="minorHAnsi" w:cs="굴림"/>
-                <w:color w:val="000000"/>
-                <w:kern w:val="0"/>
-                <w:sz w:val="22"/>
-              </w:rPr>
-              <w:t>-</w:t>
-            </w:r>
           </w:p>
         </w:tc>
       </w:tr>
@@ -9890,7 +6279,6 @@
               <w:right w:w="99" w:type="dxa"/>
             </w:tcMar>
             <w:vAlign w:val="center"/>
-            <w:hideMark/>
           </w:tcPr>
           <w:p>
             <w:pPr>
@@ -9905,42 +6293,6 @@
                 <w:sz w:val="22"/>
               </w:rPr>
             </w:pPr>
-            <w:r>
-              <w:rPr>
-                <w:rFonts w:ascii="맑은 고딕" w:eastAsia="맑은 고딕" w:hAnsi="맑은 고딕"/>
-                <w:b/>
-                <w:bCs/>
-                <w:sz w:val="22"/>
-              </w:rPr>
-              <w:t>※ 프로젝트는 구축 중입니다</w:t>
-            </w:r>
-            <w:r>
-              <w:rPr>
-                <w:rFonts w:ascii="맑은 고딕" w:eastAsia="맑은 고딕" w:hAnsi="맑은 고딕" w:hint="eastAsia"/>
-                <w:b/>
-                <w:bCs/>
-                <w:sz w:val="22"/>
-              </w:rPr>
-              <w:t>. (</w:t>
-            </w:r>
-            <w:r>
-              <w:rPr>
-                <w:rFonts w:ascii="맑은 고딕" w:eastAsia="맑은 고딕" w:hAnsi="맑은 고딕"/>
-                <w:b/>
-                <w:bCs/>
-                <w:sz w:val="22"/>
-              </w:rPr>
-              <w:t>완성 후 포트폴리오 파일첨부</w:t>
-            </w:r>
-            <w:r>
-              <w:rPr>
-                <w:rFonts w:ascii="맑은 고딕" w:eastAsia="맑은 고딕" w:hAnsi="맑은 고딕" w:hint="eastAsia"/>
-                <w:b/>
-                <w:bCs/>
-                <w:sz w:val="22"/>
-              </w:rPr>
-              <w:t>)</w:t>
-            </w:r>
           </w:p>
         </w:tc>
       </w:tr>
@@ -10764,6 +7116,24 @@
         <w:jc w:val="left"/>
         <w:rPr>
           <w:rFonts w:eastAsiaTheme="minorHAnsi" w:cs="굴림"/>
+          <w:b/>
+          <w:bCs/>
+          <w:color w:val="000000"/>
+          <w:kern w:val="0"/>
+          <w:sz w:val="2"/>
+          <w:szCs w:val="10"/>
+        </w:rPr>
+      </w:pPr>
+    </w:p>
+    <w:p>
+      <w:pPr>
+        <w:widowControl/>
+        <w:wordWrap/>
+        <w:autoSpaceDE/>
+        <w:autoSpaceDN/>
+        <w:jc w:val="left"/>
+        <w:rPr>
+          <w:rFonts w:eastAsiaTheme="minorHAnsi" w:cs="굴림" w:hint="eastAsia"/>
           <w:b/>
           <w:bCs/>
           <w:color w:val="000000"/>
@@ -11016,30 +7386,6 @@
                 <w:sz w:val="22"/>
               </w:rPr>
             </w:pPr>
-            <w:r>
-              <w:rPr>
-                <w:rFonts w:cs="굴림"/>
-                <w:color w:val="000000"/>
-                <w:sz w:val="22"/>
-              </w:rPr>
-              <w:t>00.00.00~00.00.</w:t>
-            </w:r>
-            <w:r>
-              <w:rPr>
-                <w:rFonts w:cs="굴림" w:hint="eastAsia"/>
-                <w:color w:val="000000"/>
-                <w:sz w:val="22"/>
-              </w:rPr>
-              <w:t>0</w:t>
-            </w:r>
-            <w:r>
-              <w:rPr>
-                <w:rFonts w:cs="굴림"/>
-                <w:color w:val="000000"/>
-                <w:sz w:val="22"/>
-              </w:rPr>
-              <w:t>0 (  주)</w:t>
-            </w:r>
           </w:p>
         </w:tc>
       </w:tr>
@@ -11138,185 +7484,7 @@
               <w:right w:w="99" w:type="dxa"/>
             </w:tcMar>
             <w:vAlign w:val="center"/>
-            <w:hideMark/>
-          </w:tcPr>
-          <w:p>
-            <w:pPr>
-              <w:pStyle w:val="1c"/>
-              <w:spacing w:before="0" w:beforeAutospacing="0" w:after="0" w:afterAutospacing="0"/>
-              <w:rPr>
-                <w:rFonts w:asciiTheme="minorHAnsi" w:eastAsiaTheme="minorHAnsi" w:hAnsiTheme="minorHAnsi"/>
-                <w:color w:val="000000"/>
-              </w:rPr>
-            </w:pPr>
-            <w:r>
-              <w:rPr>
-                <w:rFonts w:asciiTheme="minorHAnsi" w:eastAsiaTheme="minorHAnsi" w:hAnsiTheme="minorHAnsi" w:cs="Arial"/>
-                <w:color w:val="000000"/>
-                <w:sz w:val="22"/>
-                <w:szCs w:val="22"/>
-              </w:rPr>
-              <w:t>- OS: Windows 10</w:t>
-            </w:r>
-          </w:p>
-          <w:p>
-            <w:pPr>
-              <w:pStyle w:val="1c"/>
-              <w:spacing w:before="0" w:beforeAutospacing="0" w:after="0" w:afterAutospacing="0"/>
-              <w:rPr>
-                <w:rFonts w:asciiTheme="minorHAnsi" w:eastAsiaTheme="minorHAnsi" w:hAnsiTheme="minorHAnsi"/>
-                <w:color w:val="000000"/>
-              </w:rPr>
-            </w:pPr>
-            <w:r>
-              <w:rPr>
-                <w:rFonts w:asciiTheme="minorHAnsi" w:eastAsiaTheme="minorHAnsi" w:hAnsiTheme="minorHAnsi" w:cs="Arial"/>
-                <w:color w:val="000000"/>
-                <w:sz w:val="22"/>
-                <w:szCs w:val="22"/>
-              </w:rPr>
-              <w:t>- Database: Oracle11</w:t>
-            </w:r>
-          </w:p>
-          <w:p>
-            <w:pPr>
-              <w:pStyle w:val="1c"/>
-              <w:spacing w:before="0" w:beforeAutospacing="0" w:after="0" w:afterAutospacing="0"/>
-              <w:ind w:left="220" w:hangingChars="100" w:hanging="220"/>
-              <w:rPr>
-                <w:rFonts w:asciiTheme="minorHAnsi" w:eastAsiaTheme="minorHAnsi" w:hAnsiTheme="minorHAnsi"/>
-                <w:color w:val="000000"/>
-              </w:rPr>
-            </w:pPr>
-            <w:r>
-              <w:rPr>
-                <w:rFonts w:asciiTheme="minorHAnsi" w:eastAsiaTheme="minorHAnsi" w:hAnsiTheme="minorHAnsi" w:cs="Arial"/>
-                <w:color w:val="000000"/>
-                <w:sz w:val="22"/>
-                <w:szCs w:val="22"/>
-              </w:rPr>
-              <w:t>- Service System: Apache Tomcat, Spring4(Tiles/Security/Websocket), Node.js(WebRTC), MyBatis, Flask </w:t>
-            </w:r>
-          </w:p>
-          <w:p>
-            <w:pPr>
-              <w:pStyle w:val="1c"/>
-              <w:spacing w:before="0" w:beforeAutospacing="0" w:after="0" w:afterAutospacing="0"/>
-              <w:rPr>
-                <w:rFonts w:asciiTheme="minorHAnsi" w:eastAsiaTheme="minorHAnsi" w:hAnsiTheme="minorHAnsi"/>
-                <w:color w:val="000000"/>
-              </w:rPr>
-            </w:pPr>
-            <w:r>
-              <w:rPr>
-                <w:rFonts w:asciiTheme="minorHAnsi" w:eastAsiaTheme="minorHAnsi" w:hAnsiTheme="minorHAnsi" w:cs="Arial"/>
-                <w:color w:val="000000"/>
-                <w:sz w:val="22"/>
-                <w:szCs w:val="22"/>
-              </w:rPr>
-              <w:t>- 언어: JAVA, JSP, HTML5, CSS3, Javascript, Python, SQL, JQuery (Ajax)</w:t>
-            </w:r>
-          </w:p>
-          <w:p>
-            <w:pPr>
-              <w:pStyle w:val="1c"/>
-              <w:spacing w:before="0" w:beforeAutospacing="0" w:after="0" w:afterAutospacing="0"/>
-              <w:ind w:left="220" w:hangingChars="100" w:hanging="220"/>
-              <w:rPr>
-                <w:rFonts w:asciiTheme="minorHAnsi" w:eastAsiaTheme="minorHAnsi" w:hAnsiTheme="minorHAnsi"/>
-                <w:color w:val="000000"/>
-              </w:rPr>
-            </w:pPr>
-            <w:r>
-              <w:rPr>
-                <w:rFonts w:asciiTheme="minorHAnsi" w:eastAsiaTheme="minorHAnsi" w:hAnsiTheme="minorHAnsi" w:cs="Arial"/>
-                <w:color w:val="000000"/>
-                <w:sz w:val="22"/>
-                <w:szCs w:val="22"/>
-              </w:rPr>
-              <w:t>- Tool: Eclipse, Sql developer, DBeaver, ERMaster, Visual Studio Code, Json, StarUML, ERCloud, draw.io, Jupyter Notebook</w:t>
-            </w:r>
-          </w:p>
-          <w:p>
-            <w:pPr>
-              <w:pStyle w:val="1c"/>
-              <w:spacing w:before="0" w:beforeAutospacing="0" w:after="0" w:afterAutospacing="0"/>
-              <w:rPr>
-                <w:rFonts w:asciiTheme="minorHAnsi" w:eastAsiaTheme="minorHAnsi" w:hAnsiTheme="minorHAnsi" w:cs="Arial"/>
-                <w:color w:val="000000"/>
-                <w:sz w:val="22"/>
-                <w:szCs w:val="22"/>
-              </w:rPr>
-            </w:pPr>
-            <w:r>
-              <w:rPr>
-                <w:rFonts w:asciiTheme="minorHAnsi" w:eastAsiaTheme="minorHAnsi" w:hAnsiTheme="minorHAnsi" w:cs="Arial"/>
-                <w:color w:val="000000"/>
-                <w:sz w:val="22"/>
-                <w:szCs w:val="22"/>
-              </w:rPr>
-              <w:t xml:space="preserve">- 오픈 API: FullCalendar, Kakao Map, 챗봇(DialogFlow), javax.mail API, </w:t>
-            </w:r>
-          </w:p>
-          <w:p>
-            <w:pPr>
-              <w:pStyle w:val="1c"/>
-              <w:spacing w:before="0" w:beforeAutospacing="0" w:after="0" w:afterAutospacing="0"/>
-              <w:ind w:leftChars="110" w:left="220"/>
-              <w:rPr>
-                <w:rFonts w:asciiTheme="minorHAnsi" w:eastAsiaTheme="minorHAnsi" w:hAnsiTheme="minorHAnsi"/>
-                <w:color w:val="000000"/>
-              </w:rPr>
-            </w:pPr>
-            <w:r>
-              <w:rPr>
-                <w:rFonts w:asciiTheme="minorHAnsi" w:eastAsiaTheme="minorHAnsi" w:hAnsiTheme="minorHAnsi" w:cs="Arial"/>
-                <w:color w:val="000000"/>
-                <w:sz w:val="22"/>
-                <w:szCs w:val="22"/>
-              </w:rPr>
-              <w:t>Push API, Notification API, Folium, summer note API, Peer.js, Chart.js, QRcode.js, jsQR</w:t>
-            </w:r>
-          </w:p>
-          <w:p>
-            <w:pPr>
-              <w:pStyle w:val="1c"/>
-              <w:spacing w:before="0" w:beforeAutospacing="0" w:after="0" w:afterAutospacing="0"/>
-              <w:ind w:firstLineChars="100" w:firstLine="220"/>
-              <w:rPr>
-                <w:rFonts w:asciiTheme="minorHAnsi" w:eastAsiaTheme="minorHAnsi" w:hAnsiTheme="minorHAnsi"/>
-                <w:color w:val="000000"/>
-              </w:rPr>
-            </w:pPr>
-            <w:r>
-              <w:rPr>
-                <w:rFonts w:asciiTheme="minorHAnsi" w:eastAsiaTheme="minorHAnsi" w:hAnsiTheme="minorHAnsi" w:cs="Arial"/>
-                <w:color w:val="000000"/>
-                <w:sz w:val="22"/>
-                <w:szCs w:val="22"/>
-              </w:rPr>
-              <w:t>Socket.io, Selenium API, BeautifulSoup API</w:t>
-            </w:r>
-          </w:p>
-          <w:p>
-            <w:pPr>
-              <w:pStyle w:val="1c"/>
-              <w:spacing w:before="0" w:beforeAutospacing="0" w:after="0" w:afterAutospacing="0"/>
-              <w:rPr>
-                <w:rFonts w:asciiTheme="minorHAnsi" w:eastAsiaTheme="minorHAnsi" w:hAnsiTheme="minorHAnsi"/>
-                <w:color w:val="000000"/>
-              </w:rPr>
-            </w:pPr>
-            <w:r>
-              <w:rPr>
-                <w:rFonts w:asciiTheme="minorHAnsi" w:eastAsiaTheme="minorHAnsi" w:hAnsiTheme="minorHAnsi" w:cs="Arial"/>
-                <w:color w:val="000000"/>
-                <w:sz w:val="22"/>
-                <w:szCs w:val="22"/>
-              </w:rPr>
-              <w:t>- 형상관리: Git/Github, Google sheet, Slack</w:t>
-            </w:r>
-          </w:p>
+          </w:tcPr>
           <w:p>
             <w:pPr>
               <w:jc w:val="left"/>
@@ -11324,14 +7492,6 @@
                 <w:sz w:val="22"/>
               </w:rPr>
             </w:pPr>
-            <w:r>
-              <w:rPr>
-                <w:rFonts w:eastAsiaTheme="minorHAnsi" w:cs="Arial"/>
-                <w:color w:val="000000"/>
-                <w:sz w:val="22"/>
-              </w:rPr>
-              <w:t>- UI/UX 프레임워크: Bootstrap</w:t>
-            </w:r>
           </w:p>
         </w:tc>
       </w:tr>
@@ -11404,33 +7564,7 @@
               <w:right w:w="99" w:type="dxa"/>
             </w:tcMar>
             <w:vAlign w:val="center"/>
-            <w:hideMark/>
-          </w:tcPr>
-          <w:p>
-            <w:pPr>
-              <w:pStyle w:val="1c"/>
-              <w:wordWrap w:val="0"/>
-              <w:autoSpaceDE w:val="0"/>
-              <w:autoSpaceDN w:val="0"/>
-              <w:spacing w:before="0" w:beforeAutospacing="0" w:after="0" w:afterAutospacing="0"/>
-              <w:jc w:val="both"/>
-              <w:rPr>
-                <w:rFonts w:asciiTheme="minorHAnsi" w:eastAsiaTheme="minorHAnsi" w:hAnsiTheme="minorHAnsi" w:cs="Arial"/>
-                <w:color w:val="000000"/>
-                <w:sz w:val="22"/>
-                <w:szCs w:val="22"/>
-              </w:rPr>
-            </w:pPr>
-            <w:r>
-              <w:rPr>
-                <w:rFonts w:asciiTheme="minorHAnsi" w:eastAsiaTheme="minorHAnsi" w:hAnsiTheme="minorHAnsi" w:cs="Arial"/>
-                <w:color w:val="000000"/>
-                <w:sz w:val="22"/>
-                <w:szCs w:val="22"/>
-              </w:rPr>
-              <w:t>코로나 시대에 비대면 진료서비스 및  통합 병원서비스 지원를 통하여</w:t>
-            </w:r>
-          </w:p>
+          </w:tcPr>
           <w:p>
             <w:pPr>
               <w:widowControl/>
@@ -11445,14 +7579,6 @@
                 <w:sz w:val="22"/>
               </w:rPr>
             </w:pPr>
-            <w:r>
-              <w:rPr>
-                <w:rFonts w:eastAsiaTheme="minorHAnsi" w:cs="Arial"/>
-                <w:color w:val="000000"/>
-                <w:sz w:val="22"/>
-              </w:rPr>
-              <w:t>병원을 이용하는 환자들에게 빠르고 안전한 병원진료서비스를 제공합니다.</w:t>
-            </w:r>
           </w:p>
         </w:tc>
       </w:tr>
@@ -11505,6 +7631,7 @@
                 <w:sz w:val="24"/>
                 <w:szCs w:val="18"/>
               </w:rPr>
+              <w:lastRenderedPageBreak/>
               <w:t>역할</w:t>
             </w:r>
           </w:p>
@@ -11525,65 +7652,15 @@
               <w:right w:w="99" w:type="dxa"/>
             </w:tcMar>
             <w:vAlign w:val="center"/>
-            <w:hideMark/>
           </w:tcPr>
           <w:p>
             <w:pPr>
               <w:widowControl/>
               <w:rPr>
-                <w:rFonts w:eastAsiaTheme="minorHAnsi" w:cs="굴림"/>
-                <w:color w:val="000000"/>
-                <w:kern w:val="0"/>
-                <w:sz w:val="22"/>
-              </w:rPr>
-            </w:pPr>
-            <w:r>
-              <w:rPr>
-                <w:rFonts w:eastAsiaTheme="minorHAnsi" w:cs="굴림"/>
-                <w:color w:val="000000"/>
-                <w:kern w:val="0"/>
-                <w:sz w:val="22"/>
-              </w:rPr>
-              <w:t>- 일정관리 페이지 구현</w:t>
-            </w:r>
-          </w:p>
-          <w:p>
-            <w:pPr>
-              <w:widowControl/>
-              <w:rPr>
-                <w:rFonts w:eastAsiaTheme="minorHAnsi" w:cs="굴림"/>
-                <w:color w:val="000000"/>
-                <w:kern w:val="0"/>
-                <w:sz w:val="22"/>
-              </w:rPr>
-            </w:pPr>
-            <w:r>
-              <w:rPr>
-                <w:rFonts w:eastAsiaTheme="minorHAnsi" w:cs="굴림"/>
-                <w:color w:val="000000"/>
-                <w:kern w:val="0"/>
-                <w:sz w:val="22"/>
-              </w:rPr>
-              <w:t>- 운동 칼로리 계산</w:t>
-            </w:r>
-          </w:p>
-          <w:p>
-            <w:pPr>
-              <w:widowControl/>
-              <w:rPr>
                 <w:sz w:val="22"/>
                 <w:shd w:val="clear" w:color="000000" w:fill="auto"/>
               </w:rPr>
             </w:pPr>
-            <w:r>
-              <w:rPr>
-                <w:rFonts w:eastAsiaTheme="minorHAnsi" w:cs="굴림"/>
-                <w:color w:val="000000"/>
-                <w:kern w:val="0"/>
-                <w:sz w:val="22"/>
-              </w:rPr>
-              <w:t xml:space="preserve">- 사용자 UI개발 </w:t>
-            </w:r>
           </w:p>
         </w:tc>
       </w:tr>
@@ -11658,81 +7735,12 @@
           </w:tcPr>
           <w:p>
             <w:pPr>
-              <w:widowControl/>
-              <w:rPr>
-                <w:rFonts w:eastAsiaTheme="minorHAnsi" w:cs="굴림"/>
-                <w:color w:val="000000"/>
-                <w:kern w:val="0"/>
-                <w:sz w:val="22"/>
-              </w:rPr>
-            </w:pPr>
-            <w:r>
-              <w:rPr>
-                <w:rFonts w:eastAsiaTheme="minorHAnsi" w:cs="굴림"/>
-                <w:color w:val="000000"/>
-                <w:kern w:val="0"/>
-                <w:sz w:val="22"/>
-              </w:rPr>
-              <w:t>- 팀원간의 의사소통을 활발하게 하는것과 업무분배, 시간관리 등의 중요성에 대해서 알 수 있었습니다.</w:t>
-            </w:r>
-          </w:p>
-          <w:p>
-            <w:pPr>
-              <w:widowControl/>
-              <w:rPr>
-                <w:rFonts w:eastAsiaTheme="minorHAnsi" w:cs="굴림"/>
-                <w:color w:val="000000"/>
-                <w:kern w:val="0"/>
-                <w:sz w:val="22"/>
-              </w:rPr>
-            </w:pPr>
-            <w:r>
-              <w:rPr>
-                <w:rFonts w:eastAsiaTheme="minorHAnsi" w:cs="굴림"/>
-                <w:color w:val="000000"/>
-                <w:kern w:val="0"/>
-                <w:sz w:val="22"/>
-              </w:rPr>
-              <w:t>- ERD를 통해 DB를 모델화 하여 효율적으로 DB설계를 할 수 있었습니다.</w:t>
-            </w:r>
-          </w:p>
-          <w:p>
-            <w:pPr>
-              <w:widowControl/>
-              <w:rPr>
-                <w:rFonts w:eastAsiaTheme="minorHAnsi" w:cs="굴림"/>
-                <w:color w:val="000000"/>
-                <w:kern w:val="0"/>
-                <w:sz w:val="22"/>
-              </w:rPr>
-            </w:pPr>
-            <w:r>
-              <w:rPr>
-                <w:rFonts w:eastAsiaTheme="minorHAnsi" w:cs="굴림"/>
-                <w:color w:val="000000"/>
-                <w:kern w:val="0"/>
-                <w:sz w:val="22"/>
-              </w:rPr>
-              <w:t>-</w:t>
-            </w:r>
-          </w:p>
-          <w:p>
-            <w:pPr>
               <w:rPr>
                 <w:rFonts w:eastAsia="맑은 고딕" w:cs="굴림"/>
                 <w:color w:val="000000"/>
                 <w:sz w:val="22"/>
               </w:rPr>
             </w:pPr>
-            <w:r>
-              <w:rPr>
-                <w:rFonts w:eastAsiaTheme="minorHAnsi" w:cs="굴림"/>
-                <w:color w:val="000000"/>
-                <w:kern w:val="0"/>
-                <w:sz w:val="22"/>
-              </w:rPr>
-              <w:t>-</w:t>
-            </w:r>
           </w:p>
         </w:tc>
       </w:tr>
@@ -11820,14 +7828,6 @@
                 <w:sz w:val="22"/>
               </w:rPr>
             </w:pPr>
-            <w:r>
-              <w:rPr>
-                <w:rFonts w:eastAsia="맑은 고딕" w:cs="굴림"/>
-                <w:b/>
-                <w:sz w:val="22"/>
-              </w:rPr>
-              <w:t xml:space="preserve">※ 포트폴리오 파일 첨부 (ctrl+클릭)  </w:t>
-            </w:r>
           </w:p>
         </w:tc>
       </w:tr>
@@ -12391,55 +8391,6 @@
       <w:pStyle w:val="13"/>
       <w:ind w:firstLineChars="1600" w:firstLine="3200"/>
     </w:pPr>
-    <w:r>
-      <w:rPr>
-        <w:noProof/>
-      </w:rPr>
-      <w:drawing>
-        <wp:inline distT="0" distB="0" distL="0" distR="0" wp14:anchorId="1B1DF1CC" wp14:editId="66D1EEC2">
-          <wp:extent cx="1823085" cy="366395"/>
-          <wp:effectExtent l="0" t="0" r="0" b="0"/>
-          <wp:docPr id="2049" name="shape2049"/>
-          <wp:cNvGraphicFramePr>
-            <a:graphicFrameLocks xmlns:a="http://schemas.openxmlformats.org/drawingml/2006/main"/>
-          </wp:cNvGraphicFramePr>
-          <a:graphic xmlns:a="http://schemas.openxmlformats.org/drawingml/2006/main">
-            <a:graphicData uri="http://schemas.openxmlformats.org/drawingml/2006/picture">
-              <pic:pic xmlns:pic="http://schemas.openxmlformats.org/drawingml/2006/picture">
-                <pic:nvPicPr>
-                  <pic:cNvPr id="0" name="이미지"/>
-                  <pic:cNvPicPr>
-                    <a:picLocks/>
-                  </pic:cNvPicPr>
-                </pic:nvPicPr>
-                <pic:blipFill>
-                  <a:blip r:embed="rId1">
-                    <a:extLst>
-                      <a:ext uri="{28A0092B-C50C-407E-A947-70E740481C1C}">
-                        <a14:useLocalDpi xmlns:a14="http://schemas.microsoft.com/office/drawing/2010/main" val="0"/>
-                      </a:ext>
-                    </a:extLst>
-                  </a:blip>
-                  <a:srcRect/>
-                  <a:stretch>
-                    <a:fillRect/>
-                  </a:stretch>
-                </pic:blipFill>
-                <pic:spPr>
-                  <a:xfrm>
-                    <a:off x="0" y="0"/>
-                    <a:ext cx="1823085" cy="366395"/>
-                  </a:xfrm>
-                  <a:prstGeom prst="rect">
-                    <a:avLst/>
-                  </a:prstGeom>
-                </pic:spPr>
-              </pic:pic>
-            </a:graphicData>
-          </a:graphic>
-        </wp:inline>
-      </w:drawing>
-    </w:r>
   </w:p>
   <w:p>
     <w:pPr>

</xml_diff>

<commit_message>
feat: populate academy project resume sections
</commit_message>
<xml_diff>
--- a/jobpilot-ai/backend/src/main/resources/resume-templates/academy.docx
+++ b/jobpilot-ai/backend/src/main/resources/resume-templates/academy.docx
@@ -1611,7 +1611,7 @@
           <w:p>
             <w:pPr>
               <w:rPr>
-                <w:rFonts w:asciiTheme="minorEastAsia" w:hAnsiTheme="minorEastAsia" w:cs="맑은 고딕" w:hint="eastAsia"/>
+                <w:rFonts w:asciiTheme="minorEastAsia" w:hAnsiTheme="minorEastAsia" w:cs="맑은 고딕"/>
                 <w:color w:val="000000"/>
                 <w:sz w:val="22"/>
               </w:rPr>
@@ -1806,7 +1806,16 @@
                 <w:kern w:val="0"/>
                 <w:sz w:val="22"/>
               </w:rPr>
-              <w:t>팀 최종프로젝트</w:t>
+              <w:t>프로젝트</w:t>
+            </w:r>
+            <w:r>
+              <w:rPr>
+                <w:rFonts w:eastAsiaTheme="minorHAnsi" w:hint="eastAsia"/>
+                <w:b/>
+                <w:kern w:val="0"/>
+                <w:sz w:val="22"/>
+              </w:rPr>
+              <w:t xml:space="preserve"> 이력</w:t>
             </w:r>
           </w:p>
         </w:tc>
@@ -1902,7 +1911,7 @@
             <w:pPr>
               <w:pStyle w:val="a4"/>
               <w:rPr>
-                <w:rFonts w:eastAsiaTheme="minorHAnsi" w:hint="eastAsia"/>
+                <w:rFonts w:eastAsiaTheme="minorHAnsi"/>
                 <w:color w:val="000000"/>
                 <w:kern w:val="0"/>
                 <w:sz w:val="22"/>
@@ -2180,467 +2189,83 @@
           </w:p>
         </w:tc>
       </w:tr>
-      <w:tr>
-        <w:trPr>
-          <w:trHeight w:val="421"/>
-        </w:trPr>
-        <w:tc>
-          <w:tcPr>
-            <w:tcW w:w="1563" w:type="dxa"/>
-            <w:tcBorders>
-              <w:top w:val="single" w:sz="4" w:space="0" w:color="auto"/>
-            </w:tcBorders>
-            <w:shd w:val="clear" w:color="auto" w:fill="DBE5F1" w:themeFill="accent1" w:themeFillTint="33"/>
-            <w:vAlign w:val="center"/>
-          </w:tcPr>
-          <w:p>
-            <w:pPr>
-              <w:pStyle w:val="a4"/>
-              <w:jc w:val="center"/>
-              <w:rPr>
-                <w:rFonts w:eastAsiaTheme="minorHAnsi"/>
-                <w:b/>
-                <w:kern w:val="0"/>
-                <w:sz w:val="22"/>
-              </w:rPr>
-            </w:pPr>
-            <w:r>
-              <w:rPr>
-                <w:rFonts w:eastAsiaTheme="minorHAnsi"/>
-                <w:b/>
-                <w:kern w:val="0"/>
-                <w:sz w:val="22"/>
-              </w:rPr>
-              <w:t>기 간</w:t>
-            </w:r>
-          </w:p>
-        </w:tc>
-        <w:tc>
-          <w:tcPr>
-            <w:tcW w:w="2391" w:type="dxa"/>
-            <w:tcBorders>
-              <w:top w:val="single" w:sz="4" w:space="0" w:color="auto"/>
-            </w:tcBorders>
-            <w:shd w:val="clear" w:color="auto" w:fill="DBE5F1" w:themeFill="accent1" w:themeFillTint="33"/>
-            <w:tcMar>
-              <w:top w:w="0" w:type="dxa"/>
-              <w:left w:w="0" w:type="dxa"/>
-              <w:bottom w:w="0" w:type="dxa"/>
-              <w:right w:w="0" w:type="dxa"/>
-            </w:tcMar>
-            <w:vAlign w:val="center"/>
-          </w:tcPr>
-          <w:p>
-            <w:pPr>
-              <w:pStyle w:val="a4"/>
-              <w:jc w:val="center"/>
-              <w:rPr>
-                <w:rFonts w:eastAsiaTheme="minorHAnsi"/>
-                <w:b/>
-                <w:kern w:val="0"/>
-                <w:sz w:val="22"/>
-              </w:rPr>
-            </w:pPr>
-            <w:r>
-              <w:rPr>
-                <w:rFonts w:eastAsiaTheme="minorHAnsi"/>
-                <w:b/>
-                <w:kern w:val="0"/>
-                <w:sz w:val="22"/>
-              </w:rPr>
-              <w:t>팀 중간프로젝트</w:t>
-            </w:r>
-          </w:p>
-        </w:tc>
-        <w:tc>
-          <w:tcPr>
-            <w:tcW w:w="1560" w:type="dxa"/>
-            <w:tcBorders>
-              <w:top w:val="single" w:sz="4" w:space="0" w:color="auto"/>
-              <w:bottom w:val="single" w:sz="2" w:space="0" w:color="000000"/>
-            </w:tcBorders>
-            <w:shd w:val="clear" w:color="auto" w:fill="DBE5F1" w:themeFill="accent1" w:themeFillTint="33"/>
-            <w:tcMar>
-              <w:top w:w="0" w:type="dxa"/>
-              <w:left w:w="0" w:type="dxa"/>
-              <w:bottom w:w="0" w:type="dxa"/>
-              <w:right w:w="0" w:type="dxa"/>
-            </w:tcMar>
-            <w:vAlign w:val="center"/>
-          </w:tcPr>
-          <w:p>
-            <w:pPr>
-              <w:pStyle w:val="a4"/>
-              <w:jc w:val="center"/>
-              <w:rPr>
-                <w:rFonts w:eastAsiaTheme="minorHAnsi"/>
-                <w:b/>
-                <w:bCs/>
-                <w:kern w:val="0"/>
-                <w:sz w:val="22"/>
-              </w:rPr>
-            </w:pPr>
-            <w:r>
-              <w:rPr>
-                <w:rFonts w:eastAsiaTheme="minorHAnsi"/>
-                <w:b/>
-                <w:bCs/>
-                <w:kern w:val="0"/>
-                <w:sz w:val="22"/>
-              </w:rPr>
-              <w:t>역 할</w:t>
-            </w:r>
-          </w:p>
-        </w:tc>
-        <w:tc>
-          <w:tcPr>
-            <w:tcW w:w="4394" w:type="dxa"/>
-            <w:tcBorders>
-              <w:top w:val="single" w:sz="4" w:space="0" w:color="auto"/>
-              <w:bottom w:val="single" w:sz="2" w:space="0" w:color="000000"/>
-            </w:tcBorders>
-            <w:shd w:val="clear" w:color="auto" w:fill="DBE5F1" w:themeFill="accent1" w:themeFillTint="33"/>
-            <w:vAlign w:val="center"/>
-          </w:tcPr>
-          <w:p>
-            <w:pPr>
-              <w:pStyle w:val="a4"/>
-              <w:jc w:val="center"/>
-              <w:rPr>
-                <w:rFonts w:eastAsiaTheme="minorHAnsi"/>
-                <w:b/>
-                <w:bCs/>
-                <w:kern w:val="0"/>
-                <w:sz w:val="22"/>
-              </w:rPr>
-            </w:pPr>
-            <w:r>
-              <w:rPr>
-                <w:rFonts w:eastAsiaTheme="minorHAnsi"/>
-                <w:b/>
-                <w:bCs/>
-                <w:kern w:val="0"/>
-                <w:sz w:val="22"/>
-              </w:rPr>
-              <w:t>기 술</w:t>
-            </w:r>
-          </w:p>
-        </w:tc>
-      </w:tr>
-      <w:tr>
-        <w:trPr>
-          <w:trHeight w:val="1182"/>
-        </w:trPr>
-        <w:tc>
-          <w:tcPr>
-            <w:tcW w:w="1563" w:type="dxa"/>
-            <w:vMerge w:val="restart"/>
-            <w:tcBorders>
-              <w:top w:val="single" w:sz="4" w:space="0" w:color="auto"/>
-            </w:tcBorders>
-            <w:vAlign w:val="center"/>
-          </w:tcPr>
-          <w:p>
-            <w:pPr>
-              <w:pStyle w:val="a4"/>
-              <w:jc w:val="center"/>
-              <w:rPr>
-                <w:rFonts w:eastAsiaTheme="minorHAnsi"/>
-                <w:color w:val="000000"/>
-                <w:kern w:val="0"/>
-                <w:sz w:val="22"/>
-              </w:rPr>
-            </w:pPr>
-          </w:p>
-        </w:tc>
-        <w:tc>
-          <w:tcPr>
-            <w:tcW w:w="2391" w:type="dxa"/>
-            <w:vMerge w:val="restart"/>
-            <w:tcBorders>
-              <w:top w:val="single" w:sz="4" w:space="0" w:color="auto"/>
-            </w:tcBorders>
-            <w:tcMar>
-              <w:top w:w="0" w:type="dxa"/>
-              <w:left w:w="0" w:type="dxa"/>
-              <w:bottom w:w="0" w:type="dxa"/>
-              <w:right w:w="0" w:type="dxa"/>
-            </w:tcMar>
-            <w:vAlign w:val="center"/>
-            <w:hideMark/>
-          </w:tcPr>
-          <w:p>
-            <w:pPr>
-              <w:pStyle w:val="a4"/>
-              <w:jc w:val="center"/>
-              <w:rPr>
-                <w:rFonts w:eastAsiaTheme="minorHAnsi"/>
-                <w:color w:val="000000"/>
-                <w:kern w:val="0"/>
-                <w:sz w:val="22"/>
-              </w:rPr>
-            </w:pPr>
-          </w:p>
-        </w:tc>
-        <w:tc>
-          <w:tcPr>
-            <w:tcW w:w="1560" w:type="dxa"/>
-            <w:tcBorders>
-              <w:top w:val="single" w:sz="4" w:space="0" w:color="auto"/>
-              <w:bottom w:val="single" w:sz="2" w:space="0" w:color="000000"/>
-            </w:tcBorders>
-            <w:tcMar>
-              <w:top w:w="0" w:type="dxa"/>
-              <w:left w:w="0" w:type="dxa"/>
-              <w:bottom w:w="0" w:type="dxa"/>
-              <w:right w:w="0" w:type="dxa"/>
-            </w:tcMar>
-            <w:vAlign w:val="center"/>
-            <w:hideMark/>
-          </w:tcPr>
-          <w:p>
-            <w:pPr>
-              <w:pStyle w:val="a4"/>
-              <w:jc w:val="center"/>
-              <w:rPr>
-                <w:rFonts w:eastAsiaTheme="minorHAnsi"/>
-                <w:bCs/>
-                <w:color w:val="000000"/>
-                <w:kern w:val="0"/>
-                <w:sz w:val="22"/>
-              </w:rPr>
-            </w:pPr>
-          </w:p>
-        </w:tc>
-        <w:tc>
-          <w:tcPr>
-            <w:tcW w:w="4394" w:type="dxa"/>
-            <w:tcBorders>
-              <w:top w:val="single" w:sz="4" w:space="0" w:color="auto"/>
-              <w:bottom w:val="single" w:sz="2" w:space="0" w:color="000000"/>
-            </w:tcBorders>
-            <w:vAlign w:val="center"/>
-          </w:tcPr>
-          <w:p>
-            <w:pPr>
-              <w:pStyle w:val="a4"/>
-              <w:jc w:val="center"/>
-              <w:rPr>
-                <w:sz w:val="22"/>
-              </w:rPr>
-            </w:pPr>
-          </w:p>
-          <w:p>
-            <w:pPr>
-              <w:pStyle w:val="a4"/>
-              <w:jc w:val="center"/>
-              <w:rPr>
-                <w:rFonts w:eastAsiaTheme="minorHAnsi"/>
-                <w:bCs/>
-                <w:color w:val="000000"/>
-                <w:kern w:val="0"/>
-                <w:sz w:val="22"/>
-              </w:rPr>
-            </w:pPr>
-          </w:p>
-        </w:tc>
-      </w:tr>
-      <w:tr>
-        <w:trPr>
-          <w:trHeight w:val="441"/>
-        </w:trPr>
-        <w:tc>
-          <w:tcPr>
-            <w:tcW w:w="1563" w:type="dxa"/>
-            <w:vMerge/>
-            <w:vAlign w:val="center"/>
-          </w:tcPr>
-          <w:p>
-            <w:pPr>
-              <w:pStyle w:val="a4"/>
-              <w:jc w:val="center"/>
-              <w:rPr>
-                <w:rFonts w:eastAsiaTheme="minorHAnsi"/>
-                <w:color w:val="000000"/>
-                <w:kern w:val="0"/>
-                <w:sz w:val="22"/>
-              </w:rPr>
-            </w:pPr>
-          </w:p>
-        </w:tc>
-        <w:tc>
-          <w:tcPr>
-            <w:tcW w:w="2391" w:type="dxa"/>
-            <w:vMerge/>
-            <w:tcMar>
-              <w:top w:w="0" w:type="dxa"/>
-              <w:left w:w="0" w:type="dxa"/>
-              <w:bottom w:w="0" w:type="dxa"/>
-              <w:right w:w="0" w:type="dxa"/>
-            </w:tcMar>
-            <w:vAlign w:val="center"/>
-            <w:hideMark/>
-          </w:tcPr>
-          <w:p>
-            <w:pPr>
-              <w:pStyle w:val="a4"/>
-              <w:jc w:val="center"/>
-              <w:rPr>
-                <w:rFonts w:eastAsiaTheme="minorHAnsi"/>
-                <w:b/>
-                <w:color w:val="000000"/>
-                <w:kern w:val="0"/>
-                <w:sz w:val="22"/>
-              </w:rPr>
-            </w:pPr>
-          </w:p>
-        </w:tc>
-        <w:tc>
-          <w:tcPr>
-            <w:tcW w:w="5954" w:type="dxa"/>
-            <w:gridSpan w:val="2"/>
-            <w:tcBorders>
-              <w:top w:val="single" w:sz="2" w:space="0" w:color="000000"/>
-              <w:bottom w:val="single" w:sz="4" w:space="0" w:color="auto"/>
-            </w:tcBorders>
-            <w:shd w:val="clear" w:color="auto" w:fill="DBE5F1" w:themeFill="accent1" w:themeFillTint="33"/>
-            <w:tcMar>
-              <w:top w:w="0" w:type="dxa"/>
-              <w:left w:w="0" w:type="dxa"/>
-              <w:bottom w:w="0" w:type="dxa"/>
-              <w:right w:w="0" w:type="dxa"/>
-            </w:tcMar>
-            <w:vAlign w:val="center"/>
-            <w:hideMark/>
-          </w:tcPr>
-          <w:p>
-            <w:pPr>
-              <w:pStyle w:val="a4"/>
-              <w:jc w:val="center"/>
-              <w:rPr>
-                <w:rFonts w:eastAsiaTheme="minorHAnsi"/>
-                <w:b/>
-                <w:bCs/>
-                <w:color w:val="000000"/>
-                <w:kern w:val="0"/>
-                <w:sz w:val="22"/>
-              </w:rPr>
-            </w:pPr>
-            <w:r>
-              <w:rPr>
-                <w:rFonts w:eastAsiaTheme="minorHAnsi"/>
-                <w:b/>
-                <w:color w:val="000000"/>
-                <w:kern w:val="0"/>
-                <w:sz w:val="22"/>
-              </w:rPr>
-              <w:t>내용</w:t>
-            </w:r>
-          </w:p>
-        </w:tc>
-      </w:tr>
-      <w:tr>
-        <w:trPr>
-          <w:trHeight w:val="161"/>
-        </w:trPr>
-        <w:tc>
-          <w:tcPr>
-            <w:tcW w:w="1563" w:type="dxa"/>
-            <w:vMerge/>
-            <w:tcBorders>
-              <w:bottom w:val="single" w:sz="12" w:space="0" w:color="000000"/>
-            </w:tcBorders>
-            <w:vAlign w:val="center"/>
-          </w:tcPr>
-          <w:p>
-            <w:pPr>
-              <w:pStyle w:val="a4"/>
-              <w:jc w:val="center"/>
-              <w:rPr>
-                <w:rFonts w:eastAsiaTheme="minorHAnsi"/>
-                <w:color w:val="000000"/>
-                <w:kern w:val="0"/>
-                <w:sz w:val="22"/>
-                <w:highlight w:val="yellow"/>
-              </w:rPr>
-            </w:pPr>
-          </w:p>
-        </w:tc>
-        <w:tc>
-          <w:tcPr>
-            <w:tcW w:w="2391" w:type="dxa"/>
-            <w:vMerge/>
-            <w:tcBorders>
-              <w:bottom w:val="single" w:sz="12" w:space="0" w:color="000000"/>
-            </w:tcBorders>
-            <w:tcMar>
-              <w:top w:w="0" w:type="dxa"/>
-              <w:left w:w="0" w:type="dxa"/>
-              <w:bottom w:w="0" w:type="dxa"/>
-              <w:right w:w="0" w:type="dxa"/>
-            </w:tcMar>
-            <w:vAlign w:val="center"/>
-          </w:tcPr>
-          <w:p>
-            <w:pPr>
-              <w:pStyle w:val="a4"/>
-              <w:jc w:val="center"/>
-              <w:rPr>
-                <w:rFonts w:eastAsiaTheme="minorHAnsi"/>
-                <w:color w:val="000000"/>
-                <w:kern w:val="0"/>
-                <w:sz w:val="22"/>
-                <w:highlight w:val="yellow"/>
-              </w:rPr>
-            </w:pPr>
-          </w:p>
-        </w:tc>
-        <w:tc>
-          <w:tcPr>
-            <w:tcW w:w="5954" w:type="dxa"/>
-            <w:gridSpan w:val="2"/>
-            <w:tcBorders>
-              <w:top w:val="single" w:sz="4" w:space="0" w:color="auto"/>
-              <w:bottom w:val="single" w:sz="12" w:space="0" w:color="000000"/>
-            </w:tcBorders>
-            <w:tcMar>
-              <w:top w:w="0" w:type="dxa"/>
-              <w:left w:w="0" w:type="dxa"/>
-              <w:bottom w:w="0" w:type="dxa"/>
-              <w:right w:w="0" w:type="dxa"/>
-            </w:tcMar>
-            <w:vAlign w:val="center"/>
-          </w:tcPr>
-          <w:p>
-            <w:pPr>
-              <w:pStyle w:val="a4"/>
-              <w:jc w:val="center"/>
-              <w:rPr>
-                <w:rFonts w:eastAsiaTheme="minorHAnsi"/>
-                <w:bCs/>
-                <w:color w:val="000000"/>
-                <w:kern w:val="0"/>
-                <w:sz w:val="22"/>
-              </w:rPr>
-            </w:pPr>
-            <w:r>
-              <w:rPr>
-                <w:rFonts w:eastAsiaTheme="minorHAnsi"/>
-                <w:bCs/>
-                <w:color w:val="000000"/>
-                <w:kern w:val="0"/>
-                <w:sz w:val="22"/>
-              </w:rPr>
-              <w:t>회원제 게시판 프로그램</w:t>
-            </w:r>
-          </w:p>
-        </w:tc>
-      </w:tr>
     </w:tbl>
     <w:p>
       <w:pPr>
         <w:rPr>
           <w:rFonts w:eastAsiaTheme="majorHAnsi"/>
+          <w:b/>
+          <w:color w:val="000000"/>
+          <w:kern w:val="0"/>
+          <w:sz w:val="24"/>
+          <w:szCs w:val="24"/>
+        </w:rPr>
+      </w:pPr>
+    </w:p>
+    <w:p>
+      <w:pPr>
+        <w:rPr>
+          <w:rFonts w:eastAsiaTheme="majorHAnsi"/>
+          <w:b/>
+          <w:color w:val="000000"/>
+          <w:kern w:val="0"/>
+          <w:sz w:val="24"/>
+          <w:szCs w:val="24"/>
+        </w:rPr>
+      </w:pPr>
+    </w:p>
+    <w:p>
+      <w:pPr>
+        <w:rPr>
+          <w:rFonts w:eastAsiaTheme="majorHAnsi"/>
+          <w:b/>
+          <w:color w:val="000000"/>
+          <w:kern w:val="0"/>
+          <w:sz w:val="24"/>
+          <w:szCs w:val="24"/>
+        </w:rPr>
+      </w:pPr>
+    </w:p>
+    <w:p>
+      <w:pPr>
+        <w:rPr>
+          <w:rFonts w:eastAsiaTheme="majorHAnsi"/>
+          <w:b/>
+          <w:color w:val="000000"/>
+          <w:kern w:val="0"/>
+          <w:sz w:val="24"/>
+          <w:szCs w:val="24"/>
+        </w:rPr>
+      </w:pPr>
+    </w:p>
+    <w:p>
+      <w:pPr>
+        <w:rPr>
+          <w:rFonts w:eastAsiaTheme="majorHAnsi"/>
+          <w:b/>
+          <w:color w:val="000000"/>
+          <w:kern w:val="0"/>
+          <w:sz w:val="24"/>
+          <w:szCs w:val="24"/>
+        </w:rPr>
+      </w:pPr>
+    </w:p>
+    <w:p>
+      <w:pPr>
+        <w:rPr>
+          <w:rFonts w:eastAsiaTheme="majorHAnsi"/>
+          <w:b/>
+          <w:color w:val="000000"/>
+          <w:kern w:val="0"/>
+          <w:sz w:val="24"/>
+          <w:szCs w:val="24"/>
+        </w:rPr>
+      </w:pPr>
+    </w:p>
+    <w:p>
+      <w:pPr>
+        <w:rPr>
+          <w:rFonts w:eastAsiaTheme="majorHAnsi" w:hint="eastAsia"/>
           <w:b/>
           <w:color w:val="000000"/>
           <w:kern w:val="0"/>
@@ -5577,6 +5202,106 @@
     <w:p>
       <w:pPr>
         <w:rPr>
+          <w:rFonts w:eastAsia="맑은 고딕" w:cs="굴림"/>
+          <w:b/>
+          <w:color w:val="000000"/>
+          <w:sz w:val="6"/>
+        </w:rPr>
+      </w:pPr>
+    </w:p>
+    <w:p>
+      <w:pPr>
+        <w:rPr>
+          <w:rFonts w:eastAsia="맑은 고딕" w:cs="굴림"/>
+          <w:b/>
+          <w:color w:val="000000"/>
+          <w:sz w:val="6"/>
+        </w:rPr>
+      </w:pPr>
+    </w:p>
+    <w:p>
+      <w:pPr>
+        <w:rPr>
+          <w:rFonts w:eastAsia="맑은 고딕" w:cs="굴림"/>
+          <w:b/>
+          <w:color w:val="000000"/>
+          <w:sz w:val="6"/>
+        </w:rPr>
+      </w:pPr>
+    </w:p>
+    <w:p>
+      <w:pPr>
+        <w:rPr>
+          <w:rFonts w:eastAsia="맑은 고딕" w:cs="굴림"/>
+          <w:b/>
+          <w:color w:val="000000"/>
+          <w:sz w:val="6"/>
+        </w:rPr>
+      </w:pPr>
+    </w:p>
+    <w:p>
+      <w:pPr>
+        <w:rPr>
+          <w:rFonts w:eastAsia="맑은 고딕" w:cs="굴림"/>
+          <w:b/>
+          <w:color w:val="000000"/>
+          <w:sz w:val="6"/>
+        </w:rPr>
+      </w:pPr>
+    </w:p>
+    <w:p>
+      <w:pPr>
+        <w:rPr>
+          <w:rFonts w:eastAsia="맑은 고딕" w:cs="굴림"/>
+          <w:b/>
+          <w:color w:val="000000"/>
+          <w:sz w:val="6"/>
+        </w:rPr>
+      </w:pPr>
+    </w:p>
+    <w:p>
+      <w:pPr>
+        <w:rPr>
+          <w:rFonts w:eastAsia="맑은 고딕" w:cs="굴림"/>
+          <w:b/>
+          <w:color w:val="000000"/>
+          <w:sz w:val="6"/>
+        </w:rPr>
+      </w:pPr>
+    </w:p>
+    <w:p>
+      <w:pPr>
+        <w:rPr>
+          <w:rFonts w:eastAsia="맑은 고딕" w:cs="굴림"/>
+          <w:b/>
+          <w:color w:val="000000"/>
+          <w:sz w:val="6"/>
+        </w:rPr>
+      </w:pPr>
+    </w:p>
+    <w:p>
+      <w:pPr>
+        <w:rPr>
+          <w:rFonts w:eastAsia="맑은 고딕" w:cs="굴림"/>
+          <w:b/>
+          <w:color w:val="000000"/>
+          <w:sz w:val="6"/>
+        </w:rPr>
+      </w:pPr>
+    </w:p>
+    <w:p>
+      <w:pPr>
+        <w:rPr>
+          <w:rFonts w:eastAsia="맑은 고딕" w:cs="굴림"/>
+          <w:b/>
+          <w:color w:val="000000"/>
+          <w:sz w:val="6"/>
+        </w:rPr>
+      </w:pPr>
+    </w:p>
+    <w:p>
+      <w:pPr>
+        <w:rPr>
           <w:rFonts w:eastAsia="맑은 고딕" w:cs="굴림" w:hint="eastAsia"/>
           <w:b/>
           <w:color w:val="000000"/>
@@ -5685,7 +5410,8 @@
                 <w:sz w:val="36"/>
                 <w:szCs w:val="36"/>
               </w:rPr>
-              <w:t>최종 팀프로젝트 수행사항</w:t>
+              <w:lastRenderedPageBreak/>
+              <w:t>프로젝트 수행사항</w:t>
             </w:r>
           </w:p>
         </w:tc>
@@ -5822,7 +5548,6 @@
                 <w:sz w:val="24"/>
                 <w:szCs w:val="24"/>
               </w:rPr>
-              <w:lastRenderedPageBreak/>
               <w:t>기간</w:t>
             </w:r>
           </w:p>
@@ -7133,7 +6858,2239 @@
         <w:autoSpaceDN/>
         <w:jc w:val="left"/>
         <w:rPr>
+          <w:rFonts w:eastAsiaTheme="minorHAnsi" w:cs="굴림"/>
+          <w:b/>
+          <w:bCs/>
+          <w:color w:val="000000"/>
+          <w:kern w:val="0"/>
+          <w:sz w:val="2"/>
+          <w:szCs w:val="10"/>
+        </w:rPr>
+      </w:pPr>
+    </w:p>
+    <w:p>
+      <w:pPr>
+        <w:widowControl/>
+        <w:wordWrap/>
+        <w:autoSpaceDE/>
+        <w:autoSpaceDN/>
+        <w:jc w:val="left"/>
+        <w:rPr>
+          <w:rFonts w:eastAsiaTheme="minorHAnsi" w:cs="굴림"/>
+          <w:b/>
+          <w:bCs/>
+          <w:color w:val="000000"/>
+          <w:kern w:val="0"/>
+          <w:sz w:val="2"/>
+          <w:szCs w:val="10"/>
+        </w:rPr>
+      </w:pPr>
+    </w:p>
+    <w:p>
+      <w:pPr>
+        <w:widowControl/>
+        <w:wordWrap/>
+        <w:autoSpaceDE/>
+        <w:autoSpaceDN/>
+        <w:jc w:val="left"/>
+        <w:rPr>
+          <w:rFonts w:eastAsiaTheme="minorHAnsi" w:cs="굴림"/>
+          <w:b/>
+          <w:bCs/>
+          <w:color w:val="000000"/>
+          <w:kern w:val="0"/>
+          <w:sz w:val="2"/>
+          <w:szCs w:val="10"/>
+        </w:rPr>
+      </w:pPr>
+    </w:p>
+    <w:p>
+      <w:pPr>
+        <w:widowControl/>
+        <w:wordWrap/>
+        <w:autoSpaceDE/>
+        <w:autoSpaceDN/>
+        <w:jc w:val="left"/>
+        <w:rPr>
+          <w:rFonts w:eastAsiaTheme="minorHAnsi" w:cs="굴림"/>
+          <w:b/>
+          <w:bCs/>
+          <w:color w:val="000000"/>
+          <w:kern w:val="0"/>
+          <w:sz w:val="2"/>
+          <w:szCs w:val="10"/>
+        </w:rPr>
+      </w:pPr>
+    </w:p>
+    <w:p>
+      <w:pPr>
+        <w:widowControl/>
+        <w:wordWrap/>
+        <w:autoSpaceDE/>
+        <w:autoSpaceDN/>
+        <w:jc w:val="left"/>
+        <w:rPr>
+          <w:rFonts w:eastAsiaTheme="minorHAnsi" w:cs="굴림"/>
+          <w:b/>
+          <w:bCs/>
+          <w:color w:val="000000"/>
+          <w:kern w:val="0"/>
+          <w:sz w:val="2"/>
+          <w:szCs w:val="10"/>
+        </w:rPr>
+      </w:pPr>
+    </w:p>
+    <w:p>
+      <w:pPr>
+        <w:widowControl/>
+        <w:wordWrap/>
+        <w:autoSpaceDE/>
+        <w:autoSpaceDN/>
+        <w:jc w:val="left"/>
+        <w:rPr>
+          <w:rFonts w:eastAsiaTheme="minorHAnsi" w:cs="굴림"/>
+          <w:b/>
+          <w:bCs/>
+          <w:color w:val="000000"/>
+          <w:kern w:val="0"/>
+          <w:sz w:val="2"/>
+          <w:szCs w:val="10"/>
+        </w:rPr>
+      </w:pPr>
+    </w:p>
+    <w:p>
+      <w:pPr>
+        <w:widowControl/>
+        <w:wordWrap/>
+        <w:autoSpaceDE/>
+        <w:autoSpaceDN/>
+        <w:jc w:val="left"/>
+        <w:rPr>
+          <w:rFonts w:eastAsiaTheme="minorHAnsi" w:cs="굴림"/>
+          <w:b/>
+          <w:bCs/>
+          <w:color w:val="000000"/>
+          <w:kern w:val="0"/>
+          <w:sz w:val="2"/>
+          <w:szCs w:val="10"/>
+        </w:rPr>
+      </w:pPr>
+    </w:p>
+    <w:p>
+      <w:pPr>
+        <w:widowControl/>
+        <w:wordWrap/>
+        <w:autoSpaceDE/>
+        <w:autoSpaceDN/>
+        <w:jc w:val="left"/>
+        <w:rPr>
+          <w:rFonts w:eastAsiaTheme="minorHAnsi" w:cs="굴림"/>
+          <w:b/>
+          <w:bCs/>
+          <w:color w:val="000000"/>
+          <w:kern w:val="0"/>
+          <w:sz w:val="2"/>
+          <w:szCs w:val="10"/>
+        </w:rPr>
+      </w:pPr>
+    </w:p>
+    <w:p>
+      <w:pPr>
+        <w:widowControl/>
+        <w:wordWrap/>
+        <w:autoSpaceDE/>
+        <w:autoSpaceDN/>
+        <w:jc w:val="left"/>
+        <w:rPr>
+          <w:rFonts w:eastAsiaTheme="minorHAnsi" w:cs="굴림"/>
+          <w:b/>
+          <w:bCs/>
+          <w:color w:val="000000"/>
+          <w:kern w:val="0"/>
+          <w:sz w:val="2"/>
+          <w:szCs w:val="10"/>
+        </w:rPr>
+      </w:pPr>
+    </w:p>
+    <w:p>
+      <w:pPr>
+        <w:widowControl/>
+        <w:wordWrap/>
+        <w:autoSpaceDE/>
+        <w:autoSpaceDN/>
+        <w:jc w:val="left"/>
+        <w:rPr>
+          <w:rFonts w:eastAsiaTheme="minorHAnsi" w:cs="굴림"/>
+          <w:b/>
+          <w:bCs/>
+          <w:color w:val="000000"/>
+          <w:kern w:val="0"/>
+          <w:sz w:val="2"/>
+          <w:szCs w:val="10"/>
+        </w:rPr>
+      </w:pPr>
+    </w:p>
+    <w:p>
+      <w:pPr>
+        <w:widowControl/>
+        <w:wordWrap/>
+        <w:autoSpaceDE/>
+        <w:autoSpaceDN/>
+        <w:jc w:val="left"/>
+        <w:rPr>
+          <w:rFonts w:eastAsiaTheme="minorHAnsi" w:cs="굴림"/>
+          <w:b/>
+          <w:bCs/>
+          <w:color w:val="000000"/>
+          <w:kern w:val="0"/>
+          <w:sz w:val="2"/>
+          <w:szCs w:val="10"/>
+        </w:rPr>
+      </w:pPr>
+    </w:p>
+    <w:p>
+      <w:pPr>
+        <w:widowControl/>
+        <w:wordWrap/>
+        <w:autoSpaceDE/>
+        <w:autoSpaceDN/>
+        <w:jc w:val="left"/>
+        <w:rPr>
+          <w:rFonts w:eastAsiaTheme="minorHAnsi" w:cs="굴림"/>
+          <w:b/>
+          <w:bCs/>
+          <w:color w:val="000000"/>
+          <w:kern w:val="0"/>
+          <w:sz w:val="2"/>
+          <w:szCs w:val="10"/>
+        </w:rPr>
+      </w:pPr>
+    </w:p>
+    <w:p>
+      <w:pPr>
+        <w:widowControl/>
+        <w:wordWrap/>
+        <w:autoSpaceDE/>
+        <w:autoSpaceDN/>
+        <w:jc w:val="left"/>
+        <w:rPr>
+          <w:rFonts w:eastAsiaTheme="minorHAnsi" w:cs="굴림"/>
+          <w:b/>
+          <w:bCs/>
+          <w:color w:val="000000"/>
+          <w:kern w:val="0"/>
+          <w:sz w:val="2"/>
+          <w:szCs w:val="10"/>
+        </w:rPr>
+      </w:pPr>
+    </w:p>
+    <w:p>
+      <w:pPr>
+        <w:widowControl/>
+        <w:wordWrap/>
+        <w:autoSpaceDE/>
+        <w:autoSpaceDN/>
+        <w:jc w:val="left"/>
+        <w:rPr>
+          <w:rFonts w:eastAsiaTheme="minorHAnsi" w:cs="굴림"/>
+          <w:b/>
+          <w:bCs/>
+          <w:color w:val="000000"/>
+          <w:kern w:val="0"/>
+          <w:sz w:val="2"/>
+          <w:szCs w:val="10"/>
+        </w:rPr>
+      </w:pPr>
+    </w:p>
+    <w:p>
+      <w:pPr>
+        <w:widowControl/>
+        <w:wordWrap/>
+        <w:autoSpaceDE/>
+        <w:autoSpaceDN/>
+        <w:jc w:val="left"/>
+        <w:rPr>
+          <w:rFonts w:eastAsiaTheme="minorHAnsi" w:cs="굴림"/>
+          <w:b/>
+          <w:bCs/>
+          <w:color w:val="000000"/>
+          <w:kern w:val="0"/>
+          <w:sz w:val="2"/>
+          <w:szCs w:val="10"/>
+        </w:rPr>
+      </w:pPr>
+    </w:p>
+    <w:p>
+      <w:pPr>
+        <w:widowControl/>
+        <w:wordWrap/>
+        <w:autoSpaceDE/>
+        <w:autoSpaceDN/>
+        <w:jc w:val="left"/>
+        <w:rPr>
+          <w:rFonts w:eastAsiaTheme="minorHAnsi" w:cs="굴림"/>
+          <w:b/>
+          <w:bCs/>
+          <w:color w:val="000000"/>
+          <w:kern w:val="0"/>
+          <w:sz w:val="2"/>
+          <w:szCs w:val="10"/>
+        </w:rPr>
+      </w:pPr>
+    </w:p>
+    <w:p>
+      <w:pPr>
+        <w:widowControl/>
+        <w:wordWrap/>
+        <w:autoSpaceDE/>
+        <w:autoSpaceDN/>
+        <w:jc w:val="left"/>
+        <w:rPr>
+          <w:rFonts w:eastAsiaTheme="minorHAnsi" w:cs="굴림"/>
+          <w:b/>
+          <w:bCs/>
+          <w:color w:val="000000"/>
+          <w:kern w:val="0"/>
+          <w:sz w:val="2"/>
+          <w:szCs w:val="10"/>
+        </w:rPr>
+      </w:pPr>
+    </w:p>
+    <w:p>
+      <w:pPr>
+        <w:widowControl/>
+        <w:wordWrap/>
+        <w:autoSpaceDE/>
+        <w:autoSpaceDN/>
+        <w:jc w:val="left"/>
+        <w:rPr>
+          <w:rFonts w:eastAsiaTheme="minorHAnsi" w:cs="굴림"/>
+          <w:b/>
+          <w:bCs/>
+          <w:color w:val="000000"/>
+          <w:kern w:val="0"/>
+          <w:sz w:val="2"/>
+          <w:szCs w:val="10"/>
+        </w:rPr>
+      </w:pPr>
+    </w:p>
+    <w:p>
+      <w:pPr>
+        <w:widowControl/>
+        <w:wordWrap/>
+        <w:autoSpaceDE/>
+        <w:autoSpaceDN/>
+        <w:jc w:val="left"/>
+        <w:rPr>
+          <w:rFonts w:eastAsiaTheme="minorHAnsi" w:cs="굴림"/>
+          <w:b/>
+          <w:bCs/>
+          <w:color w:val="000000"/>
+          <w:kern w:val="0"/>
+          <w:sz w:val="2"/>
+          <w:szCs w:val="10"/>
+        </w:rPr>
+      </w:pPr>
+    </w:p>
+    <w:p>
+      <w:pPr>
+        <w:widowControl/>
+        <w:wordWrap/>
+        <w:autoSpaceDE/>
+        <w:autoSpaceDN/>
+        <w:jc w:val="left"/>
+        <w:rPr>
+          <w:rFonts w:eastAsiaTheme="minorHAnsi" w:cs="굴림"/>
+          <w:b/>
+          <w:bCs/>
+          <w:color w:val="000000"/>
+          <w:kern w:val="0"/>
+          <w:sz w:val="2"/>
+          <w:szCs w:val="10"/>
+        </w:rPr>
+      </w:pPr>
+    </w:p>
+    <w:p>
+      <w:pPr>
+        <w:widowControl/>
+        <w:wordWrap/>
+        <w:autoSpaceDE/>
+        <w:autoSpaceDN/>
+        <w:jc w:val="left"/>
+        <w:rPr>
+          <w:rFonts w:eastAsiaTheme="minorHAnsi" w:cs="굴림"/>
+          <w:b/>
+          <w:bCs/>
+          <w:color w:val="000000"/>
+          <w:kern w:val="0"/>
+          <w:sz w:val="2"/>
+          <w:szCs w:val="10"/>
+        </w:rPr>
+      </w:pPr>
+    </w:p>
+    <w:p>
+      <w:pPr>
+        <w:widowControl/>
+        <w:wordWrap/>
+        <w:autoSpaceDE/>
+        <w:autoSpaceDN/>
+        <w:jc w:val="left"/>
+        <w:rPr>
+          <w:rFonts w:eastAsiaTheme="minorHAnsi" w:cs="굴림"/>
+          <w:b/>
+          <w:bCs/>
+          <w:color w:val="000000"/>
+          <w:kern w:val="0"/>
+          <w:sz w:val="2"/>
+          <w:szCs w:val="10"/>
+        </w:rPr>
+      </w:pPr>
+    </w:p>
+    <w:p>
+      <w:pPr>
+        <w:widowControl/>
+        <w:wordWrap/>
+        <w:autoSpaceDE/>
+        <w:autoSpaceDN/>
+        <w:jc w:val="left"/>
+        <w:rPr>
+          <w:rFonts w:eastAsiaTheme="minorHAnsi" w:cs="굴림"/>
+          <w:b/>
+          <w:bCs/>
+          <w:color w:val="000000"/>
+          <w:kern w:val="0"/>
+          <w:sz w:val="2"/>
+          <w:szCs w:val="10"/>
+        </w:rPr>
+      </w:pPr>
+    </w:p>
+    <w:p>
+      <w:pPr>
+        <w:widowControl/>
+        <w:wordWrap/>
+        <w:autoSpaceDE/>
+        <w:autoSpaceDN/>
+        <w:jc w:val="left"/>
+        <w:rPr>
+          <w:rFonts w:eastAsiaTheme="minorHAnsi" w:cs="굴림"/>
+          <w:b/>
+          <w:bCs/>
+          <w:color w:val="000000"/>
+          <w:kern w:val="0"/>
+          <w:sz w:val="2"/>
+          <w:szCs w:val="10"/>
+        </w:rPr>
+      </w:pPr>
+    </w:p>
+    <w:p>
+      <w:pPr>
+        <w:widowControl/>
+        <w:wordWrap/>
+        <w:autoSpaceDE/>
+        <w:autoSpaceDN/>
+        <w:jc w:val="left"/>
+        <w:rPr>
+          <w:rFonts w:eastAsiaTheme="minorHAnsi" w:cs="굴림"/>
+          <w:b/>
+          <w:bCs/>
+          <w:color w:val="000000"/>
+          <w:kern w:val="0"/>
+          <w:sz w:val="2"/>
+          <w:szCs w:val="10"/>
+        </w:rPr>
+      </w:pPr>
+    </w:p>
+    <w:p>
+      <w:pPr>
+        <w:widowControl/>
+        <w:wordWrap/>
+        <w:autoSpaceDE/>
+        <w:autoSpaceDN/>
+        <w:jc w:val="left"/>
+        <w:rPr>
+          <w:rFonts w:eastAsiaTheme="minorHAnsi" w:cs="굴림"/>
+          <w:b/>
+          <w:bCs/>
+          <w:color w:val="000000"/>
+          <w:kern w:val="0"/>
+          <w:sz w:val="2"/>
+          <w:szCs w:val="10"/>
+        </w:rPr>
+      </w:pPr>
+    </w:p>
+    <w:p>
+      <w:pPr>
+        <w:widowControl/>
+        <w:wordWrap/>
+        <w:autoSpaceDE/>
+        <w:autoSpaceDN/>
+        <w:jc w:val="left"/>
+        <w:rPr>
+          <w:rFonts w:eastAsiaTheme="minorHAnsi" w:cs="굴림"/>
+          <w:b/>
+          <w:bCs/>
+          <w:color w:val="000000"/>
+          <w:kern w:val="0"/>
+          <w:sz w:val="2"/>
+          <w:szCs w:val="10"/>
+        </w:rPr>
+      </w:pPr>
+    </w:p>
+    <w:p>
+      <w:pPr>
+        <w:widowControl/>
+        <w:wordWrap/>
+        <w:autoSpaceDE/>
+        <w:autoSpaceDN/>
+        <w:jc w:val="left"/>
+        <w:rPr>
+          <w:rFonts w:eastAsiaTheme="minorHAnsi" w:cs="굴림"/>
+          <w:b/>
+          <w:bCs/>
+          <w:color w:val="000000"/>
+          <w:kern w:val="0"/>
+          <w:sz w:val="2"/>
+          <w:szCs w:val="10"/>
+        </w:rPr>
+      </w:pPr>
+    </w:p>
+    <w:p>
+      <w:pPr>
+        <w:widowControl/>
+        <w:wordWrap/>
+        <w:autoSpaceDE/>
+        <w:autoSpaceDN/>
+        <w:jc w:val="left"/>
+        <w:rPr>
+          <w:rFonts w:eastAsiaTheme="minorHAnsi" w:cs="굴림"/>
+          <w:b/>
+          <w:bCs/>
+          <w:color w:val="000000"/>
+          <w:kern w:val="0"/>
+          <w:sz w:val="2"/>
+          <w:szCs w:val="10"/>
+        </w:rPr>
+      </w:pPr>
+    </w:p>
+    <w:p>
+      <w:pPr>
+        <w:widowControl/>
+        <w:wordWrap/>
+        <w:autoSpaceDE/>
+        <w:autoSpaceDN/>
+        <w:jc w:val="left"/>
+        <w:rPr>
+          <w:rFonts w:eastAsiaTheme="minorHAnsi" w:cs="굴림"/>
+          <w:b/>
+          <w:bCs/>
+          <w:color w:val="000000"/>
+          <w:kern w:val="0"/>
+          <w:sz w:val="2"/>
+          <w:szCs w:val="10"/>
+        </w:rPr>
+      </w:pPr>
+    </w:p>
+    <w:p>
+      <w:pPr>
+        <w:widowControl/>
+        <w:wordWrap/>
+        <w:autoSpaceDE/>
+        <w:autoSpaceDN/>
+        <w:jc w:val="left"/>
+        <w:rPr>
+          <w:rFonts w:eastAsiaTheme="minorHAnsi" w:cs="굴림"/>
+          <w:b/>
+          <w:bCs/>
+          <w:color w:val="000000"/>
+          <w:kern w:val="0"/>
+          <w:sz w:val="2"/>
+          <w:szCs w:val="10"/>
+        </w:rPr>
+      </w:pPr>
+    </w:p>
+    <w:p>
+      <w:pPr>
+        <w:widowControl/>
+        <w:wordWrap/>
+        <w:autoSpaceDE/>
+        <w:autoSpaceDN/>
+        <w:jc w:val="left"/>
+        <w:rPr>
+          <w:rFonts w:eastAsiaTheme="minorHAnsi" w:cs="굴림"/>
+          <w:b/>
+          <w:bCs/>
+          <w:color w:val="000000"/>
+          <w:kern w:val="0"/>
+          <w:sz w:val="2"/>
+          <w:szCs w:val="10"/>
+        </w:rPr>
+      </w:pPr>
+    </w:p>
+    <w:p>
+      <w:pPr>
+        <w:widowControl/>
+        <w:wordWrap/>
+        <w:autoSpaceDE/>
+        <w:autoSpaceDN/>
+        <w:jc w:val="left"/>
+        <w:rPr>
+          <w:rFonts w:eastAsiaTheme="minorHAnsi" w:cs="굴림"/>
+          <w:b/>
+          <w:bCs/>
+          <w:color w:val="000000"/>
+          <w:kern w:val="0"/>
+          <w:sz w:val="2"/>
+          <w:szCs w:val="10"/>
+        </w:rPr>
+      </w:pPr>
+    </w:p>
+    <w:p>
+      <w:pPr>
+        <w:widowControl/>
+        <w:wordWrap/>
+        <w:autoSpaceDE/>
+        <w:autoSpaceDN/>
+        <w:jc w:val="left"/>
+        <w:rPr>
+          <w:rFonts w:eastAsiaTheme="minorHAnsi" w:cs="굴림"/>
+          <w:b/>
+          <w:bCs/>
+          <w:color w:val="000000"/>
+          <w:kern w:val="0"/>
+          <w:sz w:val="2"/>
+          <w:szCs w:val="10"/>
+        </w:rPr>
+      </w:pPr>
+    </w:p>
+    <w:p>
+      <w:pPr>
+        <w:widowControl/>
+        <w:wordWrap/>
+        <w:autoSpaceDE/>
+        <w:autoSpaceDN/>
+        <w:jc w:val="left"/>
+        <w:rPr>
+          <w:rFonts w:eastAsiaTheme="minorHAnsi" w:cs="굴림"/>
+          <w:b/>
+          <w:bCs/>
+          <w:color w:val="000000"/>
+          <w:kern w:val="0"/>
+          <w:sz w:val="2"/>
+          <w:szCs w:val="10"/>
+        </w:rPr>
+      </w:pPr>
+    </w:p>
+    <w:p>
+      <w:pPr>
+        <w:widowControl/>
+        <w:wordWrap/>
+        <w:autoSpaceDE/>
+        <w:autoSpaceDN/>
+        <w:jc w:val="left"/>
+        <w:rPr>
+          <w:rFonts w:eastAsiaTheme="minorHAnsi" w:cs="굴림"/>
+          <w:b/>
+          <w:bCs/>
+          <w:color w:val="000000"/>
+          <w:kern w:val="0"/>
+          <w:sz w:val="2"/>
+          <w:szCs w:val="10"/>
+        </w:rPr>
+      </w:pPr>
+    </w:p>
+    <w:p>
+      <w:pPr>
+        <w:widowControl/>
+        <w:wordWrap/>
+        <w:autoSpaceDE/>
+        <w:autoSpaceDN/>
+        <w:jc w:val="left"/>
+        <w:rPr>
+          <w:rFonts w:eastAsiaTheme="minorHAnsi" w:cs="굴림"/>
+          <w:b/>
+          <w:bCs/>
+          <w:color w:val="000000"/>
+          <w:kern w:val="0"/>
+          <w:sz w:val="2"/>
+          <w:szCs w:val="10"/>
+        </w:rPr>
+      </w:pPr>
+    </w:p>
+    <w:p>
+      <w:pPr>
+        <w:widowControl/>
+        <w:wordWrap/>
+        <w:autoSpaceDE/>
+        <w:autoSpaceDN/>
+        <w:jc w:val="left"/>
+        <w:rPr>
+          <w:rFonts w:eastAsiaTheme="minorHAnsi" w:cs="굴림"/>
+          <w:b/>
+          <w:bCs/>
+          <w:color w:val="000000"/>
+          <w:kern w:val="0"/>
+          <w:sz w:val="2"/>
+          <w:szCs w:val="10"/>
+        </w:rPr>
+      </w:pPr>
+    </w:p>
+    <w:p>
+      <w:pPr>
+        <w:widowControl/>
+        <w:wordWrap/>
+        <w:autoSpaceDE/>
+        <w:autoSpaceDN/>
+        <w:jc w:val="left"/>
+        <w:rPr>
+          <w:rFonts w:eastAsiaTheme="minorHAnsi" w:cs="굴림"/>
+          <w:b/>
+          <w:bCs/>
+          <w:color w:val="000000"/>
+          <w:kern w:val="0"/>
+          <w:sz w:val="2"/>
+          <w:szCs w:val="10"/>
+        </w:rPr>
+      </w:pPr>
+    </w:p>
+    <w:p>
+      <w:pPr>
+        <w:widowControl/>
+        <w:wordWrap/>
+        <w:autoSpaceDE/>
+        <w:autoSpaceDN/>
+        <w:jc w:val="left"/>
+        <w:rPr>
+          <w:rFonts w:eastAsiaTheme="minorHAnsi" w:cs="굴림"/>
+          <w:b/>
+          <w:bCs/>
+          <w:color w:val="000000"/>
+          <w:kern w:val="0"/>
+          <w:sz w:val="2"/>
+          <w:szCs w:val="10"/>
+        </w:rPr>
+      </w:pPr>
+    </w:p>
+    <w:p>
+      <w:pPr>
+        <w:widowControl/>
+        <w:wordWrap/>
+        <w:autoSpaceDE/>
+        <w:autoSpaceDN/>
+        <w:jc w:val="left"/>
+        <w:rPr>
+          <w:rFonts w:eastAsiaTheme="minorHAnsi" w:cs="굴림"/>
+          <w:b/>
+          <w:bCs/>
+          <w:color w:val="000000"/>
+          <w:kern w:val="0"/>
+          <w:sz w:val="2"/>
+          <w:szCs w:val="10"/>
+        </w:rPr>
+      </w:pPr>
+    </w:p>
+    <w:p>
+      <w:pPr>
+        <w:widowControl/>
+        <w:wordWrap/>
+        <w:autoSpaceDE/>
+        <w:autoSpaceDN/>
+        <w:jc w:val="left"/>
+        <w:rPr>
+          <w:rFonts w:eastAsiaTheme="minorHAnsi" w:cs="굴림"/>
+          <w:b/>
+          <w:bCs/>
+          <w:color w:val="000000"/>
+          <w:kern w:val="0"/>
+          <w:sz w:val="2"/>
+          <w:szCs w:val="10"/>
+        </w:rPr>
+      </w:pPr>
+    </w:p>
+    <w:p>
+      <w:pPr>
+        <w:widowControl/>
+        <w:wordWrap/>
+        <w:autoSpaceDE/>
+        <w:autoSpaceDN/>
+        <w:jc w:val="left"/>
+        <w:rPr>
+          <w:rFonts w:eastAsiaTheme="minorHAnsi" w:cs="굴림"/>
+          <w:b/>
+          <w:bCs/>
+          <w:color w:val="000000"/>
+          <w:kern w:val="0"/>
+          <w:sz w:val="2"/>
+          <w:szCs w:val="10"/>
+        </w:rPr>
+      </w:pPr>
+    </w:p>
+    <w:p>
+      <w:pPr>
+        <w:widowControl/>
+        <w:wordWrap/>
+        <w:autoSpaceDE/>
+        <w:autoSpaceDN/>
+        <w:jc w:val="left"/>
+        <w:rPr>
+          <w:rFonts w:eastAsiaTheme="minorHAnsi" w:cs="굴림"/>
+          <w:b/>
+          <w:bCs/>
+          <w:color w:val="000000"/>
+          <w:kern w:val="0"/>
+          <w:sz w:val="2"/>
+          <w:szCs w:val="10"/>
+        </w:rPr>
+      </w:pPr>
+    </w:p>
+    <w:p>
+      <w:pPr>
+        <w:widowControl/>
+        <w:wordWrap/>
+        <w:autoSpaceDE/>
+        <w:autoSpaceDN/>
+        <w:jc w:val="left"/>
+        <w:rPr>
+          <w:rFonts w:eastAsiaTheme="minorHAnsi" w:cs="굴림"/>
+          <w:b/>
+          <w:bCs/>
+          <w:color w:val="000000"/>
+          <w:kern w:val="0"/>
+          <w:sz w:val="2"/>
+          <w:szCs w:val="10"/>
+        </w:rPr>
+      </w:pPr>
+    </w:p>
+    <w:p>
+      <w:pPr>
+        <w:widowControl/>
+        <w:wordWrap/>
+        <w:autoSpaceDE/>
+        <w:autoSpaceDN/>
+        <w:jc w:val="left"/>
+        <w:rPr>
+          <w:rFonts w:eastAsiaTheme="minorHAnsi" w:cs="굴림"/>
+          <w:b/>
+          <w:bCs/>
+          <w:color w:val="000000"/>
+          <w:kern w:val="0"/>
+          <w:sz w:val="2"/>
+          <w:szCs w:val="10"/>
+        </w:rPr>
+      </w:pPr>
+    </w:p>
+    <w:p>
+      <w:pPr>
+        <w:widowControl/>
+        <w:wordWrap/>
+        <w:autoSpaceDE/>
+        <w:autoSpaceDN/>
+        <w:jc w:val="left"/>
+        <w:rPr>
+          <w:rFonts w:eastAsiaTheme="minorHAnsi" w:cs="굴림"/>
+          <w:b/>
+          <w:bCs/>
+          <w:color w:val="000000"/>
+          <w:kern w:val="0"/>
+          <w:sz w:val="2"/>
+          <w:szCs w:val="10"/>
+        </w:rPr>
+      </w:pPr>
+    </w:p>
+    <w:p>
+      <w:pPr>
+        <w:widowControl/>
+        <w:wordWrap/>
+        <w:autoSpaceDE/>
+        <w:autoSpaceDN/>
+        <w:jc w:val="left"/>
+        <w:rPr>
+          <w:rFonts w:eastAsiaTheme="minorHAnsi" w:cs="굴림"/>
+          <w:b/>
+          <w:bCs/>
+          <w:color w:val="000000"/>
+          <w:kern w:val="0"/>
+          <w:sz w:val="2"/>
+          <w:szCs w:val="10"/>
+        </w:rPr>
+      </w:pPr>
+    </w:p>
+    <w:p>
+      <w:pPr>
+        <w:widowControl/>
+        <w:wordWrap/>
+        <w:autoSpaceDE/>
+        <w:autoSpaceDN/>
+        <w:jc w:val="left"/>
+        <w:rPr>
+          <w:rFonts w:eastAsiaTheme="minorHAnsi" w:cs="굴림"/>
+          <w:b/>
+          <w:bCs/>
+          <w:color w:val="000000"/>
+          <w:kern w:val="0"/>
+          <w:sz w:val="2"/>
+          <w:szCs w:val="10"/>
+        </w:rPr>
+      </w:pPr>
+    </w:p>
+    <w:p>
+      <w:pPr>
+        <w:widowControl/>
+        <w:wordWrap/>
+        <w:autoSpaceDE/>
+        <w:autoSpaceDN/>
+        <w:jc w:val="left"/>
+        <w:rPr>
+          <w:rFonts w:eastAsiaTheme="minorHAnsi" w:cs="굴림"/>
+          <w:b/>
+          <w:bCs/>
+          <w:color w:val="000000"/>
+          <w:kern w:val="0"/>
+          <w:sz w:val="2"/>
+          <w:szCs w:val="10"/>
+        </w:rPr>
+      </w:pPr>
+    </w:p>
+    <w:p>
+      <w:pPr>
+        <w:widowControl/>
+        <w:wordWrap/>
+        <w:autoSpaceDE/>
+        <w:autoSpaceDN/>
+        <w:jc w:val="left"/>
+        <w:rPr>
+          <w:rFonts w:eastAsiaTheme="minorHAnsi" w:cs="굴림"/>
+          <w:b/>
+          <w:bCs/>
+          <w:color w:val="000000"/>
+          <w:kern w:val="0"/>
+          <w:sz w:val="2"/>
+          <w:szCs w:val="10"/>
+        </w:rPr>
+      </w:pPr>
+    </w:p>
+    <w:p>
+      <w:pPr>
+        <w:widowControl/>
+        <w:wordWrap/>
+        <w:autoSpaceDE/>
+        <w:autoSpaceDN/>
+        <w:jc w:val="left"/>
+        <w:rPr>
+          <w:rFonts w:eastAsiaTheme="minorHAnsi" w:cs="굴림"/>
+          <w:b/>
+          <w:bCs/>
+          <w:color w:val="000000"/>
+          <w:kern w:val="0"/>
+          <w:sz w:val="2"/>
+          <w:szCs w:val="10"/>
+        </w:rPr>
+      </w:pPr>
+    </w:p>
+    <w:p>
+      <w:pPr>
+        <w:widowControl/>
+        <w:wordWrap/>
+        <w:autoSpaceDE/>
+        <w:autoSpaceDN/>
+        <w:jc w:val="left"/>
+        <w:rPr>
+          <w:rFonts w:eastAsiaTheme="minorHAnsi" w:cs="굴림"/>
+          <w:b/>
+          <w:bCs/>
+          <w:color w:val="000000"/>
+          <w:kern w:val="0"/>
+          <w:sz w:val="2"/>
+          <w:szCs w:val="10"/>
+        </w:rPr>
+      </w:pPr>
+    </w:p>
+    <w:p>
+      <w:pPr>
+        <w:widowControl/>
+        <w:wordWrap/>
+        <w:autoSpaceDE/>
+        <w:autoSpaceDN/>
+        <w:jc w:val="left"/>
+        <w:rPr>
+          <w:rFonts w:eastAsiaTheme="minorHAnsi" w:cs="굴림"/>
+          <w:b/>
+          <w:bCs/>
+          <w:color w:val="000000"/>
+          <w:kern w:val="0"/>
+          <w:sz w:val="2"/>
+          <w:szCs w:val="10"/>
+        </w:rPr>
+      </w:pPr>
+    </w:p>
+    <w:p>
+      <w:pPr>
+        <w:widowControl/>
+        <w:wordWrap/>
+        <w:autoSpaceDE/>
+        <w:autoSpaceDN/>
+        <w:jc w:val="left"/>
+        <w:rPr>
+          <w:rFonts w:eastAsiaTheme="minorHAnsi" w:cs="굴림"/>
+          <w:b/>
+          <w:bCs/>
+          <w:color w:val="000000"/>
+          <w:kern w:val="0"/>
+          <w:sz w:val="2"/>
+          <w:szCs w:val="10"/>
+        </w:rPr>
+      </w:pPr>
+    </w:p>
+    <w:p>
+      <w:pPr>
+        <w:widowControl/>
+        <w:wordWrap/>
+        <w:autoSpaceDE/>
+        <w:autoSpaceDN/>
+        <w:jc w:val="left"/>
+        <w:rPr>
+          <w:rFonts w:eastAsiaTheme="minorHAnsi" w:cs="굴림"/>
+          <w:b/>
+          <w:bCs/>
+          <w:color w:val="000000"/>
+          <w:kern w:val="0"/>
+          <w:sz w:val="2"/>
+          <w:szCs w:val="10"/>
+        </w:rPr>
+      </w:pPr>
+    </w:p>
+    <w:p>
+      <w:pPr>
+        <w:widowControl/>
+        <w:wordWrap/>
+        <w:autoSpaceDE/>
+        <w:autoSpaceDN/>
+        <w:jc w:val="left"/>
+        <w:rPr>
+          <w:rFonts w:eastAsiaTheme="minorHAnsi" w:cs="굴림"/>
+          <w:b/>
+          <w:bCs/>
+          <w:color w:val="000000"/>
+          <w:kern w:val="0"/>
+          <w:sz w:val="2"/>
+          <w:szCs w:val="10"/>
+        </w:rPr>
+      </w:pPr>
+    </w:p>
+    <w:p>
+      <w:pPr>
+        <w:widowControl/>
+        <w:wordWrap/>
+        <w:autoSpaceDE/>
+        <w:autoSpaceDN/>
+        <w:jc w:val="left"/>
+        <w:rPr>
+          <w:rFonts w:eastAsiaTheme="minorHAnsi" w:cs="굴림"/>
+          <w:b/>
+          <w:bCs/>
+          <w:color w:val="000000"/>
+          <w:kern w:val="0"/>
+          <w:sz w:val="2"/>
+          <w:szCs w:val="10"/>
+        </w:rPr>
+      </w:pPr>
+    </w:p>
+    <w:p>
+      <w:pPr>
+        <w:widowControl/>
+        <w:wordWrap/>
+        <w:autoSpaceDE/>
+        <w:autoSpaceDN/>
+        <w:jc w:val="left"/>
+        <w:rPr>
+          <w:rFonts w:eastAsiaTheme="minorHAnsi" w:cs="굴림"/>
+          <w:b/>
+          <w:bCs/>
+          <w:color w:val="000000"/>
+          <w:kern w:val="0"/>
+          <w:sz w:val="2"/>
+          <w:szCs w:val="10"/>
+        </w:rPr>
+      </w:pPr>
+    </w:p>
+    <w:p>
+      <w:pPr>
+        <w:widowControl/>
+        <w:wordWrap/>
+        <w:autoSpaceDE/>
+        <w:autoSpaceDN/>
+        <w:jc w:val="left"/>
+        <w:rPr>
+          <w:rFonts w:eastAsiaTheme="minorHAnsi" w:cs="굴림"/>
+          <w:b/>
+          <w:bCs/>
+          <w:color w:val="000000"/>
+          <w:kern w:val="0"/>
+          <w:sz w:val="2"/>
+          <w:szCs w:val="10"/>
+        </w:rPr>
+      </w:pPr>
+    </w:p>
+    <w:p>
+      <w:pPr>
+        <w:widowControl/>
+        <w:wordWrap/>
+        <w:autoSpaceDE/>
+        <w:autoSpaceDN/>
+        <w:jc w:val="left"/>
+        <w:rPr>
+          <w:rFonts w:eastAsiaTheme="minorHAnsi" w:cs="굴림"/>
+          <w:b/>
+          <w:bCs/>
+          <w:color w:val="000000"/>
+          <w:kern w:val="0"/>
+          <w:sz w:val="2"/>
+          <w:szCs w:val="10"/>
+        </w:rPr>
+      </w:pPr>
+    </w:p>
+    <w:p>
+      <w:pPr>
+        <w:widowControl/>
+        <w:wordWrap/>
+        <w:autoSpaceDE/>
+        <w:autoSpaceDN/>
+        <w:jc w:val="left"/>
+        <w:rPr>
+          <w:rFonts w:eastAsiaTheme="minorHAnsi" w:cs="굴림"/>
+          <w:b/>
+          <w:bCs/>
+          <w:color w:val="000000"/>
+          <w:kern w:val="0"/>
+          <w:sz w:val="2"/>
+          <w:szCs w:val="10"/>
+        </w:rPr>
+      </w:pPr>
+    </w:p>
+    <w:p>
+      <w:pPr>
+        <w:widowControl/>
+        <w:wordWrap/>
+        <w:autoSpaceDE/>
+        <w:autoSpaceDN/>
+        <w:jc w:val="left"/>
+        <w:rPr>
+          <w:rFonts w:eastAsiaTheme="minorHAnsi" w:cs="굴림"/>
+          <w:b/>
+          <w:bCs/>
+          <w:color w:val="000000"/>
+          <w:kern w:val="0"/>
+          <w:sz w:val="2"/>
+          <w:szCs w:val="10"/>
+        </w:rPr>
+      </w:pPr>
+    </w:p>
+    <w:p>
+      <w:pPr>
+        <w:widowControl/>
+        <w:wordWrap/>
+        <w:autoSpaceDE/>
+        <w:autoSpaceDN/>
+        <w:jc w:val="left"/>
+        <w:rPr>
+          <w:rFonts w:eastAsiaTheme="minorHAnsi" w:cs="굴림"/>
+          <w:b/>
+          <w:bCs/>
+          <w:color w:val="000000"/>
+          <w:kern w:val="0"/>
+          <w:sz w:val="2"/>
+          <w:szCs w:val="10"/>
+        </w:rPr>
+      </w:pPr>
+    </w:p>
+    <w:p>
+      <w:pPr>
+        <w:widowControl/>
+        <w:wordWrap/>
+        <w:autoSpaceDE/>
+        <w:autoSpaceDN/>
+        <w:jc w:val="left"/>
+        <w:rPr>
+          <w:rFonts w:eastAsiaTheme="minorHAnsi" w:cs="굴림"/>
+          <w:b/>
+          <w:bCs/>
+          <w:color w:val="000000"/>
+          <w:kern w:val="0"/>
+          <w:sz w:val="2"/>
+          <w:szCs w:val="10"/>
+        </w:rPr>
+      </w:pPr>
+    </w:p>
+    <w:p>
+      <w:pPr>
+        <w:widowControl/>
+        <w:wordWrap/>
+        <w:autoSpaceDE/>
+        <w:autoSpaceDN/>
+        <w:jc w:val="left"/>
+        <w:rPr>
+          <w:rFonts w:eastAsiaTheme="minorHAnsi" w:cs="굴림"/>
+          <w:b/>
+          <w:bCs/>
+          <w:color w:val="000000"/>
+          <w:kern w:val="0"/>
+          <w:sz w:val="2"/>
+          <w:szCs w:val="10"/>
+        </w:rPr>
+      </w:pPr>
+    </w:p>
+    <w:p>
+      <w:pPr>
+        <w:widowControl/>
+        <w:wordWrap/>
+        <w:autoSpaceDE/>
+        <w:autoSpaceDN/>
+        <w:jc w:val="left"/>
+        <w:rPr>
+          <w:rFonts w:eastAsiaTheme="minorHAnsi" w:cs="굴림"/>
+          <w:b/>
+          <w:bCs/>
+          <w:color w:val="000000"/>
+          <w:kern w:val="0"/>
+          <w:sz w:val="2"/>
+          <w:szCs w:val="10"/>
+        </w:rPr>
+      </w:pPr>
+    </w:p>
+    <w:p>
+      <w:pPr>
+        <w:widowControl/>
+        <w:wordWrap/>
+        <w:autoSpaceDE/>
+        <w:autoSpaceDN/>
+        <w:jc w:val="left"/>
+        <w:rPr>
+          <w:rFonts w:eastAsiaTheme="minorHAnsi" w:cs="굴림"/>
+          <w:b/>
+          <w:bCs/>
+          <w:color w:val="000000"/>
+          <w:kern w:val="0"/>
+          <w:sz w:val="2"/>
+          <w:szCs w:val="10"/>
+        </w:rPr>
+      </w:pPr>
+    </w:p>
+    <w:p>
+      <w:pPr>
+        <w:widowControl/>
+        <w:wordWrap/>
+        <w:autoSpaceDE/>
+        <w:autoSpaceDN/>
+        <w:jc w:val="left"/>
+        <w:rPr>
+          <w:rFonts w:eastAsiaTheme="minorHAnsi" w:cs="굴림"/>
+          <w:b/>
+          <w:bCs/>
+          <w:color w:val="000000"/>
+          <w:kern w:val="0"/>
+          <w:sz w:val="2"/>
+          <w:szCs w:val="10"/>
+        </w:rPr>
+      </w:pPr>
+    </w:p>
+    <w:p>
+      <w:pPr>
+        <w:widowControl/>
+        <w:wordWrap/>
+        <w:autoSpaceDE/>
+        <w:autoSpaceDN/>
+        <w:jc w:val="left"/>
+        <w:rPr>
+          <w:rFonts w:eastAsiaTheme="minorHAnsi" w:cs="굴림"/>
+          <w:b/>
+          <w:bCs/>
+          <w:color w:val="000000"/>
+          <w:kern w:val="0"/>
+          <w:sz w:val="2"/>
+          <w:szCs w:val="10"/>
+        </w:rPr>
+      </w:pPr>
+    </w:p>
+    <w:p>
+      <w:pPr>
+        <w:widowControl/>
+        <w:wordWrap/>
+        <w:autoSpaceDE/>
+        <w:autoSpaceDN/>
+        <w:jc w:val="left"/>
+        <w:rPr>
+          <w:rFonts w:eastAsiaTheme="minorHAnsi" w:cs="굴림"/>
+          <w:b/>
+          <w:bCs/>
+          <w:color w:val="000000"/>
+          <w:kern w:val="0"/>
+          <w:sz w:val="2"/>
+          <w:szCs w:val="10"/>
+        </w:rPr>
+      </w:pPr>
+    </w:p>
+    <w:p>
+      <w:pPr>
+        <w:widowControl/>
+        <w:wordWrap/>
+        <w:autoSpaceDE/>
+        <w:autoSpaceDN/>
+        <w:jc w:val="left"/>
+        <w:rPr>
+          <w:rFonts w:eastAsiaTheme="minorHAnsi" w:cs="굴림"/>
+          <w:b/>
+          <w:bCs/>
+          <w:color w:val="000000"/>
+          <w:kern w:val="0"/>
+          <w:sz w:val="2"/>
+          <w:szCs w:val="10"/>
+        </w:rPr>
+      </w:pPr>
+    </w:p>
+    <w:p>
+      <w:pPr>
+        <w:widowControl/>
+        <w:wordWrap/>
+        <w:autoSpaceDE/>
+        <w:autoSpaceDN/>
+        <w:jc w:val="left"/>
+        <w:rPr>
+          <w:rFonts w:eastAsiaTheme="minorHAnsi" w:cs="굴림"/>
+          <w:b/>
+          <w:bCs/>
+          <w:color w:val="000000"/>
+          <w:kern w:val="0"/>
+          <w:sz w:val="2"/>
+          <w:szCs w:val="10"/>
+        </w:rPr>
+      </w:pPr>
+    </w:p>
+    <w:p>
+      <w:pPr>
+        <w:widowControl/>
+        <w:wordWrap/>
+        <w:autoSpaceDE/>
+        <w:autoSpaceDN/>
+        <w:jc w:val="left"/>
+        <w:rPr>
+          <w:rFonts w:eastAsiaTheme="minorHAnsi" w:cs="굴림"/>
+          <w:b/>
+          <w:bCs/>
+          <w:color w:val="000000"/>
+          <w:kern w:val="0"/>
+          <w:sz w:val="2"/>
+          <w:szCs w:val="10"/>
+        </w:rPr>
+      </w:pPr>
+    </w:p>
+    <w:p>
+      <w:pPr>
+        <w:widowControl/>
+        <w:wordWrap/>
+        <w:autoSpaceDE/>
+        <w:autoSpaceDN/>
+        <w:jc w:val="left"/>
+        <w:rPr>
+          <w:rFonts w:eastAsiaTheme="minorHAnsi" w:cs="굴림"/>
+          <w:b/>
+          <w:bCs/>
+          <w:color w:val="000000"/>
+          <w:kern w:val="0"/>
+          <w:sz w:val="2"/>
+          <w:szCs w:val="10"/>
+        </w:rPr>
+      </w:pPr>
+    </w:p>
+    <w:p>
+      <w:pPr>
+        <w:widowControl/>
+        <w:wordWrap/>
+        <w:autoSpaceDE/>
+        <w:autoSpaceDN/>
+        <w:jc w:val="left"/>
+        <w:rPr>
+          <w:rFonts w:eastAsiaTheme="minorHAnsi" w:cs="굴림"/>
+          <w:b/>
+          <w:bCs/>
+          <w:color w:val="000000"/>
+          <w:kern w:val="0"/>
+          <w:sz w:val="2"/>
+          <w:szCs w:val="10"/>
+        </w:rPr>
+      </w:pPr>
+    </w:p>
+    <w:p>
+      <w:pPr>
+        <w:widowControl/>
+        <w:wordWrap/>
+        <w:autoSpaceDE/>
+        <w:autoSpaceDN/>
+        <w:jc w:val="left"/>
+        <w:rPr>
+          <w:rFonts w:eastAsiaTheme="minorHAnsi" w:cs="굴림"/>
+          <w:b/>
+          <w:bCs/>
+          <w:color w:val="000000"/>
+          <w:kern w:val="0"/>
+          <w:sz w:val="2"/>
+          <w:szCs w:val="10"/>
+        </w:rPr>
+      </w:pPr>
+    </w:p>
+    <w:p>
+      <w:pPr>
+        <w:widowControl/>
+        <w:wordWrap/>
+        <w:autoSpaceDE/>
+        <w:autoSpaceDN/>
+        <w:jc w:val="left"/>
+        <w:rPr>
+          <w:rFonts w:eastAsiaTheme="minorHAnsi" w:cs="굴림"/>
+          <w:b/>
+          <w:bCs/>
+          <w:color w:val="000000"/>
+          <w:kern w:val="0"/>
+          <w:sz w:val="2"/>
+          <w:szCs w:val="10"/>
+        </w:rPr>
+      </w:pPr>
+    </w:p>
+    <w:p>
+      <w:pPr>
+        <w:widowControl/>
+        <w:wordWrap/>
+        <w:autoSpaceDE/>
+        <w:autoSpaceDN/>
+        <w:jc w:val="left"/>
+        <w:rPr>
+          <w:rFonts w:eastAsiaTheme="minorHAnsi" w:cs="굴림"/>
+          <w:b/>
+          <w:bCs/>
+          <w:color w:val="000000"/>
+          <w:kern w:val="0"/>
+          <w:sz w:val="2"/>
+          <w:szCs w:val="10"/>
+        </w:rPr>
+      </w:pPr>
+    </w:p>
+    <w:p>
+      <w:pPr>
+        <w:widowControl/>
+        <w:wordWrap/>
+        <w:autoSpaceDE/>
+        <w:autoSpaceDN/>
+        <w:jc w:val="left"/>
+        <w:rPr>
+          <w:rFonts w:eastAsiaTheme="minorHAnsi" w:cs="굴림"/>
+          <w:b/>
+          <w:bCs/>
+          <w:color w:val="000000"/>
+          <w:kern w:val="0"/>
+          <w:sz w:val="2"/>
+          <w:szCs w:val="10"/>
+        </w:rPr>
+      </w:pPr>
+    </w:p>
+    <w:p>
+      <w:pPr>
+        <w:widowControl/>
+        <w:wordWrap/>
+        <w:autoSpaceDE/>
+        <w:autoSpaceDN/>
+        <w:jc w:val="left"/>
+        <w:rPr>
+          <w:rFonts w:eastAsiaTheme="minorHAnsi" w:cs="굴림"/>
+          <w:b/>
+          <w:bCs/>
+          <w:color w:val="000000"/>
+          <w:kern w:val="0"/>
+          <w:sz w:val="2"/>
+          <w:szCs w:val="10"/>
+        </w:rPr>
+      </w:pPr>
+    </w:p>
+    <w:p>
+      <w:pPr>
+        <w:widowControl/>
+        <w:wordWrap/>
+        <w:autoSpaceDE/>
+        <w:autoSpaceDN/>
+        <w:jc w:val="left"/>
+        <w:rPr>
+          <w:rFonts w:eastAsiaTheme="minorHAnsi" w:cs="굴림"/>
+          <w:b/>
+          <w:bCs/>
+          <w:color w:val="000000"/>
+          <w:kern w:val="0"/>
+          <w:sz w:val="2"/>
+          <w:szCs w:val="10"/>
+        </w:rPr>
+      </w:pPr>
+    </w:p>
+    <w:p>
+      <w:pPr>
+        <w:widowControl/>
+        <w:wordWrap/>
+        <w:autoSpaceDE/>
+        <w:autoSpaceDN/>
+        <w:jc w:val="left"/>
+        <w:rPr>
+          <w:rFonts w:eastAsiaTheme="minorHAnsi" w:cs="굴림"/>
+          <w:b/>
+          <w:bCs/>
+          <w:color w:val="000000"/>
+          <w:kern w:val="0"/>
+          <w:sz w:val="2"/>
+          <w:szCs w:val="10"/>
+        </w:rPr>
+      </w:pPr>
+    </w:p>
+    <w:p>
+      <w:pPr>
+        <w:widowControl/>
+        <w:wordWrap/>
+        <w:autoSpaceDE/>
+        <w:autoSpaceDN/>
+        <w:jc w:val="left"/>
+        <w:rPr>
+          <w:rFonts w:eastAsiaTheme="minorHAnsi" w:cs="굴림"/>
+          <w:b/>
+          <w:bCs/>
+          <w:color w:val="000000"/>
+          <w:kern w:val="0"/>
+          <w:sz w:val="2"/>
+          <w:szCs w:val="10"/>
+        </w:rPr>
+      </w:pPr>
+    </w:p>
+    <w:p>
+      <w:pPr>
+        <w:widowControl/>
+        <w:wordWrap/>
+        <w:autoSpaceDE/>
+        <w:autoSpaceDN/>
+        <w:jc w:val="left"/>
+        <w:rPr>
+          <w:rFonts w:eastAsiaTheme="minorHAnsi" w:cs="굴림"/>
+          <w:b/>
+          <w:bCs/>
+          <w:color w:val="000000"/>
+          <w:kern w:val="0"/>
+          <w:sz w:val="2"/>
+          <w:szCs w:val="10"/>
+        </w:rPr>
+      </w:pPr>
+    </w:p>
+    <w:p>
+      <w:pPr>
+        <w:widowControl/>
+        <w:wordWrap/>
+        <w:autoSpaceDE/>
+        <w:autoSpaceDN/>
+        <w:jc w:val="left"/>
+        <w:rPr>
+          <w:rFonts w:eastAsiaTheme="minorHAnsi" w:cs="굴림"/>
+          <w:b/>
+          <w:bCs/>
+          <w:color w:val="000000"/>
+          <w:kern w:val="0"/>
+          <w:sz w:val="2"/>
+          <w:szCs w:val="10"/>
+        </w:rPr>
+      </w:pPr>
+    </w:p>
+    <w:p>
+      <w:pPr>
+        <w:widowControl/>
+        <w:wordWrap/>
+        <w:autoSpaceDE/>
+        <w:autoSpaceDN/>
+        <w:jc w:val="left"/>
+        <w:rPr>
+          <w:rFonts w:eastAsiaTheme="minorHAnsi" w:cs="굴림"/>
+          <w:b/>
+          <w:bCs/>
+          <w:color w:val="000000"/>
+          <w:kern w:val="0"/>
+          <w:sz w:val="2"/>
+          <w:szCs w:val="10"/>
+        </w:rPr>
+      </w:pPr>
+    </w:p>
+    <w:p>
+      <w:pPr>
+        <w:widowControl/>
+        <w:wordWrap/>
+        <w:autoSpaceDE/>
+        <w:autoSpaceDN/>
+        <w:jc w:val="left"/>
+        <w:rPr>
+          <w:rFonts w:eastAsiaTheme="minorHAnsi" w:cs="굴림"/>
+          <w:b/>
+          <w:bCs/>
+          <w:color w:val="000000"/>
+          <w:kern w:val="0"/>
+          <w:sz w:val="2"/>
+          <w:szCs w:val="10"/>
+        </w:rPr>
+      </w:pPr>
+    </w:p>
+    <w:p>
+      <w:pPr>
+        <w:widowControl/>
+        <w:wordWrap/>
+        <w:autoSpaceDE/>
+        <w:autoSpaceDN/>
+        <w:jc w:val="left"/>
+        <w:rPr>
+          <w:rFonts w:eastAsiaTheme="minorHAnsi" w:cs="굴림"/>
+          <w:b/>
+          <w:bCs/>
+          <w:color w:val="000000"/>
+          <w:kern w:val="0"/>
+          <w:sz w:val="2"/>
+          <w:szCs w:val="10"/>
+        </w:rPr>
+      </w:pPr>
+    </w:p>
+    <w:p>
+      <w:pPr>
+        <w:widowControl/>
+        <w:wordWrap/>
+        <w:autoSpaceDE/>
+        <w:autoSpaceDN/>
+        <w:jc w:val="left"/>
+        <w:rPr>
+          <w:rFonts w:eastAsiaTheme="minorHAnsi" w:cs="굴림"/>
+          <w:b/>
+          <w:bCs/>
+          <w:color w:val="000000"/>
+          <w:kern w:val="0"/>
+          <w:sz w:val="2"/>
+          <w:szCs w:val="10"/>
+        </w:rPr>
+      </w:pPr>
+    </w:p>
+    <w:p>
+      <w:pPr>
+        <w:widowControl/>
+        <w:wordWrap/>
+        <w:autoSpaceDE/>
+        <w:autoSpaceDN/>
+        <w:jc w:val="left"/>
+        <w:rPr>
+          <w:rFonts w:eastAsiaTheme="minorHAnsi" w:cs="굴림"/>
+          <w:b/>
+          <w:bCs/>
+          <w:color w:val="000000"/>
+          <w:kern w:val="0"/>
+          <w:sz w:val="2"/>
+          <w:szCs w:val="10"/>
+        </w:rPr>
+      </w:pPr>
+    </w:p>
+    <w:p>
+      <w:pPr>
+        <w:widowControl/>
+        <w:wordWrap/>
+        <w:autoSpaceDE/>
+        <w:autoSpaceDN/>
+        <w:jc w:val="left"/>
+        <w:rPr>
+          <w:rFonts w:eastAsiaTheme="minorHAnsi" w:cs="굴림"/>
+          <w:b/>
+          <w:bCs/>
+          <w:color w:val="000000"/>
+          <w:kern w:val="0"/>
+          <w:sz w:val="2"/>
+          <w:szCs w:val="10"/>
+        </w:rPr>
+      </w:pPr>
+    </w:p>
+    <w:p>
+      <w:pPr>
+        <w:widowControl/>
+        <w:wordWrap/>
+        <w:autoSpaceDE/>
+        <w:autoSpaceDN/>
+        <w:jc w:val="left"/>
+        <w:rPr>
+          <w:rFonts w:eastAsiaTheme="minorHAnsi" w:cs="굴림"/>
+          <w:b/>
+          <w:bCs/>
+          <w:color w:val="000000"/>
+          <w:kern w:val="0"/>
+          <w:sz w:val="2"/>
+          <w:szCs w:val="10"/>
+        </w:rPr>
+      </w:pPr>
+    </w:p>
+    <w:p>
+      <w:pPr>
+        <w:widowControl/>
+        <w:wordWrap/>
+        <w:autoSpaceDE/>
+        <w:autoSpaceDN/>
+        <w:jc w:val="left"/>
+        <w:rPr>
+          <w:rFonts w:eastAsiaTheme="minorHAnsi" w:cs="굴림"/>
+          <w:b/>
+          <w:bCs/>
+          <w:color w:val="000000"/>
+          <w:kern w:val="0"/>
+          <w:sz w:val="2"/>
+          <w:szCs w:val="10"/>
+        </w:rPr>
+      </w:pPr>
+    </w:p>
+    <w:p>
+      <w:pPr>
+        <w:widowControl/>
+        <w:wordWrap/>
+        <w:autoSpaceDE/>
+        <w:autoSpaceDN/>
+        <w:jc w:val="left"/>
+        <w:rPr>
+          <w:rFonts w:eastAsiaTheme="minorHAnsi" w:cs="굴림"/>
+          <w:b/>
+          <w:bCs/>
+          <w:color w:val="000000"/>
+          <w:kern w:val="0"/>
+          <w:sz w:val="2"/>
+          <w:szCs w:val="10"/>
+        </w:rPr>
+      </w:pPr>
+    </w:p>
+    <w:p>
+      <w:pPr>
+        <w:widowControl/>
+        <w:wordWrap/>
+        <w:autoSpaceDE/>
+        <w:autoSpaceDN/>
+        <w:jc w:val="left"/>
+        <w:rPr>
+          <w:rFonts w:eastAsiaTheme="minorHAnsi" w:cs="굴림"/>
+          <w:b/>
+          <w:bCs/>
+          <w:color w:val="000000"/>
+          <w:kern w:val="0"/>
+          <w:sz w:val="2"/>
+          <w:szCs w:val="10"/>
+        </w:rPr>
+      </w:pPr>
+    </w:p>
+    <w:p>
+      <w:pPr>
+        <w:widowControl/>
+        <w:wordWrap/>
+        <w:autoSpaceDE/>
+        <w:autoSpaceDN/>
+        <w:jc w:val="left"/>
+        <w:rPr>
+          <w:rFonts w:eastAsiaTheme="minorHAnsi" w:cs="굴림"/>
+          <w:b/>
+          <w:bCs/>
+          <w:color w:val="000000"/>
+          <w:kern w:val="0"/>
+          <w:sz w:val="2"/>
+          <w:szCs w:val="10"/>
+        </w:rPr>
+      </w:pPr>
+    </w:p>
+    <w:p>
+      <w:pPr>
+        <w:widowControl/>
+        <w:wordWrap/>
+        <w:autoSpaceDE/>
+        <w:autoSpaceDN/>
+        <w:jc w:val="left"/>
+        <w:rPr>
+          <w:rFonts w:eastAsiaTheme="minorHAnsi" w:cs="굴림"/>
+          <w:b/>
+          <w:bCs/>
+          <w:color w:val="000000"/>
+          <w:kern w:val="0"/>
+          <w:sz w:val="2"/>
+          <w:szCs w:val="10"/>
+        </w:rPr>
+      </w:pPr>
+    </w:p>
+    <w:p>
+      <w:pPr>
+        <w:widowControl/>
+        <w:wordWrap/>
+        <w:autoSpaceDE/>
+        <w:autoSpaceDN/>
+        <w:jc w:val="left"/>
+        <w:rPr>
+          <w:rFonts w:eastAsiaTheme="minorHAnsi" w:cs="굴림"/>
+          <w:b/>
+          <w:bCs/>
+          <w:color w:val="000000"/>
+          <w:kern w:val="0"/>
+          <w:sz w:val="2"/>
+          <w:szCs w:val="10"/>
+        </w:rPr>
+      </w:pPr>
+    </w:p>
+    <w:p>
+      <w:pPr>
+        <w:widowControl/>
+        <w:wordWrap/>
+        <w:autoSpaceDE/>
+        <w:autoSpaceDN/>
+        <w:jc w:val="left"/>
+        <w:rPr>
+          <w:rFonts w:eastAsiaTheme="minorHAnsi" w:cs="굴림"/>
+          <w:b/>
+          <w:bCs/>
+          <w:color w:val="000000"/>
+          <w:kern w:val="0"/>
+          <w:sz w:val="2"/>
+          <w:szCs w:val="10"/>
+        </w:rPr>
+      </w:pPr>
+    </w:p>
+    <w:p>
+      <w:pPr>
+        <w:widowControl/>
+        <w:wordWrap/>
+        <w:autoSpaceDE/>
+        <w:autoSpaceDN/>
+        <w:jc w:val="left"/>
+        <w:rPr>
+          <w:rFonts w:eastAsiaTheme="minorHAnsi" w:cs="굴림"/>
+          <w:b/>
+          <w:bCs/>
+          <w:color w:val="000000"/>
+          <w:kern w:val="0"/>
+          <w:sz w:val="2"/>
+          <w:szCs w:val="10"/>
+        </w:rPr>
+      </w:pPr>
+    </w:p>
+    <w:p>
+      <w:pPr>
+        <w:widowControl/>
+        <w:wordWrap/>
+        <w:autoSpaceDE/>
+        <w:autoSpaceDN/>
+        <w:jc w:val="left"/>
+        <w:rPr>
+          <w:rFonts w:eastAsiaTheme="minorHAnsi" w:cs="굴림"/>
+          <w:b/>
+          <w:bCs/>
+          <w:color w:val="000000"/>
+          <w:kern w:val="0"/>
+          <w:sz w:val="2"/>
+          <w:szCs w:val="10"/>
+        </w:rPr>
+      </w:pPr>
+    </w:p>
+    <w:p>
+      <w:pPr>
+        <w:widowControl/>
+        <w:wordWrap/>
+        <w:autoSpaceDE/>
+        <w:autoSpaceDN/>
+        <w:jc w:val="left"/>
+        <w:rPr>
+          <w:rFonts w:eastAsiaTheme="minorHAnsi" w:cs="굴림"/>
+          <w:b/>
+          <w:bCs/>
+          <w:color w:val="000000"/>
+          <w:kern w:val="0"/>
+          <w:sz w:val="2"/>
+          <w:szCs w:val="10"/>
+        </w:rPr>
+      </w:pPr>
+    </w:p>
+    <w:p>
+      <w:pPr>
+        <w:widowControl/>
+        <w:wordWrap/>
+        <w:autoSpaceDE/>
+        <w:autoSpaceDN/>
+        <w:jc w:val="left"/>
+        <w:rPr>
+          <w:rFonts w:eastAsiaTheme="minorHAnsi" w:cs="굴림"/>
+          <w:b/>
+          <w:bCs/>
+          <w:color w:val="000000"/>
+          <w:kern w:val="0"/>
+          <w:sz w:val="2"/>
+          <w:szCs w:val="10"/>
+        </w:rPr>
+      </w:pPr>
+    </w:p>
+    <w:p>
+      <w:pPr>
+        <w:widowControl/>
+        <w:wordWrap/>
+        <w:autoSpaceDE/>
+        <w:autoSpaceDN/>
+        <w:jc w:val="left"/>
+        <w:rPr>
+          <w:rFonts w:eastAsiaTheme="minorHAnsi" w:cs="굴림"/>
+          <w:b/>
+          <w:bCs/>
+          <w:color w:val="000000"/>
+          <w:kern w:val="0"/>
+          <w:sz w:val="2"/>
+          <w:szCs w:val="10"/>
+        </w:rPr>
+      </w:pPr>
+    </w:p>
+    <w:p>
+      <w:pPr>
+        <w:widowControl/>
+        <w:wordWrap/>
+        <w:autoSpaceDE/>
+        <w:autoSpaceDN/>
+        <w:jc w:val="left"/>
+        <w:rPr>
+          <w:rFonts w:eastAsiaTheme="minorHAnsi" w:cs="굴림"/>
+          <w:b/>
+          <w:bCs/>
+          <w:color w:val="000000"/>
+          <w:kern w:val="0"/>
+          <w:sz w:val="2"/>
+          <w:szCs w:val="10"/>
+        </w:rPr>
+      </w:pPr>
+    </w:p>
+    <w:p>
+      <w:pPr>
+        <w:widowControl/>
+        <w:wordWrap/>
+        <w:autoSpaceDE/>
+        <w:autoSpaceDN/>
+        <w:jc w:val="left"/>
+        <w:rPr>
+          <w:rFonts w:eastAsiaTheme="minorHAnsi" w:cs="굴림"/>
+          <w:b/>
+          <w:bCs/>
+          <w:color w:val="000000"/>
+          <w:kern w:val="0"/>
+          <w:sz w:val="2"/>
+          <w:szCs w:val="10"/>
+        </w:rPr>
+      </w:pPr>
+    </w:p>
+    <w:p>
+      <w:pPr>
+        <w:widowControl/>
+        <w:wordWrap/>
+        <w:autoSpaceDE/>
+        <w:autoSpaceDN/>
+        <w:jc w:val="left"/>
+        <w:rPr>
+          <w:rFonts w:eastAsiaTheme="minorHAnsi" w:cs="굴림"/>
+          <w:b/>
+          <w:bCs/>
+          <w:color w:val="000000"/>
+          <w:kern w:val="0"/>
+          <w:sz w:val="2"/>
+          <w:szCs w:val="10"/>
+        </w:rPr>
+      </w:pPr>
+    </w:p>
+    <w:p>
+      <w:pPr>
+        <w:widowControl/>
+        <w:wordWrap/>
+        <w:autoSpaceDE/>
+        <w:autoSpaceDN/>
+        <w:jc w:val="left"/>
+        <w:rPr>
+          <w:rFonts w:eastAsiaTheme="minorHAnsi" w:cs="굴림"/>
+          <w:b/>
+          <w:bCs/>
+          <w:color w:val="000000"/>
+          <w:kern w:val="0"/>
+          <w:sz w:val="2"/>
+          <w:szCs w:val="10"/>
+        </w:rPr>
+      </w:pPr>
+    </w:p>
+    <w:p>
+      <w:pPr>
+        <w:widowControl/>
+        <w:wordWrap/>
+        <w:autoSpaceDE/>
+        <w:autoSpaceDN/>
+        <w:jc w:val="left"/>
+        <w:rPr>
+          <w:rFonts w:eastAsiaTheme="minorHAnsi" w:cs="굴림"/>
+          <w:b/>
+          <w:bCs/>
+          <w:color w:val="000000"/>
+          <w:kern w:val="0"/>
+          <w:sz w:val="2"/>
+          <w:szCs w:val="10"/>
+        </w:rPr>
+      </w:pPr>
+    </w:p>
+    <w:p>
+      <w:pPr>
+        <w:widowControl/>
+        <w:wordWrap/>
+        <w:autoSpaceDE/>
+        <w:autoSpaceDN/>
+        <w:jc w:val="left"/>
+        <w:rPr>
           <w:rFonts w:eastAsiaTheme="minorHAnsi" w:cs="굴림" w:hint="eastAsia"/>
+          <w:b/>
+          <w:bCs/>
+          <w:color w:val="000000"/>
+          <w:kern w:val="0"/>
+          <w:sz w:val="2"/>
+          <w:szCs w:val="10"/>
+        </w:rPr>
+      </w:pPr>
+    </w:p>
+    <w:p>
+      <w:pPr>
+        <w:widowControl/>
+        <w:wordWrap/>
+        <w:autoSpaceDE/>
+        <w:autoSpaceDN/>
+        <w:jc w:val="left"/>
+        <w:rPr>
+          <w:rFonts w:eastAsiaTheme="minorHAnsi" w:cs="굴림"/>
+          <w:b/>
+          <w:bCs/>
+          <w:color w:val="000000"/>
+          <w:kern w:val="0"/>
+          <w:sz w:val="2"/>
+          <w:szCs w:val="10"/>
+        </w:rPr>
+      </w:pPr>
+    </w:p>
+    <w:p>
+      <w:pPr>
+        <w:widowControl/>
+        <w:wordWrap/>
+        <w:autoSpaceDE/>
+        <w:autoSpaceDN/>
+        <w:jc w:val="left"/>
+        <w:rPr>
+          <w:rFonts w:eastAsiaTheme="minorHAnsi" w:cs="굴림"/>
+          <w:b/>
+          <w:bCs/>
+          <w:color w:val="000000"/>
+          <w:kern w:val="0"/>
+          <w:sz w:val="2"/>
+          <w:szCs w:val="10"/>
+        </w:rPr>
+      </w:pPr>
+    </w:p>
+    <w:p>
+      <w:pPr>
+        <w:widowControl/>
+        <w:wordWrap/>
+        <w:autoSpaceDE/>
+        <w:autoSpaceDN/>
+        <w:jc w:val="left"/>
+        <w:rPr>
+          <w:rFonts w:eastAsiaTheme="minorHAnsi" w:cs="굴림"/>
+          <w:b/>
+          <w:bCs/>
+          <w:color w:val="000000"/>
+          <w:kern w:val="0"/>
+          <w:sz w:val="2"/>
+          <w:szCs w:val="10"/>
+        </w:rPr>
+      </w:pPr>
+    </w:p>
+    <w:p>
+      <w:pPr>
+        <w:widowControl/>
+        <w:wordWrap/>
+        <w:autoSpaceDE/>
+        <w:autoSpaceDN/>
+        <w:jc w:val="left"/>
+        <w:rPr>
+          <w:rFonts w:eastAsiaTheme="minorHAnsi" w:cs="굴림"/>
+          <w:b/>
+          <w:bCs/>
+          <w:color w:val="000000"/>
+          <w:kern w:val="0"/>
+          <w:sz w:val="2"/>
+          <w:szCs w:val="10"/>
+        </w:rPr>
+      </w:pPr>
+    </w:p>
+    <w:p>
+      <w:pPr>
+        <w:widowControl/>
+        <w:wordWrap/>
+        <w:autoSpaceDE/>
+        <w:autoSpaceDN/>
+        <w:jc w:val="left"/>
+        <w:rPr>
+          <w:rFonts w:eastAsiaTheme="minorHAnsi" w:cs="굴림"/>
+          <w:b/>
+          <w:bCs/>
+          <w:color w:val="000000"/>
+          <w:kern w:val="0"/>
+          <w:sz w:val="2"/>
+          <w:szCs w:val="10"/>
+        </w:rPr>
+      </w:pPr>
+    </w:p>
+    <w:p>
+      <w:pPr>
+        <w:widowControl/>
+        <w:wordWrap/>
+        <w:autoSpaceDE/>
+        <w:autoSpaceDN/>
+        <w:jc w:val="left"/>
+        <w:rPr>
+          <w:rFonts w:eastAsiaTheme="minorHAnsi" w:cs="굴림"/>
+          <w:b/>
+          <w:bCs/>
+          <w:color w:val="000000"/>
+          <w:kern w:val="0"/>
+          <w:sz w:val="2"/>
+          <w:szCs w:val="10"/>
+        </w:rPr>
+      </w:pPr>
+    </w:p>
+    <w:p>
+      <w:pPr>
+        <w:widowControl/>
+        <w:wordWrap/>
+        <w:autoSpaceDE/>
+        <w:autoSpaceDN/>
+        <w:jc w:val="left"/>
+        <w:rPr>
+          <w:rFonts w:eastAsiaTheme="minorHAnsi" w:cs="굴림"/>
+          <w:b/>
+          <w:bCs/>
+          <w:color w:val="000000"/>
+          <w:kern w:val="0"/>
+          <w:sz w:val="2"/>
+          <w:szCs w:val="10"/>
+        </w:rPr>
+      </w:pPr>
+    </w:p>
+    <w:p>
+      <w:pPr>
+        <w:widowControl/>
+        <w:wordWrap/>
+        <w:autoSpaceDE/>
+        <w:autoSpaceDN/>
+        <w:jc w:val="left"/>
+        <w:rPr>
+          <w:rFonts w:eastAsiaTheme="minorHAnsi" w:cs="굴림"/>
+          <w:b/>
+          <w:bCs/>
+          <w:color w:val="000000"/>
+          <w:kern w:val="0"/>
+          <w:sz w:val="2"/>
+          <w:szCs w:val="10"/>
+        </w:rPr>
+      </w:pPr>
+    </w:p>
+    <w:p>
+      <w:pPr>
+        <w:widowControl/>
+        <w:wordWrap/>
+        <w:autoSpaceDE/>
+        <w:autoSpaceDN/>
+        <w:jc w:val="left"/>
+        <w:rPr>
+          <w:rFonts w:eastAsiaTheme="minorHAnsi" w:cs="굴림"/>
+          <w:b/>
+          <w:bCs/>
+          <w:color w:val="000000"/>
+          <w:kern w:val="0"/>
+          <w:sz w:val="2"/>
+          <w:szCs w:val="10"/>
+        </w:rPr>
+      </w:pPr>
+    </w:p>
+    <w:p>
+      <w:pPr>
+        <w:widowControl/>
+        <w:wordWrap/>
+        <w:autoSpaceDE/>
+        <w:autoSpaceDN/>
+        <w:jc w:val="left"/>
+        <w:rPr>
+          <w:rFonts w:eastAsiaTheme="minorHAnsi" w:cs="굴림"/>
+          <w:b/>
+          <w:bCs/>
+          <w:color w:val="000000"/>
+          <w:kern w:val="0"/>
+          <w:sz w:val="2"/>
+          <w:szCs w:val="10"/>
+        </w:rPr>
+      </w:pPr>
+    </w:p>
+    <w:p>
+      <w:pPr>
+        <w:widowControl/>
+        <w:wordWrap/>
+        <w:autoSpaceDE/>
+        <w:autoSpaceDN/>
+        <w:jc w:val="left"/>
+        <w:rPr>
+          <w:rFonts w:eastAsiaTheme="minorHAnsi" w:cs="굴림"/>
+          <w:b/>
+          <w:bCs/>
+          <w:color w:val="000000"/>
+          <w:kern w:val="0"/>
+          <w:sz w:val="2"/>
+          <w:szCs w:val="10"/>
+        </w:rPr>
+      </w:pPr>
+    </w:p>
+    <w:p>
+      <w:pPr>
+        <w:widowControl/>
+        <w:wordWrap/>
+        <w:autoSpaceDE/>
+        <w:autoSpaceDN/>
+        <w:jc w:val="left"/>
+        <w:rPr>
+          <w:rFonts w:eastAsiaTheme="minorHAnsi" w:cs="굴림"/>
+          <w:b/>
+          <w:bCs/>
+          <w:color w:val="000000"/>
+          <w:kern w:val="0"/>
+          <w:sz w:val="2"/>
+          <w:szCs w:val="10"/>
+        </w:rPr>
+      </w:pPr>
+    </w:p>
+    <w:p>
+      <w:pPr>
+        <w:widowControl/>
+        <w:wordWrap/>
+        <w:autoSpaceDE/>
+        <w:autoSpaceDN/>
+        <w:jc w:val="left"/>
+        <w:rPr>
+          <w:rFonts w:eastAsiaTheme="minorHAnsi" w:cs="굴림"/>
+          <w:b/>
+          <w:bCs/>
+          <w:color w:val="000000"/>
+          <w:kern w:val="0"/>
+          <w:sz w:val="2"/>
+          <w:szCs w:val="10"/>
+        </w:rPr>
+      </w:pPr>
+    </w:p>
+    <w:p>
+      <w:pPr>
+        <w:widowControl/>
+        <w:wordWrap/>
+        <w:autoSpaceDE/>
+        <w:autoSpaceDN/>
+        <w:jc w:val="left"/>
+        <w:rPr>
+          <w:rFonts w:eastAsiaTheme="minorHAnsi" w:cs="굴림"/>
           <w:b/>
           <w:bCs/>
           <w:color w:val="000000"/>
@@ -7216,7 +9173,8 @@
                 <w:sz w:val="36"/>
                 <w:szCs w:val="36"/>
               </w:rPr>
-              <w:t>중간 팀프로젝트 수행사항</w:t>
+              <w:lastRenderedPageBreak/>
+              <w:t>프로젝트 수행사항</w:t>
             </w:r>
           </w:p>
         </w:tc>
@@ -7631,7 +9589,6 @@
                 <w:sz w:val="24"/>
                 <w:szCs w:val="18"/>
               </w:rPr>
-              <w:lastRenderedPageBreak/>
               <w:t>역할</w:t>
             </w:r>
           </w:p>

</xml_diff>